<commit_message>
Batch 5 (week 9):Added GPS location screen with coordinates,accuracy and altitude dislay using geolocator package
</commit_message>
<xml_diff>
--- a/Logbook.docx
+++ b/Logbook.docx
@@ -1366,8 +1366,6 @@
           <w:color w:val="31859C" w:themeColor="accent5" w:themeShade="BF"/>
         </w:rPr>
       </w:pPr>
-      <w:bookmarkStart w:id="0" w:name="_GoBack"/>
-      <w:bookmarkEnd w:id="0"/>
       <w:r>
         <w:rPr>
           <w:b/>
@@ -1511,6 +1509,78 @@
           <w:color w:val="31859C" w:themeColor="accent5" w:themeShade="BF"/>
         </w:rPr>
       </w:pPr>
+    </w:p>
+    <w:p>
+      <w:pPr>
+        <w:rPr>
+          <w:b/>
+          <w:bCs/>
+          <w:color w:val="31859C" w:themeColor="accent5" w:themeShade="BF"/>
+        </w:rPr>
+      </w:pPr>
+    </w:p>
+    <w:p>
+      <w:pPr>
+        <w:rPr>
+          <w:b/>
+          <w:bCs/>
+          <w:color w:val="31859C" w:themeColor="accent5" w:themeShade="BF"/>
+        </w:rPr>
+      </w:pPr>
+    </w:p>
+    <w:p>
+      <w:pPr>
+        <w:rPr>
+          <w:b/>
+          <w:bCs/>
+          <w:color w:val="31859C" w:themeColor="accent5" w:themeShade="BF"/>
+        </w:rPr>
+      </w:pPr>
+    </w:p>
+    <w:p>
+      <w:pPr>
+        <w:rPr>
+          <w:b/>
+          <w:bCs/>
+          <w:color w:val="31859C" w:themeColor="accent5" w:themeShade="BF"/>
+        </w:rPr>
+      </w:pPr>
+    </w:p>
+    <w:p>
+      <w:pPr>
+        <w:rPr>
+          <w:b/>
+          <w:bCs/>
+          <w:color w:val="31859C" w:themeColor="accent5" w:themeShade="BF"/>
+        </w:rPr>
+      </w:pPr>
+    </w:p>
+    <w:p>
+      <w:pPr>
+        <w:rPr>
+          <w:b/>
+          <w:bCs/>
+          <w:color w:val="31859C" w:themeColor="accent5" w:themeShade="BF"/>
+        </w:rPr>
+      </w:pPr>
+    </w:p>
+    <w:p>
+      <w:pPr>
+        <w:rPr>
+          <w:b/>
+          <w:bCs/>
+          <w:color w:val="31859C" w:themeColor="accent5" w:themeShade="BF"/>
+        </w:rPr>
+      </w:pPr>
+    </w:p>
+    <w:p>
+      <w:pPr>
+        <w:rPr>
+          <w:b/>
+          <w:bCs/>
+          <w:color w:val="31859C" w:themeColor="accent5" w:themeShade="BF"/>
+        </w:rPr>
+      </w:pPr>
       <w:r>
         <w:rPr>
           <w:b/>
@@ -1615,59 +1685,148 @@
       </w:r>
     </w:p>
     <w:p>
+      <w:pPr>
+        <w:rPr>
+          <w:rFonts w:hint="default"/>
+          <w:lang w:val="en-US"/>
+        </w:rPr>
+      </w:pPr>
       <w:r>
         <w:br w:type="textWrapping"/>
       </w:r>
       <w:r>
         <w:br w:type="textWrapping"/>
+      </w:r>
+      <w:r>
+        <w:rPr>
+          <w:rFonts w:hint="default"/>
+          <w:lang w:val="en-US"/>
+        </w:rPr>
+        <w:drawing>
+          <wp:inline distT="0" distB="0" distL="114300" distR="114300">
+            <wp:extent cx="5486400" cy="2948940"/>
+            <wp:effectExtent l="0" t="0" r="0" b="3810"/>
+            <wp:docPr id="12" name="Picture 12" descr="GPS"/>
+            <wp:cNvGraphicFramePr>
+              <a:graphicFrameLocks xmlns:a="http://schemas.openxmlformats.org/drawingml/2006/main" noChangeAspect="1"/>
+            </wp:cNvGraphicFramePr>
+            <a:graphic xmlns:a="http://schemas.openxmlformats.org/drawingml/2006/main">
+              <a:graphicData uri="http://schemas.openxmlformats.org/drawingml/2006/picture">
+                <pic:pic xmlns:pic="http://schemas.openxmlformats.org/drawingml/2006/picture">
+                  <pic:nvPicPr>
+                    <pic:cNvPr id="12" name="Picture 12" descr="GPS"/>
+                    <pic:cNvPicPr>
+                      <a:picLocks noChangeAspect="1"/>
+                    </pic:cNvPicPr>
+                  </pic:nvPicPr>
+                  <pic:blipFill>
+                    <a:blip r:embed="rId21"/>
+                    <a:stretch>
+                      <a:fillRect/>
+                    </a:stretch>
+                  </pic:blipFill>
+                  <pic:spPr>
+                    <a:xfrm>
+                      <a:off x="0" y="0"/>
+                      <a:ext cx="5486400" cy="2948940"/>
+                    </a:xfrm>
+                    <a:prstGeom prst="rect">
+                      <a:avLst/>
+                    </a:prstGeom>
+                  </pic:spPr>
+                </pic:pic>
+              </a:graphicData>
+            </a:graphic>
+          </wp:inline>
+        </w:drawing>
       </w:r>
     </w:p>
     <w:p>
       <w:pPr>
-        <w:pStyle w:val="3"/>
-      </w:pPr>
+        <w:rPr>
+          <w:rFonts w:hint="default"/>
+          <w:lang w:val="en-US"/>
+        </w:rPr>
+      </w:pPr>
+      <w:r>
+        <w:rPr>
+          <w:rFonts w:hint="default"/>
+          <w:lang w:val="en-US"/>
+        </w:rPr>
+        <w:drawing>
+          <wp:inline distT="0" distB="0" distL="114300" distR="114300">
+            <wp:extent cx="5486400" cy="2948940"/>
+            <wp:effectExtent l="0" t="0" r="0" b="3810"/>
+            <wp:docPr id="15" name="Picture 15" descr="Camera"/>
+            <wp:cNvGraphicFramePr>
+              <a:graphicFrameLocks xmlns:a="http://schemas.openxmlformats.org/drawingml/2006/main" noChangeAspect="1"/>
+            </wp:cNvGraphicFramePr>
+            <a:graphic xmlns:a="http://schemas.openxmlformats.org/drawingml/2006/main">
+              <a:graphicData uri="http://schemas.openxmlformats.org/drawingml/2006/picture">
+                <pic:pic xmlns:pic="http://schemas.openxmlformats.org/drawingml/2006/picture">
+                  <pic:nvPicPr>
+                    <pic:cNvPr id="15" name="Picture 15" descr="Camera"/>
+                    <pic:cNvPicPr>
+                      <a:picLocks noChangeAspect="1"/>
+                    </pic:cNvPicPr>
+                  </pic:nvPicPr>
+                  <pic:blipFill>
+                    <a:blip r:embed="rId22"/>
+                    <a:stretch>
+                      <a:fillRect/>
+                    </a:stretch>
+                  </pic:blipFill>
+                  <pic:spPr>
+                    <a:xfrm>
+                      <a:off x="0" y="0"/>
+                      <a:ext cx="5486400" cy="2948940"/>
+                    </a:xfrm>
+                    <a:prstGeom prst="rect">
+                      <a:avLst/>
+                    </a:prstGeom>
+                  </pic:spPr>
+                </pic:pic>
+              </a:graphicData>
+            </a:graphic>
+          </wp:inline>
+        </w:drawing>
+      </w:r>
     </w:p>
     <w:p>
-      <w:r>
-        <w:br w:type="textWrapping"/>
-      </w:r>
-      <w:r>
-        <w:br w:type="textWrapping"/>
-      </w:r>
-      <w:r>
-        <w:br w:type="textWrapping"/>
-      </w:r>
+      <w:pPr>
+        <w:pStyle w:val="3"/>
+      </w:pPr>
     </w:p>
     <w:p>
       <w:r>
-        <w:br w:type="page"/>
+        <w:br w:type="textWrapping"/>
+      </w:r>
+      <w:r>
+        <w:br w:type="textWrapping"/>
+      </w:r>
+      <w:r>
+        <w:br w:type="textWrapping"/>
       </w:r>
     </w:p>
     <w:p>
-      <w:pPr>
-        <w:pStyle w:val="2"/>
-      </w:pPr>
-      <w:r>
-        <w:t>Week 10: Notifications and Background Services</w:t>
+      <w:r>
+        <w:br w:type="page"/>
       </w:r>
     </w:p>
     <w:p>
       <w:pPr>
-        <w:pStyle w:val="3"/>
-      </w:pPr>
-      <w:r>
-        <w:t>Same as week 1</w:t>
+        <w:pStyle w:val="2"/>
+      </w:pPr>
+      <w:r>
+        <w:t>Week 10: Notifications and Background Services</w:t>
       </w:r>
     </w:p>
     <w:p>
-      <w:r>
-        <w:br w:type="textWrapping"/>
-      </w:r>
-      <w:r>
-        <w:br w:type="textWrapping"/>
-      </w:r>
-      <w:r>
-        <w:br w:type="textWrapping"/>
+      <w:pPr>
+        <w:pStyle w:val="3"/>
+      </w:pPr>
+      <w:r>
+        <w:t>Same as week 1</w:t>
       </w:r>
     </w:p>
     <w:p>
@@ -1675,8 +1834,64 @@
         <w:br w:type="textWrapping"/>
       </w:r>
       <w:r>
+        <w:drawing>
+          <wp:inline distT="0" distB="0" distL="114300" distR="114300">
+            <wp:extent cx="5486400" cy="2948940"/>
+            <wp:effectExtent l="0" t="0" r="0" b="3810"/>
+            <wp:docPr id="16" name="Picture 2"/>
+            <wp:cNvGraphicFramePr>
+              <a:graphicFrameLocks xmlns:a="http://schemas.openxmlformats.org/drawingml/2006/main" noChangeAspect="1"/>
+            </wp:cNvGraphicFramePr>
+            <a:graphic xmlns:a="http://schemas.openxmlformats.org/drawingml/2006/main">
+              <a:graphicData uri="http://schemas.openxmlformats.org/drawingml/2006/picture">
+                <pic:pic xmlns:pic="http://schemas.openxmlformats.org/drawingml/2006/picture">
+                  <pic:nvPicPr>
+                    <pic:cNvPr id="16" name="Picture 2"/>
+                    <pic:cNvPicPr>
+                      <a:picLocks noChangeAspect="1"/>
+                    </pic:cNvPicPr>
+                  </pic:nvPicPr>
+                  <pic:blipFill>
+                    <a:blip r:embed="rId23"/>
+                    <a:stretch>
+                      <a:fillRect/>
+                    </a:stretch>
+                  </pic:blipFill>
+                  <pic:spPr>
+                    <a:xfrm>
+                      <a:off x="0" y="0"/>
+                      <a:ext cx="5486400" cy="2948940"/>
+                    </a:xfrm>
+                    <a:prstGeom prst="rect">
+                      <a:avLst/>
+                    </a:prstGeom>
+                    <a:noFill/>
+                    <a:ln>
+                      <a:noFill/>
+                    </a:ln>
+                  </pic:spPr>
+                </pic:pic>
+              </a:graphicData>
+            </a:graphic>
+          </wp:inline>
+        </w:drawing>
+      </w:r>
+      <w:r>
         <w:br w:type="textWrapping"/>
       </w:r>
+      <w:r>
+        <w:br w:type="textWrapping"/>
+      </w:r>
+    </w:p>
+    <w:p>
+      <w:r>
+        <w:br w:type="textWrapping"/>
+      </w:r>
+      <w:r>
+        <w:br w:type="textWrapping"/>
+      </w:r>
+      <w:bookmarkStart w:id="0" w:name="_GoBack"/>
+      <w:bookmarkEnd w:id="0"/>
     </w:p>
     <w:p>
       <w:pPr>
@@ -2485,7 +2700,7 @@
     <w:lsdException w:unhideWhenUsed="0" w:uiPriority="70" w:semiHidden="0" w:name="Dark List"/>
     <w:lsdException w:unhideWhenUsed="0" w:uiPriority="71" w:semiHidden="0" w:name="Colorful Shading"/>
     <w:lsdException w:unhideWhenUsed="0" w:uiPriority="72" w:semiHidden="0" w:name="Colorful List"/>
-    <w:lsdException w:unhideWhenUsed="0" w:uiPriority="73" w:semiHidden="0" w:name="Colorful Grid"/>
+    <w:lsdException w:qFormat="1" w:unhideWhenUsed="0" w:uiPriority="73" w:semiHidden="0" w:name="Colorful Grid"/>
     <w:lsdException w:qFormat="1" w:unhideWhenUsed="0" w:uiPriority="60" w:semiHidden="0" w:name="Light Shading Accent 1"/>
     <w:lsdException w:qFormat="1" w:unhideWhenUsed="0" w:uiPriority="61" w:semiHidden="0" w:name="Light List Accent 1"/>
     <w:lsdException w:qFormat="1" w:unhideWhenUsed="0" w:uiPriority="62" w:semiHidden="0" w:name="Light Grid Accent 1"/>
@@ -2499,13 +2714,13 @@
     <w:lsdException w:qFormat="1" w:unhideWhenUsed="0" w:uiPriority="67" w:semiHidden="0" w:name="Medium Grid 1 Accent 1"/>
     <w:lsdException w:unhideWhenUsed="0" w:uiPriority="68" w:semiHidden="0" w:name="Medium Grid 2 Accent 1"/>
     <w:lsdException w:unhideWhenUsed="0" w:uiPriority="69" w:semiHidden="0" w:name="Medium Grid 3 Accent 1"/>
-    <w:lsdException w:unhideWhenUsed="0" w:uiPriority="70" w:semiHidden="0" w:name="Dark List Accent 1"/>
+    <w:lsdException w:qFormat="1" w:unhideWhenUsed="0" w:uiPriority="70" w:semiHidden="0" w:name="Dark List Accent 1"/>
     <w:lsdException w:unhideWhenUsed="0" w:uiPriority="71" w:semiHidden="0" w:name="Colorful Shading Accent 1"/>
     <w:lsdException w:unhideWhenUsed="0" w:uiPriority="72" w:semiHidden="0" w:name="Colorful List Accent 1"/>
     <w:lsdException w:unhideWhenUsed="0" w:uiPriority="73" w:semiHidden="0" w:name="Colorful Grid Accent 1"/>
     <w:lsdException w:qFormat="1" w:unhideWhenUsed="0" w:uiPriority="60" w:semiHidden="0" w:name="Light Shading Accent 2"/>
     <w:lsdException w:qFormat="1" w:unhideWhenUsed="0" w:uiPriority="61" w:semiHidden="0" w:name="Light List Accent 2"/>
-    <w:lsdException w:unhideWhenUsed="0" w:uiPriority="62" w:semiHidden="0" w:name="Light Grid Accent 2"/>
+    <w:lsdException w:qFormat="1" w:unhideWhenUsed="0" w:uiPriority="62" w:semiHidden="0" w:name="Light Grid Accent 2"/>
     <w:lsdException w:qFormat="1" w:unhideWhenUsed="0" w:uiPriority="63" w:semiHidden="0" w:name="Medium Shading 1 Accent 2"/>
     <w:lsdException w:qFormat="1" w:unhideWhenUsed="0" w:uiPriority="64" w:semiHidden="0" w:name="Medium Shading 2 Accent 2"/>
     <w:lsdException w:qFormat="1" w:unhideWhenUsed="0" w:uiPriority="65" w:semiHidden="0" w:name="Medium List 1 Accent 2"/>
@@ -2516,7 +2731,7 @@
     <w:lsdException w:unhideWhenUsed="0" w:uiPriority="70" w:semiHidden="0" w:name="Dark List Accent 2"/>
     <w:lsdException w:unhideWhenUsed="0" w:uiPriority="71" w:semiHidden="0" w:name="Colorful Shading Accent 2"/>
     <w:lsdException w:unhideWhenUsed="0" w:uiPriority="72" w:semiHidden="0" w:name="Colorful List Accent 2"/>
-    <w:lsdException w:unhideWhenUsed="0" w:uiPriority="73" w:semiHidden="0" w:name="Colorful Grid Accent 2"/>
+    <w:lsdException w:qFormat="1" w:unhideWhenUsed="0" w:uiPriority="73" w:semiHidden="0" w:name="Colorful Grid Accent 2"/>
     <w:lsdException w:qFormat="1" w:unhideWhenUsed="0" w:uiPriority="60" w:semiHidden="0" w:name="Light Shading Accent 3"/>
     <w:lsdException w:qFormat="1" w:unhideWhenUsed="0" w:uiPriority="61" w:semiHidden="0" w:name="Light List Accent 3"/>
     <w:lsdException w:qFormat="1" w:unhideWhenUsed="0" w:uiPriority="62" w:semiHidden="0" w:name="Light Grid Accent 3"/>
@@ -2528,13 +2743,13 @@
     <w:lsdException w:unhideWhenUsed="0" w:uiPriority="68" w:semiHidden="0" w:name="Medium Grid 2 Accent 3"/>
     <w:lsdException w:unhideWhenUsed="0" w:uiPriority="69" w:semiHidden="0" w:name="Medium Grid 3 Accent 3"/>
     <w:lsdException w:unhideWhenUsed="0" w:uiPriority="70" w:semiHidden="0" w:name="Dark List Accent 3"/>
-    <w:lsdException w:unhideWhenUsed="0" w:uiPriority="71" w:semiHidden="0" w:name="Colorful Shading Accent 3"/>
+    <w:lsdException w:qFormat="1" w:unhideWhenUsed="0" w:uiPriority="71" w:semiHidden="0" w:name="Colorful Shading Accent 3"/>
     <w:lsdException w:unhideWhenUsed="0" w:uiPriority="72" w:semiHidden="0" w:name="Colorful List Accent 3"/>
-    <w:lsdException w:unhideWhenUsed="0" w:uiPriority="73" w:semiHidden="0" w:name="Colorful Grid Accent 3"/>
+    <w:lsdException w:qFormat="1" w:unhideWhenUsed="0" w:uiPriority="73" w:semiHidden="0" w:name="Colorful Grid Accent 3"/>
     <w:lsdException w:qFormat="1" w:unhideWhenUsed="0" w:uiPriority="60" w:semiHidden="0" w:name="Light Shading Accent 4"/>
     <w:lsdException w:qFormat="1" w:unhideWhenUsed="0" w:uiPriority="61" w:semiHidden="0" w:name="Light List Accent 4"/>
     <w:lsdException w:qFormat="1" w:unhideWhenUsed="0" w:uiPriority="62" w:semiHidden="0" w:name="Light Grid Accent 4"/>
-    <w:lsdException w:unhideWhenUsed="0" w:uiPriority="63" w:semiHidden="0" w:name="Medium Shading 1 Accent 4"/>
+    <w:lsdException w:qFormat="1" w:unhideWhenUsed="0" w:uiPriority="63" w:semiHidden="0" w:name="Medium Shading 1 Accent 4"/>
     <w:lsdException w:qFormat="1" w:unhideWhenUsed="0" w:uiPriority="64" w:semiHidden="0" w:name="Medium Shading 2 Accent 4"/>
     <w:lsdException w:unhideWhenUsed="0" w:uiPriority="65" w:semiHidden="0" w:name="Medium List 1 Accent 4"/>
     <w:lsdException w:qFormat="1" w:unhideWhenUsed="0" w:uiPriority="66" w:semiHidden="0" w:name="Medium List 2 Accent 4"/>
@@ -2557,11 +2772,11 @@
     <w:lsdException w:unhideWhenUsed="0" w:uiPriority="69" w:semiHidden="0" w:name="Medium Grid 3 Accent 5"/>
     <w:lsdException w:unhideWhenUsed="0" w:uiPriority="70" w:semiHidden="0" w:name="Dark List Accent 5"/>
     <w:lsdException w:unhideWhenUsed="0" w:uiPriority="71" w:semiHidden="0" w:name="Colorful Shading Accent 5"/>
-    <w:lsdException w:unhideWhenUsed="0" w:uiPriority="72" w:semiHidden="0" w:name="Colorful List Accent 5"/>
+    <w:lsdException w:qFormat="1" w:unhideWhenUsed="0" w:uiPriority="72" w:semiHidden="0" w:name="Colorful List Accent 5"/>
     <w:lsdException w:unhideWhenUsed="0" w:uiPriority="73" w:semiHidden="0" w:name="Colorful Grid Accent 5"/>
     <w:lsdException w:qFormat="1" w:unhideWhenUsed="0" w:uiPriority="60" w:semiHidden="0" w:name="Light Shading Accent 6"/>
     <w:lsdException w:qFormat="1" w:unhideWhenUsed="0" w:uiPriority="61" w:semiHidden="0" w:name="Light List Accent 6"/>
-    <w:lsdException w:unhideWhenUsed="0" w:uiPriority="62" w:semiHidden="0" w:name="Light Grid Accent 6"/>
+    <w:lsdException w:qFormat="1" w:unhideWhenUsed="0" w:uiPriority="62" w:semiHidden="0" w:name="Light Grid Accent 6"/>
     <w:lsdException w:qFormat="1" w:unhideWhenUsed="0" w:uiPriority="63" w:semiHidden="0" w:name="Medium Shading 1 Accent 6"/>
     <w:lsdException w:unhideWhenUsed="0" w:uiPriority="64" w:semiHidden="0" w:name="Medium Shading 2 Accent 6"/>
     <w:lsdException w:qFormat="1" w:unhideWhenUsed="0" w:uiPriority="65" w:semiHidden="0" w:name="Medium List 1 Accent 6"/>
@@ -2571,7 +2786,7 @@
     <w:lsdException w:unhideWhenUsed="0" w:uiPriority="69" w:semiHidden="0" w:name="Medium Grid 3 Accent 6"/>
     <w:lsdException w:unhideWhenUsed="0" w:uiPriority="70" w:semiHidden="0" w:name="Dark List Accent 6"/>
     <w:lsdException w:unhideWhenUsed="0" w:uiPriority="71" w:semiHidden="0" w:name="Colorful Shading Accent 6"/>
-    <w:lsdException w:unhideWhenUsed="0" w:uiPriority="72" w:semiHidden="0" w:name="Colorful List Accent 6"/>
+    <w:lsdException w:qFormat="1" w:unhideWhenUsed="0" w:uiPriority="72" w:semiHidden="0" w:name="Colorful List Accent 6"/>
     <w:lsdException w:unhideWhenUsed="0" w:uiPriority="73" w:semiHidden="0" w:name="Colorful Grid Accent 6"/>
   </w:latentStyles>
   <w:style w:type="paragraph" w:default="1" w:styleId="1">
@@ -3199,14 +3414,12 @@
         <w:b/>
         <w:bCs/>
       </w:rPr>
-      <w:tblPr/>
     </w:tblStylePr>
     <w:tblStylePr w:type="lastCol">
       <w:rPr>
         <w:b/>
         <w:bCs/>
       </w:rPr>
-      <w:tblPr/>
     </w:tblStylePr>
     <w:tblStylePr w:type="band1Vert">
       <w:tblPr/>
@@ -3313,14 +3526,12 @@
         <w:b/>
         <w:bCs/>
       </w:rPr>
-      <w:tblPr/>
     </w:tblStylePr>
     <w:tblStylePr w:type="lastCol">
       <w:rPr>
         <w:b/>
         <w:bCs/>
       </w:rPr>
-      <w:tblPr/>
     </w:tblStylePr>
     <w:tblStylePr w:type="band1Vert">
       <w:tblPr/>
@@ -3427,14 +3638,12 @@
         <w:b/>
         <w:bCs/>
       </w:rPr>
-      <w:tblPr/>
     </w:tblStylePr>
     <w:tblStylePr w:type="lastCol">
       <w:rPr>
         <w:b/>
         <w:bCs/>
       </w:rPr>
-      <w:tblPr/>
     </w:tblStylePr>
     <w:tblStylePr w:type="band1Vert">
       <w:tblPr/>
@@ -3541,14 +3750,12 @@
         <w:b/>
         <w:bCs/>
       </w:rPr>
-      <w:tblPr/>
     </w:tblStylePr>
     <w:tblStylePr w:type="lastCol">
       <w:rPr>
         <w:b/>
         <w:bCs/>
       </w:rPr>
-      <w:tblPr/>
     </w:tblStylePr>
     <w:tblStylePr w:type="band1Vert">
       <w:tblPr/>
@@ -3655,14 +3862,12 @@
         <w:b/>
         <w:bCs/>
       </w:rPr>
-      <w:tblPr/>
     </w:tblStylePr>
     <w:tblStylePr w:type="lastCol">
       <w:rPr>
         <w:b/>
         <w:bCs/>
       </w:rPr>
-      <w:tblPr/>
     </w:tblStylePr>
     <w:tblStylePr w:type="band1Vert">
       <w:tblPr/>
@@ -3769,14 +3974,12 @@
         <w:b/>
         <w:bCs/>
       </w:rPr>
-      <w:tblPr/>
     </w:tblStylePr>
     <w:tblStylePr w:type="lastCol">
       <w:rPr>
         <w:b/>
         <w:bCs/>
       </w:rPr>
-      <w:tblPr/>
     </w:tblStylePr>
     <w:tblStylePr w:type="band1Vert">
       <w:tblPr/>
@@ -3883,14 +4086,12 @@
         <w:b/>
         <w:bCs/>
       </w:rPr>
-      <w:tblPr/>
     </w:tblStylePr>
     <w:tblStylePr w:type="lastCol">
       <w:rPr>
         <w:b/>
         <w:bCs/>
       </w:rPr>
-      <w:tblPr/>
     </w:tblStylePr>
     <w:tblStylePr w:type="band1Vert">
       <w:tblPr/>
@@ -3988,14 +4189,12 @@
         <w:b/>
         <w:bCs/>
       </w:rPr>
-      <w:tblPr/>
     </w:tblStylePr>
     <w:tblStylePr w:type="lastCol">
       <w:rPr>
         <w:b/>
         <w:bCs/>
       </w:rPr>
-      <w:tblPr/>
     </w:tblStylePr>
     <w:tblStylePr w:type="band1Vert">
       <w:tblPr/>
@@ -4091,14 +4290,12 @@
         <w:b/>
         <w:bCs/>
       </w:rPr>
-      <w:tblPr/>
     </w:tblStylePr>
     <w:tblStylePr w:type="lastCol">
       <w:rPr>
         <w:b/>
         <w:bCs/>
       </w:rPr>
-      <w:tblPr/>
     </w:tblStylePr>
     <w:tblStylePr w:type="band1Vert">
       <w:tblPr/>
@@ -4194,14 +4391,12 @@
         <w:b/>
         <w:bCs/>
       </w:rPr>
-      <w:tblPr/>
     </w:tblStylePr>
     <w:tblStylePr w:type="lastCol">
       <w:rPr>
         <w:b/>
         <w:bCs/>
       </w:rPr>
-      <w:tblPr/>
     </w:tblStylePr>
     <w:tblStylePr w:type="band1Vert">
       <w:tblPr/>
@@ -4297,14 +4492,12 @@
         <w:b/>
         <w:bCs/>
       </w:rPr>
-      <w:tblPr/>
     </w:tblStylePr>
     <w:tblStylePr w:type="lastCol">
       <w:rPr>
         <w:b/>
         <w:bCs/>
       </w:rPr>
-      <w:tblPr/>
     </w:tblStylePr>
     <w:tblStylePr w:type="band1Vert">
       <w:tblPr/>
@@ -4400,14 +4593,12 @@
         <w:b/>
         <w:bCs/>
       </w:rPr>
-      <w:tblPr/>
     </w:tblStylePr>
     <w:tblStylePr w:type="lastCol">
       <w:rPr>
         <w:b/>
         <w:bCs/>
       </w:rPr>
-      <w:tblPr/>
     </w:tblStylePr>
     <w:tblStylePr w:type="band1Vert">
       <w:tblPr/>
@@ -4503,14 +4694,12 @@
         <w:b/>
         <w:bCs/>
       </w:rPr>
-      <w:tblPr/>
     </w:tblStylePr>
     <w:tblStylePr w:type="lastCol">
       <w:rPr>
         <w:b/>
         <w:bCs/>
       </w:rPr>
-      <w:tblPr/>
     </w:tblStylePr>
     <w:tblStylePr w:type="band1Vert">
       <w:tblPr/>
@@ -4606,14 +4795,12 @@
         <w:b/>
         <w:bCs/>
       </w:rPr>
-      <w:tblPr/>
     </w:tblStylePr>
     <w:tblStylePr w:type="lastCol">
       <w:rPr>
         <w:b/>
         <w:bCs/>
       </w:rPr>
-      <w:tblPr/>
     </w:tblStylePr>
     <w:tblStylePr w:type="band1Vert">
       <w:tblPr/>
@@ -4722,7 +4909,6 @@
         <w:b/>
         <w:bCs/>
       </w:rPr>
-      <w:tblPr/>
     </w:tblStylePr>
     <w:tblStylePr w:type="lastCol">
       <w:rPr>
@@ -4868,7 +5054,6 @@
         <w:b/>
         <w:bCs/>
       </w:rPr>
-      <w:tblPr/>
     </w:tblStylePr>
     <w:tblStylePr w:type="lastCol">
       <w:rPr>
@@ -4941,6 +5126,7 @@
   <w:style w:type="table" w:styleId="53">
     <w:name w:val="Light Grid Accent 2"/>
     <w:basedOn w:val="12"/>
+    <w:qFormat/>
     <w:uiPriority w:val="62"/>
     <w:pPr>
       <w:spacing w:after="0" w:line="240" w:lineRule="auto"/>
@@ -5013,7 +5199,6 @@
         <w:b/>
         <w:bCs/>
       </w:rPr>
-      <w:tblPr/>
     </w:tblStylePr>
     <w:tblStylePr w:type="lastCol">
       <w:rPr>
@@ -5159,7 +5344,6 @@
         <w:b/>
         <w:bCs/>
       </w:rPr>
-      <w:tblPr/>
     </w:tblStylePr>
     <w:tblStylePr w:type="lastCol">
       <w:rPr>
@@ -5305,7 +5489,6 @@
         <w:b/>
         <w:bCs/>
       </w:rPr>
-      <w:tblPr/>
     </w:tblStylePr>
     <w:tblStylePr w:type="lastCol">
       <w:rPr>
@@ -5451,7 +5634,6 @@
         <w:b/>
         <w:bCs/>
       </w:rPr>
-      <w:tblPr/>
     </w:tblStylePr>
     <w:tblStylePr w:type="lastCol">
       <w:rPr>
@@ -5524,6 +5706,7 @@
   <w:style w:type="table" w:styleId="57">
     <w:name w:val="Light Grid Accent 6"/>
     <w:basedOn w:val="12"/>
+    <w:qFormat/>
     <w:uiPriority w:val="62"/>
     <w:pPr>
       <w:spacing w:after="0" w:line="240" w:lineRule="auto"/>
@@ -5596,7 +5779,6 @@
         <w:b/>
         <w:bCs/>
       </w:rPr>
-      <w:tblPr/>
     </w:tblStylePr>
     <w:tblStylePr w:type="lastCol">
       <w:rPr>
@@ -5740,14 +5922,12 @@
         <w:b/>
         <w:bCs/>
       </w:rPr>
-      <w:tblPr/>
     </w:tblStylePr>
     <w:tblStylePr w:type="lastCol">
       <w:rPr>
         <w:b/>
         <w:bCs/>
       </w:rPr>
-      <w:tblPr/>
     </w:tblStylePr>
     <w:tblStylePr w:type="band1Vert">
       <w:tblPr/>
@@ -5861,14 +6041,12 @@
         <w:b/>
         <w:bCs/>
       </w:rPr>
-      <w:tblPr/>
     </w:tblStylePr>
     <w:tblStylePr w:type="lastCol">
       <w:rPr>
         <w:b/>
         <w:bCs/>
       </w:rPr>
-      <w:tblPr/>
     </w:tblStylePr>
     <w:tblStylePr w:type="band1Vert">
       <w:tblPr/>
@@ -5982,14 +6160,12 @@
         <w:b/>
         <w:bCs/>
       </w:rPr>
-      <w:tblPr/>
     </w:tblStylePr>
     <w:tblStylePr w:type="lastCol">
       <w:rPr>
         <w:b/>
         <w:bCs/>
       </w:rPr>
-      <w:tblPr/>
     </w:tblStylePr>
     <w:tblStylePr w:type="band1Vert">
       <w:tblPr/>
@@ -6103,14 +6279,12 @@
         <w:b/>
         <w:bCs/>
       </w:rPr>
-      <w:tblPr/>
     </w:tblStylePr>
     <w:tblStylePr w:type="lastCol">
       <w:rPr>
         <w:b/>
         <w:bCs/>
       </w:rPr>
-      <w:tblPr/>
     </w:tblStylePr>
     <w:tblStylePr w:type="band1Vert">
       <w:tblPr/>
@@ -6153,6 +6327,7 @@
   <w:style w:type="table" w:styleId="62">
     <w:name w:val="Medium Shading 1 Accent 4"/>
     <w:basedOn w:val="12"/>
+    <w:qFormat/>
     <w:uiPriority w:val="63"/>
     <w:pPr>
       <w:spacing w:after="0" w:line="240" w:lineRule="auto"/>
@@ -6223,14 +6398,12 @@
         <w:b/>
         <w:bCs/>
       </w:rPr>
-      <w:tblPr/>
     </w:tblStylePr>
     <w:tblStylePr w:type="lastCol">
       <w:rPr>
         <w:b/>
         <w:bCs/>
       </w:rPr>
-      <w:tblPr/>
     </w:tblStylePr>
     <w:tblStylePr w:type="band1Vert">
       <w:tblPr/>
@@ -6344,14 +6517,12 @@
         <w:b/>
         <w:bCs/>
       </w:rPr>
-      <w:tblPr/>
     </w:tblStylePr>
     <w:tblStylePr w:type="lastCol">
       <w:rPr>
         <w:b/>
         <w:bCs/>
       </w:rPr>
-      <w:tblPr/>
     </w:tblStylePr>
     <w:tblStylePr w:type="band1Vert">
       <w:tblPr/>
@@ -6465,14 +6636,12 @@
         <w:b/>
         <w:bCs/>
       </w:rPr>
-      <w:tblPr/>
     </w:tblStylePr>
     <w:tblStylePr w:type="lastCol">
       <w:rPr>
         <w:b/>
         <w:bCs/>
       </w:rPr>
-      <w:tblPr/>
     </w:tblStylePr>
     <w:tblStylePr w:type="band1Vert">
       <w:tblPr/>
@@ -7725,7 +7894,6 @@
         <w:b/>
         <w:bCs/>
       </w:rPr>
-      <w:tblPr/>
     </w:tblStylePr>
     <w:tblStylePr w:type="lastCol">
       <w:rPr>
@@ -7825,7 +7993,6 @@
         <w:b/>
         <w:bCs/>
       </w:rPr>
-      <w:tblPr/>
     </w:tblStylePr>
     <w:tblStylePr w:type="lastCol">
       <w:rPr>
@@ -7925,7 +8092,6 @@
         <w:b/>
         <w:bCs/>
       </w:rPr>
-      <w:tblPr/>
     </w:tblStylePr>
     <w:tblStylePr w:type="lastCol">
       <w:rPr>
@@ -8024,7 +8190,6 @@
         <w:b/>
         <w:bCs/>
       </w:rPr>
-      <w:tblPr/>
     </w:tblStylePr>
     <w:tblStylePr w:type="lastCol">
       <w:rPr>
@@ -8123,7 +8288,6 @@
         <w:b/>
         <w:bCs/>
       </w:rPr>
-      <w:tblPr/>
     </w:tblStylePr>
     <w:tblStylePr w:type="lastCol">
       <w:rPr>
@@ -8223,7 +8387,6 @@
         <w:b/>
         <w:bCs/>
       </w:rPr>
-      <w:tblPr/>
     </w:tblStylePr>
     <w:tblStylePr w:type="lastCol">
       <w:rPr>
@@ -8323,7 +8486,6 @@
         <w:b/>
         <w:bCs/>
       </w:rPr>
-      <w:tblPr/>
     </w:tblStylePr>
     <w:tblStylePr w:type="lastCol">
       <w:rPr>
@@ -9425,7 +9587,6 @@
         <w:b/>
         <w:bCs/>
       </w:rPr>
-      <w:tblPr/>
     </w:tblStylePr>
     <w:tblStylePr w:type="lastRow">
       <w:rPr>
@@ -9451,14 +9612,12 @@
         <w:b/>
         <w:bCs/>
       </w:rPr>
-      <w:tblPr/>
     </w:tblStylePr>
     <w:tblStylePr w:type="lastCol">
       <w:rPr>
         <w:b/>
         <w:bCs/>
       </w:rPr>
-      <w:tblPr/>
     </w:tblStylePr>
     <w:tblStylePr w:type="band1Vert">
       <w:tblPr/>
@@ -9505,7 +9664,6 @@
         <w:b/>
         <w:bCs/>
       </w:rPr>
-      <w:tblPr/>
     </w:tblStylePr>
     <w:tblStylePr w:type="lastRow">
       <w:rPr>
@@ -9531,14 +9689,12 @@
         <w:b/>
         <w:bCs/>
       </w:rPr>
-      <w:tblPr/>
     </w:tblStylePr>
     <w:tblStylePr w:type="lastCol">
       <w:rPr>
         <w:b/>
         <w:bCs/>
       </w:rPr>
-      <w:tblPr/>
     </w:tblStylePr>
     <w:tblStylePr w:type="band1Vert">
       <w:tblPr/>
@@ -9585,7 +9741,6 @@
         <w:b/>
         <w:bCs/>
       </w:rPr>
-      <w:tblPr/>
     </w:tblStylePr>
     <w:tblStylePr w:type="lastRow">
       <w:rPr>
@@ -9611,14 +9766,12 @@
         <w:b/>
         <w:bCs/>
       </w:rPr>
-      <w:tblPr/>
     </w:tblStylePr>
     <w:tblStylePr w:type="lastCol">
       <w:rPr>
         <w:b/>
         <w:bCs/>
       </w:rPr>
-      <w:tblPr/>
     </w:tblStylePr>
     <w:tblStylePr w:type="band1Vert">
       <w:tblPr/>
@@ -9665,7 +9818,6 @@
         <w:b/>
         <w:bCs/>
       </w:rPr>
-      <w:tblPr/>
     </w:tblStylePr>
     <w:tblStylePr w:type="lastRow">
       <w:rPr>
@@ -9691,14 +9843,12 @@
         <w:b/>
         <w:bCs/>
       </w:rPr>
-      <w:tblPr/>
     </w:tblStylePr>
     <w:tblStylePr w:type="lastCol">
       <w:rPr>
         <w:b/>
         <w:bCs/>
       </w:rPr>
-      <w:tblPr/>
     </w:tblStylePr>
     <w:tblStylePr w:type="band1Vert">
       <w:tblPr/>
@@ -9745,7 +9895,6 @@
         <w:b/>
         <w:bCs/>
       </w:rPr>
-      <w:tblPr/>
     </w:tblStylePr>
     <w:tblStylePr w:type="lastRow">
       <w:rPr>
@@ -9771,14 +9920,12 @@
         <w:b/>
         <w:bCs/>
       </w:rPr>
-      <w:tblPr/>
     </w:tblStylePr>
     <w:tblStylePr w:type="lastCol">
       <w:rPr>
         <w:b/>
         <w:bCs/>
       </w:rPr>
-      <w:tblPr/>
     </w:tblStylePr>
     <w:tblStylePr w:type="band1Vert">
       <w:tblPr/>
@@ -9825,7 +9972,6 @@
         <w:b/>
         <w:bCs/>
       </w:rPr>
-      <w:tblPr/>
     </w:tblStylePr>
     <w:tblStylePr w:type="lastRow">
       <w:rPr>
@@ -9851,14 +9997,12 @@
         <w:b/>
         <w:bCs/>
       </w:rPr>
-      <w:tblPr/>
     </w:tblStylePr>
     <w:tblStylePr w:type="lastCol">
       <w:rPr>
         <w:b/>
         <w:bCs/>
       </w:rPr>
-      <w:tblPr/>
     </w:tblStylePr>
     <w:tblStylePr w:type="band1Vert">
       <w:tblPr/>
@@ -9904,7 +10048,6 @@
         <w:b/>
         <w:bCs/>
       </w:rPr>
-      <w:tblPr/>
     </w:tblStylePr>
     <w:tblStylePr w:type="lastRow">
       <w:rPr>
@@ -9930,14 +10073,12 @@
         <w:b/>
         <w:bCs/>
       </w:rPr>
-      <w:tblPr/>
     </w:tblStylePr>
     <w:tblStylePr w:type="lastCol">
       <w:rPr>
         <w:b/>
         <w:bCs/>
       </w:rPr>
-      <w:tblPr/>
     </w:tblStylePr>
     <w:tblStylePr w:type="band1Vert">
       <w:tblPr/>
@@ -12066,6 +12207,7 @@
   <w:style w:type="table" w:styleId="108">
     <w:name w:val="Dark List Accent 1"/>
     <w:basedOn w:val="12"/>
+    <w:qFormat/>
     <w:uiPriority w:val="70"/>
     <w:pPr>
       <w:spacing w:after="0" w:line="240" w:lineRule="auto"/>
@@ -12919,13 +13061,11 @@
       <w:rPr>
         <w:color w:val="000000"/>
       </w:rPr>
-      <w:tblPr/>
     </w:tblStylePr>
     <w:tblStylePr w:type="nwCell">
       <w:rPr>
         <w:color w:val="000000"/>
       </w:rPr>
-      <w:tblPr/>
     </w:tblStylePr>
   </w:style>
   <w:style w:type="table" w:styleId="115">
@@ -13052,13 +13192,11 @@
       <w:rPr>
         <w:color w:val="000000"/>
       </w:rPr>
-      <w:tblPr/>
     </w:tblStylePr>
     <w:tblStylePr w:type="nwCell">
       <w:rPr>
         <w:color w:val="000000"/>
       </w:rPr>
-      <w:tblPr/>
     </w:tblStylePr>
   </w:style>
   <w:style w:type="table" w:styleId="116">
@@ -13185,18 +13323,17 @@
       <w:rPr>
         <w:color w:val="000000"/>
       </w:rPr>
-      <w:tblPr/>
     </w:tblStylePr>
     <w:tblStylePr w:type="nwCell">
       <w:rPr>
         <w:color w:val="000000"/>
       </w:rPr>
-      <w:tblPr/>
     </w:tblStylePr>
   </w:style>
   <w:style w:type="table" w:styleId="117">
     <w:name w:val="Colorful Shading Accent 3"/>
     <w:basedOn w:val="12"/>
+    <w:qFormat/>
     <w:uiPriority w:val="71"/>
     <w:pPr>
       <w:spacing w:after="0" w:line="240" w:lineRule="auto"/>
@@ -13439,13 +13576,11 @@
       <w:rPr>
         <w:color w:val="000000"/>
       </w:rPr>
-      <w:tblPr/>
     </w:tblStylePr>
     <w:tblStylePr w:type="nwCell">
       <w:rPr>
         <w:color w:val="000000"/>
       </w:rPr>
-      <w:tblPr/>
     </w:tblStylePr>
   </w:style>
   <w:style w:type="table" w:styleId="119">
@@ -13572,13 +13707,11 @@
       <w:rPr>
         <w:color w:val="000000"/>
       </w:rPr>
-      <w:tblPr/>
     </w:tblStylePr>
     <w:tblStylePr w:type="nwCell">
       <w:rPr>
         <w:color w:val="000000"/>
       </w:rPr>
-      <w:tblPr/>
     </w:tblStylePr>
   </w:style>
   <w:style w:type="table" w:styleId="120">
@@ -13705,13 +13838,11 @@
       <w:rPr>
         <w:color w:val="000000"/>
       </w:rPr>
-      <w:tblPr/>
     </w:tblStylePr>
     <w:tblStylePr w:type="nwCell">
       <w:rPr>
         <w:color w:val="000000"/>
       </w:rPr>
-      <w:tblPr/>
     </w:tblStylePr>
   </w:style>
   <w:style w:type="table" w:styleId="121">
@@ -13782,14 +13913,12 @@
         <w:b/>
         <w:bCs/>
       </w:rPr>
-      <w:tblPr/>
     </w:tblStylePr>
     <w:tblStylePr w:type="lastCol">
       <w:rPr>
         <w:b/>
         <w:bCs/>
       </w:rPr>
-      <w:tblPr/>
     </w:tblStylePr>
     <w:tblStylePr w:type="band1Vert">
       <w:tblPr/>
@@ -13882,14 +14011,12 @@
         <w:b/>
         <w:bCs/>
       </w:rPr>
-      <w:tblPr/>
     </w:tblStylePr>
     <w:tblStylePr w:type="lastCol">
       <w:rPr>
         <w:b/>
         <w:bCs/>
       </w:rPr>
-      <w:tblPr/>
     </w:tblStylePr>
     <w:tblStylePr w:type="band1Vert">
       <w:tblPr/>
@@ -13982,14 +14109,12 @@
         <w:b/>
         <w:bCs/>
       </w:rPr>
-      <w:tblPr/>
     </w:tblStylePr>
     <w:tblStylePr w:type="lastCol">
       <w:rPr>
         <w:b/>
         <w:bCs/>
       </w:rPr>
-      <w:tblPr/>
     </w:tblStylePr>
     <w:tblStylePr w:type="band1Vert">
       <w:tblPr/>
@@ -14082,14 +14207,12 @@
         <w:b/>
         <w:bCs/>
       </w:rPr>
-      <w:tblPr/>
     </w:tblStylePr>
     <w:tblStylePr w:type="lastCol">
       <w:rPr>
         <w:b/>
         <w:bCs/>
       </w:rPr>
-      <w:tblPr/>
     </w:tblStylePr>
     <w:tblStylePr w:type="band1Vert">
       <w:tblPr/>
@@ -14182,14 +14305,12 @@
         <w:b/>
         <w:bCs/>
       </w:rPr>
-      <w:tblPr/>
     </w:tblStylePr>
     <w:tblStylePr w:type="lastCol">
       <w:rPr>
         <w:b/>
         <w:bCs/>
       </w:rPr>
-      <w:tblPr/>
     </w:tblStylePr>
     <w:tblStylePr w:type="band1Vert">
       <w:tblPr/>
@@ -14217,6 +14338,7 @@
   <w:style w:type="table" w:styleId="126">
     <w:name w:val="Colorful List Accent 5"/>
     <w:basedOn w:val="12"/>
+    <w:qFormat/>
     <w:uiPriority w:val="72"/>
     <w:pPr>
       <w:spacing w:after="0" w:line="240" w:lineRule="auto"/>
@@ -14282,14 +14404,12 @@
         <w:b/>
         <w:bCs/>
       </w:rPr>
-      <w:tblPr/>
     </w:tblStylePr>
     <w:tblStylePr w:type="lastCol">
       <w:rPr>
         <w:b/>
         <w:bCs/>
       </w:rPr>
-      <w:tblPr/>
     </w:tblStylePr>
     <w:tblStylePr w:type="band1Vert">
       <w:tblPr/>
@@ -14317,6 +14437,7 @@
   <w:style w:type="table" w:styleId="127">
     <w:name w:val="Colorful List Accent 6"/>
     <w:basedOn w:val="12"/>
+    <w:qFormat/>
     <w:uiPriority w:val="72"/>
     <w:pPr>
       <w:spacing w:after="0" w:line="240" w:lineRule="auto"/>
@@ -14382,14 +14503,12 @@
         <w:b/>
         <w:bCs/>
       </w:rPr>
-      <w:tblPr/>
     </w:tblStylePr>
     <w:tblStylePr w:type="lastCol">
       <w:rPr>
         <w:b/>
         <w:bCs/>
       </w:rPr>
-      <w:tblPr/>
     </w:tblStylePr>
     <w:tblStylePr w:type="band1Vert">
       <w:tblPr/>
@@ -14417,6 +14536,7 @@
   <w:style w:type="table" w:styleId="128">
     <w:name w:val="Colorful Grid"/>
     <w:basedOn w:val="12"/>
+    <w:qFormat/>
     <w:uiPriority w:val="73"/>
     <w:pPr>
       <w:spacing w:after="0" w:line="240" w:lineRule="auto"/>
@@ -14569,6 +14689,7 @@
   <w:style w:type="table" w:styleId="130">
     <w:name w:val="Colorful Grid Accent 2"/>
     <w:basedOn w:val="12"/>
+    <w:qFormat/>
     <w:uiPriority w:val="73"/>
     <w:pPr>
       <w:spacing w:after="0" w:line="240" w:lineRule="auto"/>
@@ -14645,6 +14766,7 @@
   <w:style w:type="table" w:styleId="131">
     <w:name w:val="Colorful Grid Accent 3"/>
     <w:basedOn w:val="12"/>
+    <w:qFormat/>
     <w:uiPriority w:val="73"/>
     <w:pPr>
       <w:spacing w:after="0" w:line="240" w:lineRule="auto"/>

</xml_diff>

<commit_message>
Batch 10 (Week 14): Applied dart fix across the app (withOpacity to withValues, const constructors), dependency housekeeping
</commit_message>
<xml_diff>
--- a/Logbook.docx
+++ b/Logbook.docx
@@ -4,7 +4,7 @@
   <w:body>
     <w:p>
       <w:pPr>
-        <w:pStyle w:val="36"/>
+        <w:pStyle w:val="37"/>
       </w:pPr>
       <w:r>
         <w:t>BIT 4107 – Mobile Application Development</w:t>
@@ -767,6 +767,7 @@
           <w:lang w:val="en-US"/>
         </w:rPr>
       </w:pPr>
+      <w:bookmarkStart w:id="0" w:name="_GoBack"/>
     </w:p>
     <w:p>
       <w:pPr>
@@ -775,6 +776,7 @@
         </w:rPr>
       </w:pPr>
     </w:p>
+    <w:bookmarkEnd w:id="0"/>
     <w:p>
       <w:pPr>
         <w:pStyle w:val="2"/>
@@ -1890,8 +1892,6 @@
       <w:r>
         <w:br w:type="textWrapping"/>
       </w:r>
-      <w:bookmarkStart w:id="0" w:name="_GoBack"/>
-      <w:bookmarkEnd w:id="0"/>
     </w:p>
     <w:p>
       <w:pPr>
@@ -1932,15 +1932,1148 @@
     </w:p>
     <w:p>
       <w:r>
+        <w:drawing>
+          <wp:inline distT="0" distB="0" distL="114300" distR="114300">
+            <wp:extent cx="3474085" cy="2959735"/>
+            <wp:effectExtent l="0" t="0" r="12065" b="12065"/>
+            <wp:docPr id="8" name="Picture 8" descr="promo_poster (1)"/>
+            <wp:cNvGraphicFramePr>
+              <a:graphicFrameLocks xmlns:a="http://schemas.openxmlformats.org/drawingml/2006/main" noChangeAspect="1"/>
+            </wp:cNvGraphicFramePr>
+            <a:graphic xmlns:a="http://schemas.openxmlformats.org/drawingml/2006/main">
+              <a:graphicData uri="http://schemas.openxmlformats.org/drawingml/2006/picture">
+                <pic:pic xmlns:pic="http://schemas.openxmlformats.org/drawingml/2006/picture">
+                  <pic:nvPicPr>
+                    <pic:cNvPr id="8" name="Picture 8" descr="promo_poster (1)"/>
+                    <pic:cNvPicPr>
+                      <a:picLocks noChangeAspect="1"/>
+                    </pic:cNvPicPr>
+                  </pic:nvPicPr>
+                  <pic:blipFill>
+                    <a:blip r:embed="rId24"/>
+                    <a:stretch>
+                      <a:fillRect/>
+                    </a:stretch>
+                  </pic:blipFill>
+                  <pic:spPr>
+                    <a:xfrm>
+                      <a:off x="0" y="0"/>
+                      <a:ext cx="3474085" cy="2959735"/>
+                    </a:xfrm>
+                    <a:prstGeom prst="rect">
+                      <a:avLst/>
+                    </a:prstGeom>
+                  </pic:spPr>
+                </pic:pic>
+              </a:graphicData>
+            </a:graphic>
+          </wp:inline>
+        </w:drawing>
+      </w:r>
+    </w:p>
+    <w:p>
+      <w:r>
+        <w:drawing>
+          <wp:inline distT="0" distB="0" distL="114300" distR="114300">
+            <wp:extent cx="2399665" cy="4269740"/>
+            <wp:effectExtent l="0" t="0" r="635" b="16510"/>
+            <wp:docPr id="17" name="Picture 17" descr="Dashboard pic"/>
+            <wp:cNvGraphicFramePr>
+              <a:graphicFrameLocks xmlns:a="http://schemas.openxmlformats.org/drawingml/2006/main" noChangeAspect="1"/>
+            </wp:cNvGraphicFramePr>
+            <a:graphic xmlns:a="http://schemas.openxmlformats.org/drawingml/2006/main">
+              <a:graphicData uri="http://schemas.openxmlformats.org/drawingml/2006/picture">
+                <pic:pic xmlns:pic="http://schemas.openxmlformats.org/drawingml/2006/picture">
+                  <pic:nvPicPr>
+                    <pic:cNvPr id="17" name="Picture 17" descr="Dashboard pic"/>
+                    <pic:cNvPicPr>
+                      <a:picLocks noChangeAspect="1"/>
+                    </pic:cNvPicPr>
+                  </pic:nvPicPr>
+                  <pic:blipFill>
+                    <a:blip r:embed="rId25"/>
+                    <a:srcRect l="25000" t="12209" r="53333"/>
+                    <a:stretch>
+                      <a:fillRect/>
+                    </a:stretch>
+                  </pic:blipFill>
+                  <pic:spPr>
+                    <a:xfrm>
+                      <a:off x="0" y="0"/>
+                      <a:ext cx="2399665" cy="4269740"/>
+                    </a:xfrm>
+                    <a:prstGeom prst="rect">
+                      <a:avLst/>
+                    </a:prstGeom>
+                  </pic:spPr>
+                </pic:pic>
+              </a:graphicData>
+            </a:graphic>
+          </wp:inline>
+        </w:drawing>
+      </w:r>
+      <w:r>
+        <w:rPr>
+          <w:rFonts w:hint="default"/>
+          <w:lang w:val="en-US"/>
+        </w:rPr>
+        <w:t xml:space="preserve">                      </w:t>
+      </w:r>
+      <w:r>
+        <w:drawing>
+          <wp:inline distT="0" distB="0" distL="114300" distR="114300">
+            <wp:extent cx="2332990" cy="4297680"/>
+            <wp:effectExtent l="0" t="0" r="10160" b="7620"/>
+            <wp:docPr id="22" name="Picture 22" descr="Exam pic"/>
+            <wp:cNvGraphicFramePr>
+              <a:graphicFrameLocks xmlns:a="http://schemas.openxmlformats.org/drawingml/2006/main" noChangeAspect="1"/>
+            </wp:cNvGraphicFramePr>
+            <a:graphic xmlns:a="http://schemas.openxmlformats.org/drawingml/2006/main">
+              <a:graphicData uri="http://schemas.openxmlformats.org/drawingml/2006/picture">
+                <pic:pic xmlns:pic="http://schemas.openxmlformats.org/drawingml/2006/picture">
+                  <pic:nvPicPr>
+                    <pic:cNvPr id="22" name="Picture 22" descr="Exam pic"/>
+                    <pic:cNvPicPr>
+                      <a:picLocks noChangeAspect="1"/>
+                    </pic:cNvPicPr>
+                  </pic:nvPicPr>
+                  <pic:blipFill>
+                    <a:blip r:embed="rId26"/>
+                    <a:srcRect l="24329" t="11822" r="52928"/>
+                    <a:stretch>
+                      <a:fillRect/>
+                    </a:stretch>
+                  </pic:blipFill>
+                  <pic:spPr>
+                    <a:xfrm>
+                      <a:off x="0" y="0"/>
+                      <a:ext cx="2332990" cy="4297680"/>
+                    </a:xfrm>
+                    <a:prstGeom prst="rect">
+                      <a:avLst/>
+                    </a:prstGeom>
+                  </pic:spPr>
+                </pic:pic>
+              </a:graphicData>
+            </a:graphic>
+          </wp:inline>
+        </w:drawing>
+      </w:r>
+    </w:p>
+    <w:p>
+      <w:r>
+        <w:drawing>
+          <wp:inline distT="0" distB="0" distL="114300" distR="114300">
+            <wp:extent cx="2332355" cy="4394200"/>
+            <wp:effectExtent l="0" t="0" r="10795" b="6350"/>
+            <wp:docPr id="23" name="Picture 23" descr="Announcement pic"/>
+            <wp:cNvGraphicFramePr>
+              <a:graphicFrameLocks xmlns:a="http://schemas.openxmlformats.org/drawingml/2006/main" noChangeAspect="1"/>
+            </wp:cNvGraphicFramePr>
+            <a:graphic xmlns:a="http://schemas.openxmlformats.org/drawingml/2006/main">
+              <a:graphicData uri="http://schemas.openxmlformats.org/drawingml/2006/picture">
+                <pic:pic xmlns:pic="http://schemas.openxmlformats.org/drawingml/2006/picture">
+                  <pic:nvPicPr>
+                    <pic:cNvPr id="23" name="Picture 23" descr="Announcement pic"/>
+                    <pic:cNvPicPr>
+                      <a:picLocks noChangeAspect="1"/>
+                    </pic:cNvPicPr>
+                  </pic:nvPicPr>
+                  <pic:blipFill>
+                    <a:blip r:embed="rId27"/>
+                    <a:srcRect l="24502" t="12037" r="52755"/>
+                    <a:stretch>
+                      <a:fillRect/>
+                    </a:stretch>
+                  </pic:blipFill>
+                  <pic:spPr>
+                    <a:xfrm>
+                      <a:off x="0" y="0"/>
+                      <a:ext cx="2332355" cy="4394200"/>
+                    </a:xfrm>
+                    <a:prstGeom prst="rect">
+                      <a:avLst/>
+                    </a:prstGeom>
+                  </pic:spPr>
+                </pic:pic>
+              </a:graphicData>
+            </a:graphic>
+          </wp:inline>
+        </w:drawing>
+      </w:r>
+      <w:r>
+        <w:rPr>
+          <w:rFonts w:hint="default"/>
+          <w:lang w:val="en-US"/>
+        </w:rPr>
+        <w:t xml:space="preserve">                          </w:t>
+      </w:r>
+      <w:r>
+        <w:drawing>
+          <wp:inline distT="0" distB="0" distL="114300" distR="114300">
+            <wp:extent cx="2237740" cy="4343400"/>
+            <wp:effectExtent l="0" t="0" r="10160" b="0"/>
+            <wp:docPr id="24" name="Picture 24" descr="Attendance pic"/>
+            <wp:cNvGraphicFramePr>
+              <a:graphicFrameLocks xmlns:a="http://schemas.openxmlformats.org/drawingml/2006/main" noChangeAspect="1"/>
+            </wp:cNvGraphicFramePr>
+            <a:graphic xmlns:a="http://schemas.openxmlformats.org/drawingml/2006/main">
+              <a:graphicData uri="http://schemas.openxmlformats.org/drawingml/2006/picture">
+                <pic:pic xmlns:pic="http://schemas.openxmlformats.org/drawingml/2006/picture">
+                  <pic:nvPicPr>
+                    <pic:cNvPr id="24" name="Picture 24" descr="Attendance pic"/>
+                    <pic:cNvPicPr>
+                      <a:picLocks noChangeAspect="1"/>
+                    </pic:cNvPicPr>
+                  </pic:nvPicPr>
+                  <pic:blipFill>
+                    <a:blip r:embed="rId28"/>
+                    <a:srcRect l="24676" t="13028" r="53275"/>
+                    <a:stretch>
+                      <a:fillRect/>
+                    </a:stretch>
+                  </pic:blipFill>
+                  <pic:spPr>
+                    <a:xfrm>
+                      <a:off x="0" y="0"/>
+                      <a:ext cx="2237740" cy="4343400"/>
+                    </a:xfrm>
+                    <a:prstGeom prst="rect">
+                      <a:avLst/>
+                    </a:prstGeom>
+                  </pic:spPr>
+                </pic:pic>
+              </a:graphicData>
+            </a:graphic>
+          </wp:inline>
+        </w:drawing>
+      </w:r>
+      <w:r>
         <w:br w:type="textWrapping"/>
       </w:r>
       <w:r>
         <w:br w:type="textWrapping"/>
       </w:r>
       <w:r>
+        <w:drawing>
+          <wp:inline distT="0" distB="0" distL="114300" distR="114300">
+            <wp:extent cx="2543175" cy="5002530"/>
+            <wp:effectExtent l="0" t="0" r="9525" b="7620"/>
+            <wp:docPr id="25" name="Picture 25" descr="GPS pic"/>
+            <wp:cNvGraphicFramePr>
+              <a:graphicFrameLocks xmlns:a="http://schemas.openxmlformats.org/drawingml/2006/main" noChangeAspect="1"/>
+            </wp:cNvGraphicFramePr>
+            <a:graphic xmlns:a="http://schemas.openxmlformats.org/drawingml/2006/main">
+              <a:graphicData uri="http://schemas.openxmlformats.org/drawingml/2006/picture">
+                <pic:pic xmlns:pic="http://schemas.openxmlformats.org/drawingml/2006/picture">
+                  <pic:nvPicPr>
+                    <pic:cNvPr id="25" name="Picture 25" descr="GPS pic"/>
+                    <pic:cNvPicPr>
+                      <a:picLocks noChangeAspect="1"/>
+                    </pic:cNvPicPr>
+                  </pic:nvPicPr>
+                  <pic:blipFill>
+                    <a:blip r:embed="rId29"/>
+                    <a:srcRect l="24329" t="12468" r="52928"/>
+                    <a:stretch>
+                      <a:fillRect/>
+                    </a:stretch>
+                  </pic:blipFill>
+                  <pic:spPr>
+                    <a:xfrm>
+                      <a:off x="0" y="0"/>
+                      <a:ext cx="2543175" cy="5002530"/>
+                    </a:xfrm>
+                    <a:prstGeom prst="rect">
+                      <a:avLst/>
+                    </a:prstGeom>
+                  </pic:spPr>
+                </pic:pic>
+              </a:graphicData>
+            </a:graphic>
+          </wp:inline>
+        </w:drawing>
+      </w:r>
+    </w:p>
+    <w:p/>
+    <w:p/>
+    <w:p/>
+    <w:p/>
+    <w:p/>
+    <w:p/>
+    <w:p/>
+    <w:p/>
+    <w:p/>
+    <w:p>
+      <w:pPr>
+        <w:spacing w:after="40"/>
+      </w:pPr>
+      <w:r>
+        <w:rPr>
+          <w:b/>
+          <w:bCs/>
+          <w:color w:val="3D2160"/>
+          <w:sz w:val="40"/>
+          <w:szCs w:val="40"/>
+        </w:rPr>
+        <w:t>STUDENT PORTAL</w:t>
+      </w:r>
+    </w:p>
+    <w:p>
+      <w:pPr>
+        <w:spacing w:after="200"/>
+      </w:pPr>
+      <w:r>
+        <w:rPr>
+          <w:b/>
+          <w:bCs/>
+          <w:color w:val="7C4DFF"/>
+          <w:sz w:val="20"/>
+          <w:szCs w:val="20"/>
+        </w:rPr>
+        <w:t>User Guide  ·  Version 1.1.0</w:t>
+      </w:r>
+    </w:p>
+    <w:p>
+      <w:pPr>
+        <w:pBdr>
+          <w:bottom w:val="single" w:color="7C4DFF" w:sz="6" w:space="8"/>
+        </w:pBdr>
+        <w:spacing w:after="220"/>
+      </w:pPr>
+      <w:r>
+        <w:rPr>
+          <w:i/>
+          <w:iCs/>
+          <w:color w:val="555555"/>
+          <w:sz w:val="20"/>
+          <w:szCs w:val="20"/>
+        </w:rPr>
+        <w:t>Everything school, in one place — results, attendance, fees, timetable, exams and more.</w:t>
+      </w:r>
+    </w:p>
+    <w:p>
+      <w:pPr>
+        <w:spacing w:before="100" w:after="100"/>
+      </w:pPr>
+      <w:r>
+        <w:rPr>
+          <w:b/>
+          <w:bCs/>
+          <w:color w:val="3D2160"/>
+          <w:sz w:val="24"/>
+          <w:szCs w:val="24"/>
+        </w:rPr>
+        <w:t>Getting Started</w:t>
+      </w:r>
+    </w:p>
+    <w:p>
+      <w:pPr>
+        <w:spacing w:after="60"/>
+        <w:ind w:left="200"/>
+      </w:pPr>
+      <w:r>
+        <w:rPr>
+          <w:b/>
+          <w:bCs/>
+          <w:color w:val="7C4DFF"/>
+          <w:sz w:val="20"/>
+          <w:szCs w:val="20"/>
+        </w:rPr>
+        <w:t xml:space="preserve">1.  </w:t>
+      </w:r>
+      <w:r>
+        <w:rPr>
+          <w:color w:val="555555"/>
+          <w:sz w:val="20"/>
+          <w:szCs w:val="20"/>
+        </w:rPr>
+        <w:t>Open the app — a splash screen appears briefly while the portal loads.</w:t>
+      </w:r>
+    </w:p>
+    <w:p>
+      <w:pPr>
+        <w:spacing w:after="60"/>
+        <w:ind w:left="200"/>
+      </w:pPr>
+      <w:r>
+        <w:rPr>
+          <w:b/>
+          <w:bCs/>
+          <w:color w:val="7C4DFF"/>
+          <w:sz w:val="20"/>
+          <w:szCs w:val="20"/>
+        </w:rPr>
+        <w:t xml:space="preserve">2.  </w:t>
+      </w:r>
+      <w:r>
+        <w:rPr>
+          <w:color w:val="555555"/>
+          <w:sz w:val="20"/>
+          <w:szCs w:val="20"/>
+        </w:rPr>
+        <w:t>Log in with your student username and password on the Login screen.</w:t>
+      </w:r>
+    </w:p>
+    <w:p>
+      <w:pPr>
+        <w:spacing w:after="60"/>
+        <w:ind w:left="200"/>
+      </w:pPr>
+      <w:r>
+        <w:rPr>
+          <w:b/>
+          <w:bCs/>
+          <w:color w:val="7C4DFF"/>
+          <w:sz w:val="20"/>
+          <w:szCs w:val="20"/>
+        </w:rPr>
+        <w:t xml:space="preserve">3.  </w:t>
+      </w:r>
+      <w:r>
+        <w:rPr>
+          <w:color w:val="555555"/>
+          <w:sz w:val="20"/>
+          <w:szCs w:val="20"/>
+        </w:rPr>
+        <w:t>You'll land on the Dashboard, showing your next class, attendance %, and fee balance at a glance.</w:t>
+      </w:r>
+    </w:p>
+    <w:p>
+      <w:pPr>
+        <w:spacing w:after="60"/>
+        <w:ind w:left="200"/>
+      </w:pPr>
+      <w:r>
+        <w:rPr>
+          <w:b/>
+          <w:bCs/>
+          <w:color w:val="7C4DFF"/>
+          <w:sz w:val="20"/>
+          <w:szCs w:val="20"/>
+        </w:rPr>
+        <w:t xml:space="preserve">4.  </w:t>
+      </w:r>
+      <w:r>
+        <w:rPr>
+          <w:color w:val="555555"/>
+          <w:sz w:val="20"/>
+          <w:szCs w:val="20"/>
+        </w:rPr>
+        <w:t>Tap any tile in the Quick Access grid below to open that feature.</w:t>
+      </w:r>
+    </w:p>
+    <w:p>
+      <w:pPr>
+        <w:spacing w:before="240" w:after="120"/>
+      </w:pPr>
+      <w:r>
+        <w:rPr>
+          <w:b/>
+          <w:bCs/>
+          <w:color w:val="3D2160"/>
+          <w:sz w:val="24"/>
+          <w:szCs w:val="24"/>
+        </w:rPr>
+        <w:t>Key Features</w:t>
+      </w:r>
+    </w:p>
+    <w:tbl>
+      <w:tblPr>
+        <w:tblStyle w:val="12"/>
+        <w:tblW w:w="9360" w:type="dxa"/>
+        <w:tblInd w:w="0" w:type="dxa"/>
+        <w:tblBorders>
+          <w:top w:val="single" w:color="auto" w:sz="4" w:space="0"/>
+          <w:left w:val="single" w:color="auto" w:sz="4" w:space="0"/>
+          <w:bottom w:val="single" w:color="auto" w:sz="4" w:space="0"/>
+          <w:right w:val="single" w:color="auto" w:sz="4" w:space="0"/>
+          <w:insideH w:val="single" w:color="auto" w:sz="4" w:space="0"/>
+          <w:insideV w:val="single" w:color="auto" w:sz="4" w:space="0"/>
+        </w:tblBorders>
+        <w:tblLayout w:type="autofit"/>
+        <w:tblCellMar>
+          <w:top w:w="0" w:type="dxa"/>
+          <w:left w:w="10" w:type="dxa"/>
+          <w:bottom w:w="0" w:type="dxa"/>
+          <w:right w:w="10" w:type="dxa"/>
+        </w:tblCellMar>
+      </w:tblPr>
+      <w:tblGrid>
+        <w:gridCol w:w="4680"/>
+        <w:gridCol w:w="4680"/>
+      </w:tblGrid>
+      <w:tr>
+        <w:tblPrEx>
+          <w:tblBorders>
+            <w:top w:val="single" w:color="auto" w:sz="4" w:space="0"/>
+            <w:left w:val="single" w:color="auto" w:sz="4" w:space="0"/>
+            <w:bottom w:val="single" w:color="auto" w:sz="4" w:space="0"/>
+            <w:right w:val="single" w:color="auto" w:sz="4" w:space="0"/>
+            <w:insideH w:val="single" w:color="auto" w:sz="4" w:space="0"/>
+            <w:insideV w:val="single" w:color="auto" w:sz="4" w:space="0"/>
+          </w:tblBorders>
+          <w:tblCellMar>
+            <w:top w:w="0" w:type="dxa"/>
+            <w:left w:w="10" w:type="dxa"/>
+            <w:bottom w:w="0" w:type="dxa"/>
+            <w:right w:w="10" w:type="dxa"/>
+          </w:tblCellMar>
+        </w:tblPrEx>
+        <w:tc>
+          <w:tcPr>
+            <w:tcW w:w="4680" w:type="dxa"/>
+            <w:tcBorders>
+              <w:top w:val="single" w:color="E0D6F5" w:sz="2" w:space="0"/>
+              <w:left w:val="single" w:color="E0D6F5" w:sz="2" w:space="0"/>
+              <w:bottom w:val="single" w:color="E0D6F5" w:sz="2" w:space="0"/>
+              <w:right w:val="single" w:color="E0D6F5" w:sz="2" w:space="0"/>
+            </w:tcBorders>
+            <w:shd w:val="clear" w:color="auto" w:fill="F3EEFB"/>
+            <w:tcMar>
+              <w:top w:w="120" w:type="dxa"/>
+              <w:left w:w="160" w:type="dxa"/>
+              <w:bottom w:w="120" w:type="dxa"/>
+              <w:right w:w="160" w:type="dxa"/>
+            </w:tcMar>
+          </w:tcPr>
+          <w:p>
+            <w:pPr>
+              <w:spacing w:after="40"/>
+            </w:pPr>
+            <w:r>
+              <w:rPr>
+                <w:b/>
+                <w:bCs/>
+                <w:color w:val="3D2160"/>
+                <w:sz w:val="18"/>
+                <w:szCs w:val="18"/>
+              </w:rPr>
+              <w:t>Results</w:t>
+            </w:r>
+          </w:p>
+          <w:p>
+            <w:r>
+              <w:rPr>
+                <w:color w:val="555555"/>
+                <w:sz w:val="16"/>
+                <w:szCs w:val="16"/>
+              </w:rPr>
+              <w:t>View grades and a full CAT 1 / CAT 2 / final exam breakdown per unit.</w:t>
+            </w:r>
+          </w:p>
+        </w:tc>
+        <w:tc>
+          <w:tcPr>
+            <w:tcW w:w="4680" w:type="dxa"/>
+            <w:tcBorders>
+              <w:top w:val="single" w:color="E0D6F5" w:sz="2" w:space="0"/>
+              <w:left w:val="single" w:color="E0D6F5" w:sz="2" w:space="0"/>
+              <w:bottom w:val="single" w:color="E0D6F5" w:sz="2" w:space="0"/>
+              <w:right w:val="single" w:color="E0D6F5" w:sz="2" w:space="0"/>
+            </w:tcBorders>
+            <w:shd w:val="clear" w:color="auto" w:fill="F3EEFB"/>
+            <w:tcMar>
+              <w:top w:w="120" w:type="dxa"/>
+              <w:left w:w="160" w:type="dxa"/>
+              <w:bottom w:w="120" w:type="dxa"/>
+              <w:right w:w="160" w:type="dxa"/>
+            </w:tcMar>
+          </w:tcPr>
+          <w:p>
+            <w:pPr>
+              <w:spacing w:after="40"/>
+            </w:pPr>
+            <w:r>
+              <w:rPr>
+                <w:b/>
+                <w:bCs/>
+                <w:color w:val="3D2160"/>
+                <w:sz w:val="18"/>
+                <w:szCs w:val="18"/>
+              </w:rPr>
+              <w:t>Attendance</w:t>
+            </w:r>
+          </w:p>
+          <w:p>
+            <w:r>
+              <w:rPr>
+                <w:color w:val="555555"/>
+                <w:sz w:val="16"/>
+                <w:szCs w:val="16"/>
+              </w:rPr>
+              <w:t>Biometric-synced attendance log with a chart and status insights.</w:t>
+            </w:r>
+          </w:p>
+        </w:tc>
+      </w:tr>
+      <w:tr>
+        <w:tblPrEx>
+          <w:tblBorders>
+            <w:top w:val="single" w:color="auto" w:sz="4" w:space="0"/>
+            <w:left w:val="single" w:color="auto" w:sz="4" w:space="0"/>
+            <w:bottom w:val="single" w:color="auto" w:sz="4" w:space="0"/>
+            <w:right w:val="single" w:color="auto" w:sz="4" w:space="0"/>
+            <w:insideH w:val="single" w:color="auto" w:sz="4" w:space="0"/>
+            <w:insideV w:val="single" w:color="auto" w:sz="4" w:space="0"/>
+          </w:tblBorders>
+          <w:tblCellMar>
+            <w:top w:w="0" w:type="dxa"/>
+            <w:left w:w="10" w:type="dxa"/>
+            <w:bottom w:w="0" w:type="dxa"/>
+            <w:right w:w="10" w:type="dxa"/>
+          </w:tblCellMar>
+        </w:tblPrEx>
+        <w:tc>
+          <w:tcPr>
+            <w:tcW w:w="4680" w:type="dxa"/>
+            <w:tcBorders>
+              <w:top w:val="single" w:color="E0D6F5" w:sz="2" w:space="0"/>
+              <w:left w:val="single" w:color="E0D6F5" w:sz="2" w:space="0"/>
+              <w:bottom w:val="single" w:color="E0D6F5" w:sz="2" w:space="0"/>
+              <w:right w:val="single" w:color="E0D6F5" w:sz="2" w:space="0"/>
+            </w:tcBorders>
+            <w:shd w:val="clear" w:color="auto" w:fill="F3EEFB"/>
+            <w:tcMar>
+              <w:top w:w="120" w:type="dxa"/>
+              <w:left w:w="160" w:type="dxa"/>
+              <w:bottom w:w="120" w:type="dxa"/>
+              <w:right w:w="160" w:type="dxa"/>
+            </w:tcMar>
+          </w:tcPr>
+          <w:p>
+            <w:pPr>
+              <w:spacing w:after="40"/>
+            </w:pPr>
+            <w:r>
+              <w:rPr>
+                <w:b/>
+                <w:bCs/>
+                <w:color w:val="3D2160"/>
+                <w:sz w:val="18"/>
+                <w:szCs w:val="18"/>
+              </w:rPr>
+              <w:t>Fees</w:t>
+            </w:r>
+          </w:p>
+          <w:p>
+            <w:r>
+              <w:rPr>
+                <w:color w:val="555555"/>
+                <w:sz w:val="16"/>
+                <w:szCs w:val="16"/>
+              </w:rPr>
+              <w:t>Check your statement and current balance anytime.</w:t>
+            </w:r>
+          </w:p>
+        </w:tc>
+        <w:tc>
+          <w:tcPr>
+            <w:tcW w:w="4680" w:type="dxa"/>
+            <w:tcBorders>
+              <w:top w:val="single" w:color="E0D6F5" w:sz="2" w:space="0"/>
+              <w:left w:val="single" w:color="E0D6F5" w:sz="2" w:space="0"/>
+              <w:bottom w:val="single" w:color="E0D6F5" w:sz="2" w:space="0"/>
+              <w:right w:val="single" w:color="E0D6F5" w:sz="2" w:space="0"/>
+            </w:tcBorders>
+            <w:shd w:val="clear" w:color="auto" w:fill="F3EEFB"/>
+            <w:tcMar>
+              <w:top w:w="120" w:type="dxa"/>
+              <w:left w:w="160" w:type="dxa"/>
+              <w:bottom w:w="120" w:type="dxa"/>
+              <w:right w:w="160" w:type="dxa"/>
+            </w:tcMar>
+          </w:tcPr>
+          <w:p>
+            <w:pPr>
+              <w:spacing w:after="40"/>
+            </w:pPr>
+            <w:r>
+              <w:rPr>
+                <w:b/>
+                <w:bCs/>
+                <w:color w:val="3D2160"/>
+                <w:sz w:val="18"/>
+                <w:szCs w:val="18"/>
+              </w:rPr>
+              <w:t>Timetable</w:t>
+            </w:r>
+          </w:p>
+          <w:p>
+            <w:r>
+              <w:rPr>
+                <w:color w:val="555555"/>
+                <w:sz w:val="16"/>
+                <w:szCs w:val="16"/>
+              </w:rPr>
+              <w:t>See your weekly schedule, including one-tap join for online classes.</w:t>
+            </w:r>
+          </w:p>
+        </w:tc>
+      </w:tr>
+      <w:tr>
+        <w:tblPrEx>
+          <w:tblBorders>
+            <w:top w:val="single" w:color="auto" w:sz="4" w:space="0"/>
+            <w:left w:val="single" w:color="auto" w:sz="4" w:space="0"/>
+            <w:bottom w:val="single" w:color="auto" w:sz="4" w:space="0"/>
+            <w:right w:val="single" w:color="auto" w:sz="4" w:space="0"/>
+            <w:insideH w:val="single" w:color="auto" w:sz="4" w:space="0"/>
+            <w:insideV w:val="single" w:color="auto" w:sz="4" w:space="0"/>
+          </w:tblBorders>
+          <w:tblCellMar>
+            <w:top w:w="0" w:type="dxa"/>
+            <w:left w:w="10" w:type="dxa"/>
+            <w:bottom w:w="0" w:type="dxa"/>
+            <w:right w:w="10" w:type="dxa"/>
+          </w:tblCellMar>
+        </w:tblPrEx>
+        <w:tc>
+          <w:tcPr>
+            <w:tcW w:w="4680" w:type="dxa"/>
+            <w:tcBorders>
+              <w:top w:val="single" w:color="E0D6F5" w:sz="2" w:space="0"/>
+              <w:left w:val="single" w:color="E0D6F5" w:sz="2" w:space="0"/>
+              <w:bottom w:val="single" w:color="E0D6F5" w:sz="2" w:space="0"/>
+              <w:right w:val="single" w:color="E0D6F5" w:sz="2" w:space="0"/>
+            </w:tcBorders>
+            <w:shd w:val="clear" w:color="auto" w:fill="F3EEFB"/>
+            <w:tcMar>
+              <w:top w:w="120" w:type="dxa"/>
+              <w:left w:w="160" w:type="dxa"/>
+              <w:bottom w:w="120" w:type="dxa"/>
+              <w:right w:w="160" w:type="dxa"/>
+            </w:tcMar>
+          </w:tcPr>
+          <w:p>
+            <w:pPr>
+              <w:spacing w:after="40"/>
+            </w:pPr>
+            <w:r>
+              <w:rPr>
+                <w:b/>
+                <w:bCs/>
+                <w:color w:val="3D2160"/>
+                <w:sz w:val="18"/>
+                <w:szCs w:val="18"/>
+              </w:rPr>
+              <w:t>Course &amp; Exam Registration</w:t>
+            </w:r>
+          </w:p>
+          <w:p>
+            <w:r>
+              <w:rPr>
+                <w:color w:val="555555"/>
+                <w:sz w:val="16"/>
+                <w:szCs w:val="16"/>
+              </w:rPr>
+              <w:t>Register units and exams (first attempt, retake, special, re-retake).</w:t>
+            </w:r>
+          </w:p>
+        </w:tc>
+        <w:tc>
+          <w:tcPr>
+            <w:tcW w:w="4680" w:type="dxa"/>
+            <w:tcBorders>
+              <w:top w:val="single" w:color="E0D6F5" w:sz="2" w:space="0"/>
+              <w:left w:val="single" w:color="E0D6F5" w:sz="2" w:space="0"/>
+              <w:bottom w:val="single" w:color="E0D6F5" w:sz="2" w:space="0"/>
+              <w:right w:val="single" w:color="E0D6F5" w:sz="2" w:space="0"/>
+            </w:tcBorders>
+            <w:shd w:val="clear" w:color="auto" w:fill="F3EEFB"/>
+            <w:tcMar>
+              <w:top w:w="120" w:type="dxa"/>
+              <w:left w:w="160" w:type="dxa"/>
+              <w:bottom w:w="120" w:type="dxa"/>
+              <w:right w:w="160" w:type="dxa"/>
+            </w:tcMar>
+          </w:tcPr>
+          <w:p>
+            <w:pPr>
+              <w:spacing w:after="40"/>
+            </w:pPr>
+            <w:r>
+              <w:rPr>
+                <w:b/>
+                <w:bCs/>
+                <w:color w:val="3D2160"/>
+                <w:sz w:val="18"/>
+                <w:szCs w:val="18"/>
+              </w:rPr>
+              <w:t>Announcements</w:t>
+            </w:r>
+          </w:p>
+          <w:p>
+            <w:r>
+              <w:rPr>
+                <w:color w:val="555555"/>
+                <w:sz w:val="16"/>
+                <w:szCs w:val="16"/>
+              </w:rPr>
+              <w:t xml:space="preserve">Get school news the moment it's posted, </w:t>
+            </w:r>
+            <w:r>
+              <w:rPr>
+                <w:color w:val="555555"/>
+                <w:sz w:val="16"/>
+                <w:szCs w:val="16"/>
+                <w:lang w:val="en-US"/>
+              </w:rPr>
+              <w:t>organized</w:t>
+            </w:r>
+            <w:r>
+              <w:rPr>
+                <w:color w:val="555555"/>
+                <w:sz w:val="16"/>
+                <w:szCs w:val="16"/>
+              </w:rPr>
+              <w:t xml:space="preserve"> by category.</w:t>
+            </w:r>
+          </w:p>
+        </w:tc>
+      </w:tr>
+      <w:tr>
+        <w:tblPrEx>
+          <w:tblBorders>
+            <w:top w:val="single" w:color="auto" w:sz="4" w:space="0"/>
+            <w:left w:val="single" w:color="auto" w:sz="4" w:space="0"/>
+            <w:bottom w:val="single" w:color="auto" w:sz="4" w:space="0"/>
+            <w:right w:val="single" w:color="auto" w:sz="4" w:space="0"/>
+            <w:insideH w:val="single" w:color="auto" w:sz="4" w:space="0"/>
+            <w:insideV w:val="single" w:color="auto" w:sz="4" w:space="0"/>
+          </w:tblBorders>
+          <w:tblCellMar>
+            <w:top w:w="0" w:type="dxa"/>
+            <w:left w:w="10" w:type="dxa"/>
+            <w:bottom w:w="0" w:type="dxa"/>
+            <w:right w:w="10" w:type="dxa"/>
+          </w:tblCellMar>
+        </w:tblPrEx>
+        <w:tc>
+          <w:tcPr>
+            <w:tcW w:w="4680" w:type="dxa"/>
+            <w:tcBorders>
+              <w:top w:val="single" w:color="E0D6F5" w:sz="2" w:space="0"/>
+              <w:left w:val="single" w:color="E0D6F5" w:sz="2" w:space="0"/>
+              <w:bottom w:val="single" w:color="E0D6F5" w:sz="2" w:space="0"/>
+              <w:right w:val="single" w:color="E0D6F5" w:sz="2" w:space="0"/>
+            </w:tcBorders>
+            <w:shd w:val="clear" w:color="auto" w:fill="F3EEFB"/>
+            <w:tcMar>
+              <w:top w:w="120" w:type="dxa"/>
+              <w:left w:w="160" w:type="dxa"/>
+              <w:bottom w:w="120" w:type="dxa"/>
+              <w:right w:w="160" w:type="dxa"/>
+            </w:tcMar>
+          </w:tcPr>
+          <w:p>
+            <w:pPr>
+              <w:spacing w:after="40"/>
+            </w:pPr>
+            <w:r>
+              <w:rPr>
+                <w:b/>
+                <w:bCs/>
+                <w:color w:val="3D2160"/>
+                <w:sz w:val="18"/>
+                <w:szCs w:val="18"/>
+              </w:rPr>
+              <w:t>Library &amp; Resources</w:t>
+            </w:r>
+          </w:p>
+          <w:p>
+            <w:r>
+              <w:rPr>
+                <w:color w:val="555555"/>
+                <w:sz w:val="16"/>
+                <w:szCs w:val="16"/>
+              </w:rPr>
+              <w:t>Browse and download notes, past papers, and slides per unit.</w:t>
+            </w:r>
+          </w:p>
+        </w:tc>
+        <w:tc>
+          <w:tcPr>
+            <w:tcW w:w="4680" w:type="dxa"/>
+            <w:tcBorders>
+              <w:top w:val="single" w:color="E0D6F5" w:sz="2" w:space="0"/>
+              <w:left w:val="single" w:color="E0D6F5" w:sz="2" w:space="0"/>
+              <w:bottom w:val="single" w:color="E0D6F5" w:sz="2" w:space="0"/>
+              <w:right w:val="single" w:color="E0D6F5" w:sz="2" w:space="0"/>
+            </w:tcBorders>
+            <w:shd w:val="clear" w:color="auto" w:fill="F3EEFB"/>
+            <w:tcMar>
+              <w:top w:w="120" w:type="dxa"/>
+              <w:left w:w="160" w:type="dxa"/>
+              <w:bottom w:w="120" w:type="dxa"/>
+              <w:right w:w="160" w:type="dxa"/>
+            </w:tcMar>
+          </w:tcPr>
+          <w:p>
+            <w:pPr>
+              <w:spacing w:after="40"/>
+            </w:pPr>
+            <w:r>
+              <w:rPr>
+                <w:b/>
+                <w:bCs/>
+                <w:color w:val="3D2160"/>
+                <w:sz w:val="18"/>
+                <w:szCs w:val="18"/>
+              </w:rPr>
+              <w:t>AI Assistant</w:t>
+            </w:r>
+          </w:p>
+          <w:p>
+            <w:r>
+              <w:rPr>
+                <w:color w:val="555555"/>
+                <w:sz w:val="16"/>
+                <w:szCs w:val="16"/>
+              </w:rPr>
+              <w:t>Ask the floating assistant quick questions about fees, attendance, or class times.</w:t>
+            </w:r>
+          </w:p>
+        </w:tc>
+      </w:tr>
+    </w:tbl>
+    <w:p>
+      <w:pPr>
+        <w:spacing w:before="240" w:after="100"/>
+      </w:pPr>
+      <w:r>
+        <w:rPr>
+          <w:b/>
+          <w:bCs/>
+          <w:color w:val="3D2160"/>
+          <w:sz w:val="24"/>
+          <w:szCs w:val="24"/>
+        </w:rPr>
+        <w:t>Helpful Tips</w:t>
+      </w:r>
+    </w:p>
+    <w:p>
+      <w:pPr>
+        <w:spacing w:after="60"/>
+        <w:ind w:left="200"/>
+      </w:pPr>
+      <w:r>
+        <w:rPr>
+          <w:b/>
+          <w:bCs/>
+          <w:color w:val="7C4DFF"/>
+          <w:sz w:val="20"/>
+          <w:szCs w:val="20"/>
+        </w:rPr>
+        <w:t xml:space="preserve">•  </w:t>
+      </w:r>
+      <w:r>
+        <w:rPr>
+          <w:color w:val="555555"/>
+          <w:sz w:val="20"/>
+          <w:szCs w:val="20"/>
+        </w:rPr>
+        <w:t>Pull down on the Dashboard to refresh your attendance and fee balance instantly.</w:t>
+      </w:r>
+    </w:p>
+    <w:p>
+      <w:pPr>
+        <w:spacing w:after="60"/>
+        <w:ind w:left="200"/>
+      </w:pPr>
+      <w:r>
+        <w:rPr>
+          <w:b/>
+          <w:bCs/>
+          <w:color w:val="7C4DFF"/>
+          <w:sz w:val="20"/>
+          <w:szCs w:val="20"/>
+        </w:rPr>
+        <w:t xml:space="preserve">•  </w:t>
+      </w:r>
+      <w:r>
+        <w:rPr>
+          <w:color w:val="555555"/>
+          <w:sz w:val="20"/>
+          <w:szCs w:val="20"/>
+        </w:rPr>
+        <w:t>Use the search icon (top-right) to jump straight to any screen by name.</w:t>
+      </w:r>
+    </w:p>
+    <w:p>
+      <w:pPr>
+        <w:spacing w:after="60"/>
+        <w:ind w:left="200"/>
+      </w:pPr>
+      <w:r>
+        <w:rPr>
+          <w:b/>
+          <w:bCs/>
+          <w:color w:val="7C4DFF"/>
+          <w:sz w:val="20"/>
+          <w:szCs w:val="20"/>
+        </w:rPr>
+        <w:t xml:space="preserve">•  </w:t>
+      </w:r>
+      <w:r>
+        <w:rPr>
+          <w:color w:val="555555"/>
+          <w:sz w:val="20"/>
+          <w:szCs w:val="20"/>
+        </w:rPr>
+        <w:t>The bell icon shows a red badge when you have unread announcements.</w:t>
+      </w:r>
+    </w:p>
+    <w:p>
+      <w:pPr>
+        <w:pBdr>
+          <w:top w:val="single" w:color="DDDDDD" w:sz="4" w:space="8"/>
+        </w:pBdr>
+        <w:spacing w:before="300"/>
+        <w:jc w:val="center"/>
+      </w:pPr>
+      <w:r>
+        <w:rPr>
+          <w:color w:val="999999"/>
+          <w:sz w:val="16"/>
+          <w:szCs w:val="16"/>
+        </w:rPr>
+        <w:t>Student Portal  ·  BIT4107 Mobile Application Development Project  ·  v1.1.0</w:t>
+      </w:r>
+    </w:p>
+    <w:p>
+      <w:r>
         <w:br w:type="textWrapping"/>
       </w:r>
     </w:p>
+    <w:p/>
+    <w:p/>
+    <w:p>
+      <w:pPr>
+        <w:pStyle w:val="33"/>
+        <w:keepNext w:val="0"/>
+        <w:keepLines w:val="0"/>
+        <w:widowControl/>
+        <w:suppressLineNumbers w:val="0"/>
+        <w:spacing w:before="0" w:beforeAutospacing="1" w:after="0" w:afterAutospacing="0"/>
+        <w:ind w:left="0" w:right="0"/>
+      </w:pPr>
+      <w:r>
+        <w:t>"Imagine being a student juggling five different logins</w:t>
+      </w:r>
+      <w:r>
+        <w:rPr>
+          <w:rFonts w:hint="default"/>
+          <w:lang w:val="en-US"/>
+        </w:rPr>
+        <w:t>:</w:t>
+      </w:r>
+      <w:r>
+        <w:t xml:space="preserve"> one for grades, another for fees, a separate app for the timetable, and still checking a noticeboard for announcements. That's the problem Student Portal solves. It's a single mobile app that brings every part of student life — academic, financial, and administrative — into one place.</w:t>
+      </w:r>
+    </w:p>
+    <w:p>
+      <w:pPr>
+        <w:pStyle w:val="33"/>
+        <w:keepNext w:val="0"/>
+        <w:keepLines w:val="0"/>
+        <w:widowControl/>
+        <w:suppressLineNumbers w:val="0"/>
+        <w:spacing w:before="0" w:beforeAutospacing="1" w:after="0" w:afterAutospacing="0"/>
+        <w:ind w:left="0" w:right="0"/>
+      </w:pPr>
+      <w:r>
+        <w:t>After a quick, secure login, students land on a dashboard that shows their next class, attendance percentage, and fee balance at a glance — no digging through menus. From there, they can view detailed results with a full CAT and final exam breakdown, register for units and exams, check their fee statement, and follow their timetable, including joining online classes directly from the app with biometric authentication.</w:t>
+      </w:r>
+    </w:p>
+    <w:p>
+      <w:pPr>
+        <w:pStyle w:val="33"/>
+        <w:keepNext w:val="0"/>
+        <w:keepLines w:val="0"/>
+        <w:widowControl/>
+        <w:suppressLineNumbers w:val="0"/>
+        <w:spacing w:before="0" w:beforeAutospacing="1" w:after="0" w:afterAutospacing="0"/>
+        <w:ind w:left="0" w:right="0"/>
+      </w:pPr>
+      <w:r>
+        <w:t>What sets Student Portal apart is the small details that remove friction. A built-in AI assistant answers quick questions like 'what's my fee balance?' without navigating anywhere. Pull-to-refresh keeps data current with one gesture. Attendance and results come with plain-language insight cards flagging what needs attention. And it works even when a network call fails — showing a clear retry option instead of a blank, confusing screen.</w:t>
+      </w:r>
+    </w:p>
+    <w:p>
+      <w:pPr>
+        <w:pStyle w:val="33"/>
+        <w:keepNext w:val="0"/>
+        <w:keepLines w:val="0"/>
+        <w:widowControl/>
+        <w:suppressLineNumbers w:val="0"/>
+        <w:spacing w:before="0" w:beforeAutospacing="1" w:after="0" w:afterAutospacing="0"/>
+        <w:ind w:left="0" w:right="0"/>
+      </w:pPr>
+      <w:r>
+        <w:t>This is built for university and college students first, but the same structure — results, fees, attendance, announcements — applies to any institution. It's equally useful for administrators, since a single well-designed app reduces support requests and keeps students self-sufficient.</w:t>
+      </w:r>
+    </w:p>
+    <w:p>
+      <w:pPr>
+        <w:pStyle w:val="33"/>
+        <w:keepNext w:val="0"/>
+        <w:keepLines w:val="0"/>
+        <w:widowControl/>
+        <w:suppressLineNumbers w:val="0"/>
+        <w:spacing w:before="0" w:beforeAutospacing="1" w:after="0" w:afterAutospacing="0"/>
+        <w:ind w:left="0" w:right="0"/>
+        <w:rPr>
+          <w:rFonts w:hint="default"/>
+          <w:lang w:val="en-US"/>
+        </w:rPr>
+      </w:pPr>
+      <w:r>
+        <w:t>Looking ahead: push notifications for real-time fee and result alerts, offline mode so core data is available without signal, a parent/guardian companion view, and analytics for lecturers to spot at-risk students earlier based on attendance trends</w:t>
+      </w:r>
+      <w:r>
+        <w:rPr>
+          <w:rFonts w:hint="default"/>
+          <w:lang w:val="en-US"/>
+        </w:rPr>
+        <w:t>.</w:t>
+      </w:r>
+    </w:p>
+    <w:p>
+      <w:pPr>
+        <w:pStyle w:val="33"/>
+        <w:keepNext w:val="0"/>
+        <w:keepLines w:val="0"/>
+        <w:widowControl/>
+        <w:suppressLineNumbers w:val="0"/>
+        <w:spacing w:before="0" w:beforeAutospacing="1" w:after="0" w:afterAutospacing="0"/>
+        <w:ind w:left="0" w:right="0"/>
+      </w:pPr>
+      <w:r>
+        <w:t>Student Portal isn't just a coursework project — it's a working blueprint for what campus life could look like on a single screen."</w:t>
+      </w:r>
+    </w:p>
+    <w:p>
+      <w:pPr>
+        <w:keepNext w:val="0"/>
+        <w:keepLines w:val="0"/>
+        <w:widowControl/>
+        <w:suppressLineNumbers w:val="0"/>
+        <w:spacing w:after="0" w:afterAutospacing="0"/>
+      </w:pPr>
+    </w:p>
+    <w:p>
+      <w:pPr>
+        <w:pStyle w:val="33"/>
+        <w:keepNext w:val="0"/>
+        <w:keepLines w:val="0"/>
+        <w:widowControl/>
+        <w:suppressLineNumbers w:val="0"/>
+        <w:spacing w:before="0" w:beforeAutospacing="1" w:after="0" w:afterAutospacing="1"/>
+        <w:ind w:left="0" w:right="0"/>
+      </w:pPr>
+    </w:p>
+    <w:p/>
     <w:p/>
     <w:p>
       <w:pPr>
@@ -2530,7 +3663,7 @@
   <w:docDefaults>
     <w:rPrDefault>
       <w:rPr>
-        <w:rFonts w:ascii="Cambria" w:hAnsi="Cambria" w:eastAsia="ＭＳ 明朝" w:cs="SimSun"/>
+        <w:rFonts w:ascii="Times New Roman" w:hAnsi="Times New Roman" w:eastAsia="SimSun" w:cs="Times New Roman"/>
       </w:rPr>
     </w:rPrDefault>
     <w:pPrDefault/>
@@ -2716,7 +3849,7 @@
     <w:lsdException w:unhideWhenUsed="0" w:uiPriority="69" w:semiHidden="0" w:name="Medium Grid 3 Accent 1"/>
     <w:lsdException w:qFormat="1" w:unhideWhenUsed="0" w:uiPriority="70" w:semiHidden="0" w:name="Dark List Accent 1"/>
     <w:lsdException w:unhideWhenUsed="0" w:uiPriority="71" w:semiHidden="0" w:name="Colorful Shading Accent 1"/>
-    <w:lsdException w:unhideWhenUsed="0" w:uiPriority="72" w:semiHidden="0" w:name="Colorful List Accent 1"/>
+    <w:lsdException w:qFormat="1" w:unhideWhenUsed="0" w:uiPriority="72" w:semiHidden="0" w:name="Colorful List Accent 1"/>
     <w:lsdException w:unhideWhenUsed="0" w:uiPriority="73" w:semiHidden="0" w:name="Colorful Grid Accent 1"/>
     <w:lsdException w:qFormat="1" w:unhideWhenUsed="0" w:uiPriority="60" w:semiHidden="0" w:name="Light Shading Accent 2"/>
     <w:lsdException w:qFormat="1" w:unhideWhenUsed="0" w:uiPriority="61" w:semiHidden="0" w:name="Light List Accent 2"/>
@@ -2759,7 +3892,7 @@
     <w:lsdException w:unhideWhenUsed="0" w:uiPriority="70" w:semiHidden="0" w:name="Dark List Accent 4"/>
     <w:lsdException w:unhideWhenUsed="0" w:uiPriority="71" w:semiHidden="0" w:name="Colorful Shading Accent 4"/>
     <w:lsdException w:unhideWhenUsed="0" w:uiPriority="72" w:semiHidden="0" w:name="Colorful List Accent 4"/>
-    <w:lsdException w:unhideWhenUsed="0" w:uiPriority="73" w:semiHidden="0" w:name="Colorful Grid Accent 4"/>
+    <w:lsdException w:qFormat="1" w:unhideWhenUsed="0" w:uiPriority="73" w:semiHidden="0" w:name="Colorful Grid Accent 4"/>
     <w:lsdException w:qFormat="1" w:unhideWhenUsed="0" w:uiPriority="60" w:semiHidden="0" w:name="Light Shading Accent 5"/>
     <w:lsdException w:qFormat="1" w:unhideWhenUsed="0" w:uiPriority="61" w:semiHidden="0" w:name="Light List Accent 5"/>
     <w:lsdException w:qFormat="1" w:unhideWhenUsed="0" w:uiPriority="62" w:semiHidden="0" w:name="Light Grid Accent 5"/>
@@ -2773,7 +3906,7 @@
     <w:lsdException w:unhideWhenUsed="0" w:uiPriority="70" w:semiHidden="0" w:name="Dark List Accent 5"/>
     <w:lsdException w:unhideWhenUsed="0" w:uiPriority="71" w:semiHidden="0" w:name="Colorful Shading Accent 5"/>
     <w:lsdException w:qFormat="1" w:unhideWhenUsed="0" w:uiPriority="72" w:semiHidden="0" w:name="Colorful List Accent 5"/>
-    <w:lsdException w:unhideWhenUsed="0" w:uiPriority="73" w:semiHidden="0" w:name="Colorful Grid Accent 5"/>
+    <w:lsdException w:qFormat="1" w:unhideWhenUsed="0" w:uiPriority="73" w:semiHidden="0" w:name="Colorful Grid Accent 5"/>
     <w:lsdException w:qFormat="1" w:unhideWhenUsed="0" w:uiPriority="60" w:semiHidden="0" w:name="Light Shading Accent 6"/>
     <w:lsdException w:qFormat="1" w:unhideWhenUsed="0" w:uiPriority="61" w:semiHidden="0" w:name="Light List Accent 6"/>
     <w:lsdException w:qFormat="1" w:unhideWhenUsed="0" w:uiPriority="62" w:semiHidden="0" w:name="Light Grid Accent 6"/>
@@ -2787,7 +3920,7 @@
     <w:lsdException w:unhideWhenUsed="0" w:uiPriority="70" w:semiHidden="0" w:name="Dark List Accent 6"/>
     <w:lsdException w:unhideWhenUsed="0" w:uiPriority="71" w:semiHidden="0" w:name="Colorful Shading Accent 6"/>
     <w:lsdException w:qFormat="1" w:unhideWhenUsed="0" w:uiPriority="72" w:semiHidden="0" w:name="Colorful List Accent 6"/>
-    <w:lsdException w:unhideWhenUsed="0" w:uiPriority="73" w:semiHidden="0" w:name="Colorful Grid Accent 6"/>
+    <w:lsdException w:qFormat="1" w:unhideWhenUsed="0" w:uiPriority="73" w:semiHidden="0" w:name="Colorful Grid Accent 6"/>
   </w:latentStyles>
   <w:style w:type="paragraph" w:default="1" w:styleId="1">
     <w:name w:val="Normal"/>
@@ -2807,7 +3940,7 @@
     <w:name w:val="heading 1"/>
     <w:basedOn w:val="1"/>
     <w:next w:val="1"/>
-    <w:link w:val="135"/>
+    <w:link w:val="136"/>
     <w:qFormat/>
     <w:uiPriority w:val="9"/>
     <w:pPr>
@@ -2829,7 +3962,7 @@
     <w:name w:val="heading 2"/>
     <w:basedOn w:val="1"/>
     <w:next w:val="1"/>
-    <w:link w:val="136"/>
+    <w:link w:val="137"/>
     <w:qFormat/>
     <w:uiPriority w:val="9"/>
     <w:pPr>
@@ -2851,7 +3984,7 @@
     <w:name w:val="heading 3"/>
     <w:basedOn w:val="1"/>
     <w:next w:val="1"/>
-    <w:link w:val="137"/>
+    <w:link w:val="138"/>
     <w:qFormat/>
     <w:uiPriority w:val="9"/>
     <w:pPr>
@@ -2871,7 +4004,7 @@
     <w:name w:val="heading 4"/>
     <w:basedOn w:val="1"/>
     <w:next w:val="1"/>
-    <w:link w:val="138"/>
+    <w:link w:val="139"/>
     <w:qFormat/>
     <w:uiPriority w:val="9"/>
     <w:pPr>
@@ -2893,7 +4026,7 @@
     <w:name w:val="heading 5"/>
     <w:basedOn w:val="1"/>
     <w:next w:val="1"/>
-    <w:link w:val="139"/>
+    <w:link w:val="140"/>
     <w:qFormat/>
     <w:uiPriority w:val="9"/>
     <w:pPr>
@@ -2911,7 +4044,7 @@
     <w:name w:val="heading 6"/>
     <w:basedOn w:val="1"/>
     <w:next w:val="1"/>
-    <w:link w:val="140"/>
+    <w:link w:val="141"/>
     <w:qFormat/>
     <w:uiPriority w:val="9"/>
     <w:pPr>
@@ -2931,7 +4064,7 @@
     <w:name w:val="heading 7"/>
     <w:basedOn w:val="1"/>
     <w:next w:val="1"/>
-    <w:link w:val="141"/>
+    <w:link w:val="142"/>
     <w:qFormat/>
     <w:uiPriority w:val="9"/>
     <w:pPr>
@@ -2951,7 +4084,7 @@
     <w:name w:val="heading 8"/>
     <w:basedOn w:val="1"/>
     <w:next w:val="1"/>
-    <w:link w:val="142"/>
+    <w:link w:val="143"/>
     <w:qFormat/>
     <w:uiPriority w:val="9"/>
     <w:pPr>
@@ -2971,7 +4104,7 @@
     <w:name w:val="heading 9"/>
     <w:basedOn w:val="1"/>
     <w:next w:val="1"/>
-    <w:link w:val="143"/>
+    <w:link w:val="144"/>
     <w:qFormat/>
     <w:uiPriority w:val="9"/>
     <w:pPr>
@@ -3010,7 +4143,7 @@
   <w:style w:type="paragraph" w:styleId="13">
     <w:name w:val="Body Text"/>
     <w:basedOn w:val="1"/>
-    <w:link w:val="144"/>
+    <w:link w:val="145"/>
     <w:qFormat/>
     <w:uiPriority w:val="99"/>
     <w:pPr>
@@ -3020,7 +4153,7 @@
   <w:style w:type="paragraph" w:styleId="14">
     <w:name w:val="Body Text 2"/>
     <w:basedOn w:val="1"/>
-    <w:link w:val="145"/>
+    <w:link w:val="146"/>
     <w:qFormat/>
     <w:uiPriority w:val="99"/>
     <w:pPr>
@@ -3030,7 +4163,7 @@
   <w:style w:type="paragraph" w:styleId="15">
     <w:name w:val="Body Text 3"/>
     <w:basedOn w:val="1"/>
-    <w:link w:val="146"/>
+    <w:link w:val="147"/>
     <w:qFormat/>
     <w:uiPriority w:val="99"/>
     <w:pPr>
@@ -3071,7 +4204,7 @@
   <w:style w:type="paragraph" w:styleId="18">
     <w:name w:val="footer"/>
     <w:basedOn w:val="1"/>
-    <w:link w:val="147"/>
+    <w:link w:val="148"/>
     <w:qFormat/>
     <w:uiPriority w:val="99"/>
     <w:pPr>
@@ -3085,7 +4218,7 @@
   <w:style w:type="paragraph" w:styleId="19">
     <w:name w:val="header"/>
     <w:basedOn w:val="1"/>
-    <w:link w:val="148"/>
+    <w:link w:val="149"/>
     <w:qFormat/>
     <w:uiPriority w:val="99"/>
     <w:pPr>
@@ -3239,7 +4372,7 @@
   </w:style>
   <w:style w:type="paragraph" w:styleId="32">
     <w:name w:val="macro"/>
-    <w:link w:val="149"/>
+    <w:link w:val="150"/>
     <w:qFormat/>
     <w:uiPriority w:val="99"/>
     <w:pPr>
@@ -3261,7 +4394,16 @@
       <w:lang w:val="en-US" w:eastAsia="en-US" w:bidi="ar-SA"/>
     </w:rPr>
   </w:style>
-  <w:style w:type="character" w:styleId="33">
+  <w:style w:type="paragraph" w:styleId="33">
+    <w:name w:val="Normal (Web)"/>
+    <w:basedOn w:val="1"/>
+    <w:uiPriority w:val="0"/>
+    <w:rPr>
+      <w:sz w:val="24"/>
+      <w:szCs w:val="24"/>
+    </w:rPr>
+  </w:style>
+  <w:style w:type="character" w:styleId="34">
     <w:name w:val="Strong"/>
     <w:basedOn w:val="11"/>
     <w:qFormat/>
@@ -3271,11 +4413,11 @@
       <w:bCs/>
     </w:rPr>
   </w:style>
-  <w:style w:type="paragraph" w:styleId="34">
+  <w:style w:type="paragraph" w:styleId="35">
     <w:name w:val="Subtitle"/>
     <w:basedOn w:val="1"/>
     <w:next w:val="1"/>
-    <w:link w:val="150"/>
+    <w:link w:val="151"/>
     <w:qFormat/>
     <w:uiPriority w:val="11"/>
     <w:pPr>
@@ -3294,7 +4436,7 @@
       <w:szCs w:val="24"/>
     </w:rPr>
   </w:style>
-  <w:style w:type="table" w:styleId="35">
+  <w:style w:type="table" w:styleId="36">
     <w:name w:val="Table Grid"/>
     <w:basedOn w:val="12"/>
     <w:qFormat/>
@@ -3319,11 +4461,11 @@
       </w:tblCellMar>
     </w:tblPr>
   </w:style>
-  <w:style w:type="paragraph" w:styleId="36">
+  <w:style w:type="paragraph" w:styleId="37">
     <w:name w:val="Title"/>
     <w:basedOn w:val="1"/>
     <w:next w:val="1"/>
-    <w:link w:val="151"/>
+    <w:link w:val="152"/>
     <w:qFormat/>
     <w:uiPriority w:val="10"/>
     <w:pPr>
@@ -3342,7 +4484,7 @@
       <w:szCs w:val="52"/>
     </w:rPr>
   </w:style>
-  <w:style w:type="table" w:styleId="37">
+  <w:style w:type="table" w:styleId="38">
     <w:name w:val="Light Shading"/>
     <w:basedOn w:val="12"/>
     <w:qFormat/>
@@ -3454,7 +4596,7 @@
       </w:tcPr>
     </w:tblStylePr>
   </w:style>
-  <w:style w:type="table" w:styleId="38">
+  <w:style w:type="table" w:styleId="39">
     <w:name w:val="Light Shading Accent 1"/>
     <w:basedOn w:val="12"/>
     <w:qFormat/>
@@ -3566,7 +4708,7 @@
       </w:tcPr>
     </w:tblStylePr>
   </w:style>
-  <w:style w:type="table" w:styleId="39">
+  <w:style w:type="table" w:styleId="40">
     <w:name w:val="Light Shading Accent 2"/>
     <w:basedOn w:val="12"/>
     <w:qFormat/>
@@ -3678,7 +4820,7 @@
       </w:tcPr>
     </w:tblStylePr>
   </w:style>
-  <w:style w:type="table" w:styleId="40">
+  <w:style w:type="table" w:styleId="41">
     <w:name w:val="Light Shading Accent 3"/>
     <w:basedOn w:val="12"/>
     <w:qFormat/>
@@ -3790,7 +4932,7 @@
       </w:tcPr>
     </w:tblStylePr>
   </w:style>
-  <w:style w:type="table" w:styleId="41">
+  <w:style w:type="table" w:styleId="42">
     <w:name w:val="Light Shading Accent 4"/>
     <w:basedOn w:val="12"/>
     <w:qFormat/>
@@ -3902,7 +5044,7 @@
       </w:tcPr>
     </w:tblStylePr>
   </w:style>
-  <w:style w:type="table" w:styleId="42">
+  <w:style w:type="table" w:styleId="43">
     <w:name w:val="Light Shading Accent 5"/>
     <w:basedOn w:val="12"/>
     <w:qFormat/>
@@ -4014,7 +5156,7 @@
       </w:tcPr>
     </w:tblStylePr>
   </w:style>
-  <w:style w:type="table" w:styleId="43">
+  <w:style w:type="table" w:styleId="44">
     <w:name w:val="Light Shading Accent 6"/>
     <w:basedOn w:val="12"/>
     <w:qFormat/>
@@ -4126,7 +5268,7 @@
       </w:tcPr>
     </w:tblStylePr>
   </w:style>
-  <w:style w:type="table" w:styleId="44">
+  <w:style w:type="table" w:styleId="45">
     <w:name w:val="Light List"/>
     <w:basedOn w:val="12"/>
     <w:qFormat/>
@@ -4227,7 +5369,7 @@
       </w:tcPr>
     </w:tblStylePr>
   </w:style>
-  <w:style w:type="table" w:styleId="45">
+  <w:style w:type="table" w:styleId="46">
     <w:name w:val="Light List Accent 1"/>
     <w:basedOn w:val="12"/>
     <w:qFormat/>
@@ -4328,7 +5470,7 @@
       </w:tcPr>
     </w:tblStylePr>
   </w:style>
-  <w:style w:type="table" w:styleId="46">
+  <w:style w:type="table" w:styleId="47">
     <w:name w:val="Light List Accent 2"/>
     <w:basedOn w:val="12"/>
     <w:qFormat/>
@@ -4429,7 +5571,7 @@
       </w:tcPr>
     </w:tblStylePr>
   </w:style>
-  <w:style w:type="table" w:styleId="47">
+  <w:style w:type="table" w:styleId="48">
     <w:name w:val="Light List Accent 3"/>
     <w:basedOn w:val="12"/>
     <w:qFormat/>
@@ -4530,7 +5672,7 @@
       </w:tcPr>
     </w:tblStylePr>
   </w:style>
-  <w:style w:type="table" w:styleId="48">
+  <w:style w:type="table" w:styleId="49">
     <w:name w:val="Light List Accent 4"/>
     <w:basedOn w:val="12"/>
     <w:qFormat/>
@@ -4631,7 +5773,7 @@
       </w:tcPr>
     </w:tblStylePr>
   </w:style>
-  <w:style w:type="table" w:styleId="49">
+  <w:style w:type="table" w:styleId="50">
     <w:name w:val="Light List Accent 5"/>
     <w:basedOn w:val="12"/>
     <w:qFormat/>
@@ -4732,7 +5874,7 @@
       </w:tcPr>
     </w:tblStylePr>
   </w:style>
-  <w:style w:type="table" w:styleId="50">
+  <w:style w:type="table" w:styleId="51">
     <w:name w:val="Light List Accent 6"/>
     <w:basedOn w:val="12"/>
     <w:qFormat/>
@@ -4833,7 +5975,7 @@
       </w:tcPr>
     </w:tblStylePr>
   </w:style>
-  <w:style w:type="table" w:styleId="51">
+  <w:style w:type="table" w:styleId="52">
     <w:name w:val="Light Grid"/>
     <w:basedOn w:val="12"/>
     <w:qFormat/>
@@ -4978,7 +6120,7 @@
       </w:tcPr>
     </w:tblStylePr>
   </w:style>
-  <w:style w:type="table" w:styleId="52">
+  <w:style w:type="table" w:styleId="53">
     <w:name w:val="Light Grid Accent 1"/>
     <w:basedOn w:val="12"/>
     <w:qFormat/>
@@ -5123,7 +6265,7 @@
       </w:tcPr>
     </w:tblStylePr>
   </w:style>
-  <w:style w:type="table" w:styleId="53">
+  <w:style w:type="table" w:styleId="54">
     <w:name w:val="Light Grid Accent 2"/>
     <w:basedOn w:val="12"/>
     <w:qFormat/>
@@ -5268,7 +6410,7 @@
       </w:tcPr>
     </w:tblStylePr>
   </w:style>
-  <w:style w:type="table" w:styleId="54">
+  <w:style w:type="table" w:styleId="55">
     <w:name w:val="Light Grid Accent 3"/>
     <w:basedOn w:val="12"/>
     <w:qFormat/>
@@ -5413,7 +6555,7 @@
       </w:tcPr>
     </w:tblStylePr>
   </w:style>
-  <w:style w:type="table" w:styleId="55">
+  <w:style w:type="table" w:styleId="56">
     <w:name w:val="Light Grid Accent 4"/>
     <w:basedOn w:val="12"/>
     <w:qFormat/>
@@ -5558,7 +6700,7 @@
       </w:tcPr>
     </w:tblStylePr>
   </w:style>
-  <w:style w:type="table" w:styleId="56">
+  <w:style w:type="table" w:styleId="57">
     <w:name w:val="Light Grid Accent 5"/>
     <w:basedOn w:val="12"/>
     <w:qFormat/>
@@ -5703,7 +6845,7 @@
       </w:tcPr>
     </w:tblStylePr>
   </w:style>
-  <w:style w:type="table" w:styleId="57">
+  <w:style w:type="table" w:styleId="58">
     <w:name w:val="Light Grid Accent 6"/>
     <w:basedOn w:val="12"/>
     <w:qFormat/>
@@ -5848,7 +6990,7 @@
       </w:tcPr>
     </w:tblStylePr>
   </w:style>
-  <w:style w:type="table" w:styleId="58">
+  <w:style w:type="table" w:styleId="59">
     <w:name w:val="Medium Shading 1"/>
     <w:basedOn w:val="12"/>
     <w:qFormat/>
@@ -5967,7 +7109,7 @@
       </w:tcPr>
     </w:tblStylePr>
   </w:style>
-  <w:style w:type="table" w:styleId="59">
+  <w:style w:type="table" w:styleId="60">
     <w:name w:val="Medium Shading 1 Accent 1"/>
     <w:basedOn w:val="12"/>
     <w:qFormat/>
@@ -6086,7 +7228,7 @@
       </w:tcPr>
     </w:tblStylePr>
   </w:style>
-  <w:style w:type="table" w:styleId="60">
+  <w:style w:type="table" w:styleId="61">
     <w:name w:val="Medium Shading 1 Accent 2"/>
     <w:basedOn w:val="12"/>
     <w:qFormat/>
@@ -6205,7 +7347,7 @@
       </w:tcPr>
     </w:tblStylePr>
   </w:style>
-  <w:style w:type="table" w:styleId="61">
+  <w:style w:type="table" w:styleId="62">
     <w:name w:val="Medium Shading 1 Accent 3"/>
     <w:basedOn w:val="12"/>
     <w:qFormat/>
@@ -6324,7 +7466,7 @@
       </w:tcPr>
     </w:tblStylePr>
   </w:style>
-  <w:style w:type="table" w:styleId="62">
+  <w:style w:type="table" w:styleId="63">
     <w:name w:val="Medium Shading 1 Accent 4"/>
     <w:basedOn w:val="12"/>
     <w:qFormat/>
@@ -6443,7 +7585,7 @@
       </w:tcPr>
     </w:tblStylePr>
   </w:style>
-  <w:style w:type="table" w:styleId="63">
+  <w:style w:type="table" w:styleId="64">
     <w:name w:val="Medium Shading 1 Accent 5"/>
     <w:basedOn w:val="12"/>
     <w:qFormat/>
@@ -6562,7 +7704,7 @@
       </w:tcPr>
     </w:tblStylePr>
   </w:style>
-  <w:style w:type="table" w:styleId="64">
+  <w:style w:type="table" w:styleId="65">
     <w:name w:val="Medium Shading 1 Accent 6"/>
     <w:basedOn w:val="12"/>
     <w:qFormat/>
@@ -6681,7 +7823,7 @@
       </w:tcPr>
     </w:tblStylePr>
   </w:style>
-  <w:style w:type="table" w:styleId="65">
+  <w:style w:type="table" w:styleId="66">
     <w:name w:val="Medium Shading 2"/>
     <w:basedOn w:val="12"/>
     <w:qFormat/>
@@ -6845,7 +7987,7 @@
       </w:tcPr>
     </w:tblStylePr>
   </w:style>
-  <w:style w:type="table" w:styleId="66">
+  <w:style w:type="table" w:styleId="67">
     <w:name w:val="Medium Shading 2 Accent 1"/>
     <w:basedOn w:val="12"/>
     <w:qFormat/>
@@ -7009,7 +8151,7 @@
       </w:tcPr>
     </w:tblStylePr>
   </w:style>
-  <w:style w:type="table" w:styleId="67">
+  <w:style w:type="table" w:styleId="68">
     <w:name w:val="Medium Shading 2 Accent 2"/>
     <w:basedOn w:val="12"/>
     <w:qFormat/>
@@ -7173,7 +8315,7 @@
       </w:tcPr>
     </w:tblStylePr>
   </w:style>
-  <w:style w:type="table" w:styleId="68">
+  <w:style w:type="table" w:styleId="69">
     <w:name w:val="Medium Shading 2 Accent 3"/>
     <w:basedOn w:val="12"/>
     <w:qFormat/>
@@ -7337,7 +8479,7 @@
       </w:tcPr>
     </w:tblStylePr>
   </w:style>
-  <w:style w:type="table" w:styleId="69">
+  <w:style w:type="table" w:styleId="70">
     <w:name w:val="Medium Shading 2 Accent 4"/>
     <w:basedOn w:val="12"/>
     <w:qFormat/>
@@ -7501,7 +8643,7 @@
       </w:tcPr>
     </w:tblStylePr>
   </w:style>
-  <w:style w:type="table" w:styleId="70">
+  <w:style w:type="table" w:styleId="71">
     <w:name w:val="Medium Shading 2 Accent 5"/>
     <w:basedOn w:val="12"/>
     <w:qFormat/>
@@ -7665,7 +8807,7 @@
       </w:tcPr>
     </w:tblStylePr>
   </w:style>
-  <w:style w:type="table" w:styleId="71">
+  <w:style w:type="table" w:styleId="72">
     <w:name w:val="Medium Shading 2 Accent 6"/>
     <w:basedOn w:val="12"/>
     <w:uiPriority w:val="64"/>
@@ -7828,7 +8970,7 @@
       </w:tcPr>
     </w:tblStylePr>
   </w:style>
-  <w:style w:type="table" w:styleId="72">
+  <w:style w:type="table" w:styleId="73">
     <w:name w:val="Medium List 1"/>
     <w:basedOn w:val="12"/>
     <w:qFormat/>
@@ -7927,7 +9069,7 @@
       </w:tcPr>
     </w:tblStylePr>
   </w:style>
-  <w:style w:type="table" w:styleId="73">
+  <w:style w:type="table" w:styleId="74">
     <w:name w:val="Medium List 1 Accent 1"/>
     <w:basedOn w:val="12"/>
     <w:qFormat/>
@@ -8026,7 +9168,7 @@
       </w:tcPr>
     </w:tblStylePr>
   </w:style>
-  <w:style w:type="table" w:styleId="74">
+  <w:style w:type="table" w:styleId="75">
     <w:name w:val="Medium List 1 Accent 2"/>
     <w:basedOn w:val="12"/>
     <w:qFormat/>
@@ -8125,7 +9267,7 @@
       </w:tcPr>
     </w:tblStylePr>
   </w:style>
-  <w:style w:type="table" w:styleId="75">
+  <w:style w:type="table" w:styleId="76">
     <w:name w:val="Medium List 1 Accent 3"/>
     <w:basedOn w:val="12"/>
     <w:uiPriority w:val="65"/>
@@ -8223,7 +9365,7 @@
       </w:tcPr>
     </w:tblStylePr>
   </w:style>
-  <w:style w:type="table" w:styleId="76">
+  <w:style w:type="table" w:styleId="77">
     <w:name w:val="Medium List 1 Accent 4"/>
     <w:basedOn w:val="12"/>
     <w:uiPriority w:val="65"/>
@@ -8321,7 +9463,7 @@
       </w:tcPr>
     </w:tblStylePr>
   </w:style>
-  <w:style w:type="table" w:styleId="77">
+  <w:style w:type="table" w:styleId="78">
     <w:name w:val="Medium List 1 Accent 5"/>
     <w:basedOn w:val="12"/>
     <w:qFormat/>
@@ -8420,7 +9562,7 @@
       </w:tcPr>
     </w:tblStylePr>
   </w:style>
-  <w:style w:type="table" w:styleId="78">
+  <w:style w:type="table" w:styleId="79">
     <w:name w:val="Medium List 1 Accent 6"/>
     <w:basedOn w:val="12"/>
     <w:qFormat/>
@@ -8519,7 +9661,7 @@
       </w:tcPr>
     </w:tblStylePr>
   </w:style>
-  <w:style w:type="table" w:styleId="79">
+  <w:style w:type="table" w:styleId="80">
     <w:name w:val="Medium List 2"/>
     <w:basedOn w:val="12"/>
     <w:qFormat/>
@@ -8667,7 +9809,7 @@
       </w:tcPr>
     </w:tblStylePr>
   </w:style>
-  <w:style w:type="table" w:styleId="80">
+  <w:style w:type="table" w:styleId="81">
     <w:name w:val="Medium List 2 Accent 1"/>
     <w:basedOn w:val="12"/>
     <w:qFormat/>
@@ -8815,7 +9957,7 @@
       </w:tcPr>
     </w:tblStylePr>
   </w:style>
-  <w:style w:type="table" w:styleId="81">
+  <w:style w:type="table" w:styleId="82">
     <w:name w:val="Medium List 2 Accent 2"/>
     <w:basedOn w:val="12"/>
     <w:qFormat/>
@@ -8963,7 +10105,7 @@
       </w:tcPr>
     </w:tblStylePr>
   </w:style>
-  <w:style w:type="table" w:styleId="82">
+  <w:style w:type="table" w:styleId="83">
     <w:name w:val="Medium List 2 Accent 3"/>
     <w:basedOn w:val="12"/>
     <w:qFormat/>
@@ -9111,7 +10253,7 @@
       </w:tcPr>
     </w:tblStylePr>
   </w:style>
-  <w:style w:type="table" w:styleId="83">
+  <w:style w:type="table" w:styleId="84">
     <w:name w:val="Medium List 2 Accent 4"/>
     <w:basedOn w:val="12"/>
     <w:qFormat/>
@@ -9259,7 +10401,7 @@
       </w:tcPr>
     </w:tblStylePr>
   </w:style>
-  <w:style w:type="table" w:styleId="84">
+  <w:style w:type="table" w:styleId="85">
     <w:name w:val="Medium List 2 Accent 5"/>
     <w:basedOn w:val="12"/>
     <w:qFormat/>
@@ -9407,7 +10549,7 @@
       </w:tcPr>
     </w:tblStylePr>
   </w:style>
-  <w:style w:type="table" w:styleId="85">
+  <w:style w:type="table" w:styleId="86">
     <w:name w:val="Medium List 2 Accent 6"/>
     <w:basedOn w:val="12"/>
     <w:qFormat/>
@@ -9555,7 +10697,7 @@
       </w:tcPr>
     </w:tblStylePr>
   </w:style>
-  <w:style w:type="table" w:styleId="86">
+  <w:style w:type="table" w:styleId="87">
     <w:name w:val="Medium Grid 1"/>
     <w:basedOn w:val="12"/>
     <w:qFormat/>
@@ -9632,7 +10774,7 @@
       </w:tcPr>
     </w:tblStylePr>
   </w:style>
-  <w:style w:type="table" w:styleId="87">
+  <w:style w:type="table" w:styleId="88">
     <w:name w:val="Medium Grid 1 Accent 1"/>
     <w:basedOn w:val="12"/>
     <w:qFormat/>
@@ -9709,7 +10851,7 @@
       </w:tcPr>
     </w:tblStylePr>
   </w:style>
-  <w:style w:type="table" w:styleId="88">
+  <w:style w:type="table" w:styleId="89">
     <w:name w:val="Medium Grid 1 Accent 2"/>
     <w:basedOn w:val="12"/>
     <w:qFormat/>
@@ -9786,7 +10928,7 @@
       </w:tcPr>
     </w:tblStylePr>
   </w:style>
-  <w:style w:type="table" w:styleId="89">
+  <w:style w:type="table" w:styleId="90">
     <w:name w:val="Medium Grid 1 Accent 3"/>
     <w:basedOn w:val="12"/>
     <w:qFormat/>
@@ -9863,7 +11005,7 @@
       </w:tcPr>
     </w:tblStylePr>
   </w:style>
-  <w:style w:type="table" w:styleId="90">
+  <w:style w:type="table" w:styleId="91">
     <w:name w:val="Medium Grid 1 Accent 4"/>
     <w:basedOn w:val="12"/>
     <w:qFormat/>
@@ -9940,7 +11082,7 @@
       </w:tcPr>
     </w:tblStylePr>
   </w:style>
-  <w:style w:type="table" w:styleId="91">
+  <w:style w:type="table" w:styleId="92">
     <w:name w:val="Medium Grid 1 Accent 5"/>
     <w:basedOn w:val="12"/>
     <w:qFormat/>
@@ -10017,7 +11159,7 @@
       </w:tcPr>
     </w:tblStylePr>
   </w:style>
-  <w:style w:type="table" w:styleId="92">
+  <w:style w:type="table" w:styleId="93">
     <w:name w:val="Medium Grid 1 Accent 6"/>
     <w:basedOn w:val="12"/>
     <w:uiPriority w:val="67"/>
@@ -10093,7 +11235,7 @@
       </w:tcPr>
     </w:tblStylePr>
   </w:style>
-  <w:style w:type="table" w:styleId="93">
+  <w:style w:type="table" w:styleId="94">
     <w:name w:val="Medium Grid 2"/>
     <w:basedOn w:val="12"/>
     <w:qFormat/>
@@ -10227,7 +11369,7 @@
       </w:tcPr>
     </w:tblStylePr>
   </w:style>
-  <w:style w:type="table" w:styleId="94">
+  <w:style w:type="table" w:styleId="95">
     <w:name w:val="Medium Grid 2 Accent 1"/>
     <w:basedOn w:val="12"/>
     <w:uiPriority w:val="68"/>
@@ -10360,7 +11502,7 @@
       </w:tcPr>
     </w:tblStylePr>
   </w:style>
-  <w:style w:type="table" w:styleId="95">
+  <w:style w:type="table" w:styleId="96">
     <w:name w:val="Medium Grid 2 Accent 2"/>
     <w:basedOn w:val="12"/>
     <w:uiPriority w:val="68"/>
@@ -10493,7 +11635,7 @@
       </w:tcPr>
     </w:tblStylePr>
   </w:style>
-  <w:style w:type="table" w:styleId="96">
+  <w:style w:type="table" w:styleId="97">
     <w:name w:val="Medium Grid 2 Accent 3"/>
     <w:basedOn w:val="12"/>
     <w:uiPriority w:val="68"/>
@@ -10626,7 +11768,7 @@
       </w:tcPr>
     </w:tblStylePr>
   </w:style>
-  <w:style w:type="table" w:styleId="97">
+  <w:style w:type="table" w:styleId="98">
     <w:name w:val="Medium Grid 2 Accent 4"/>
     <w:basedOn w:val="12"/>
     <w:uiPriority w:val="68"/>
@@ -10759,7 +11901,7 @@
       </w:tcPr>
     </w:tblStylePr>
   </w:style>
-  <w:style w:type="table" w:styleId="98">
+  <w:style w:type="table" w:styleId="99">
     <w:name w:val="Medium Grid 2 Accent 5"/>
     <w:basedOn w:val="12"/>
     <w:uiPriority w:val="68"/>
@@ -10892,7 +12034,7 @@
       </w:tcPr>
     </w:tblStylePr>
   </w:style>
-  <w:style w:type="table" w:styleId="99">
+  <w:style w:type="table" w:styleId="100">
     <w:name w:val="Medium Grid 2 Accent 6"/>
     <w:basedOn w:val="12"/>
     <w:uiPriority w:val="68"/>
@@ -11025,7 +12167,7 @@
       </w:tcPr>
     </w:tblStylePr>
   </w:style>
-  <w:style w:type="table" w:styleId="100">
+  <w:style w:type="table" w:styleId="101">
     <w:name w:val="Medium Grid 3"/>
     <w:basedOn w:val="12"/>
     <w:uiPriority w:val="69"/>
@@ -11176,7 +12318,7 @@
       </w:tcPr>
     </w:tblStylePr>
   </w:style>
-  <w:style w:type="table" w:styleId="101">
+  <w:style w:type="table" w:styleId="102">
     <w:name w:val="Medium Grid 3 Accent 1"/>
     <w:basedOn w:val="12"/>
     <w:uiPriority w:val="69"/>
@@ -11327,7 +12469,7 @@
       </w:tcPr>
     </w:tblStylePr>
   </w:style>
-  <w:style w:type="table" w:styleId="102">
+  <w:style w:type="table" w:styleId="103">
     <w:name w:val="Medium Grid 3 Accent 2"/>
     <w:basedOn w:val="12"/>
     <w:uiPriority w:val="69"/>
@@ -11478,7 +12620,7 @@
       </w:tcPr>
     </w:tblStylePr>
   </w:style>
-  <w:style w:type="table" w:styleId="103">
+  <w:style w:type="table" w:styleId="104">
     <w:name w:val="Medium Grid 3 Accent 3"/>
     <w:basedOn w:val="12"/>
     <w:uiPriority w:val="69"/>
@@ -11629,7 +12771,7 @@
       </w:tcPr>
     </w:tblStylePr>
   </w:style>
-  <w:style w:type="table" w:styleId="104">
+  <w:style w:type="table" w:styleId="105">
     <w:name w:val="Medium Grid 3 Accent 4"/>
     <w:basedOn w:val="12"/>
     <w:uiPriority w:val="69"/>
@@ -11780,7 +12922,7 @@
       </w:tcPr>
     </w:tblStylePr>
   </w:style>
-  <w:style w:type="table" w:styleId="105">
+  <w:style w:type="table" w:styleId="106">
     <w:name w:val="Medium Grid 3 Accent 5"/>
     <w:basedOn w:val="12"/>
     <w:uiPriority w:val="69"/>
@@ -11931,7 +13073,7 @@
       </w:tcPr>
     </w:tblStylePr>
   </w:style>
-  <w:style w:type="table" w:styleId="106">
+  <w:style w:type="table" w:styleId="107">
     <w:name w:val="Medium Grid 3 Accent 6"/>
     <w:basedOn w:val="12"/>
     <w:uiPriority w:val="69"/>
@@ -12082,7 +13224,7 @@
       </w:tcPr>
     </w:tblStylePr>
   </w:style>
-  <w:style w:type="table" w:styleId="107">
+  <w:style w:type="table" w:styleId="108">
     <w:name w:val="Dark List"/>
     <w:basedOn w:val="12"/>
     <w:uiPriority w:val="70"/>
@@ -12204,7 +13346,7 @@
       </w:tcPr>
     </w:tblStylePr>
   </w:style>
-  <w:style w:type="table" w:styleId="108">
+  <w:style w:type="table" w:styleId="109">
     <w:name w:val="Dark List Accent 1"/>
     <w:basedOn w:val="12"/>
     <w:qFormat/>
@@ -12327,7 +13469,7 @@
       </w:tcPr>
     </w:tblStylePr>
   </w:style>
-  <w:style w:type="table" w:styleId="109">
+  <w:style w:type="table" w:styleId="110">
     <w:name w:val="Dark List Accent 2"/>
     <w:basedOn w:val="12"/>
     <w:uiPriority w:val="70"/>
@@ -12449,7 +13591,7 @@
       </w:tcPr>
     </w:tblStylePr>
   </w:style>
-  <w:style w:type="table" w:styleId="110">
+  <w:style w:type="table" w:styleId="111">
     <w:name w:val="Dark List Accent 3"/>
     <w:basedOn w:val="12"/>
     <w:uiPriority w:val="70"/>
@@ -12571,7 +13713,7 @@
       </w:tcPr>
     </w:tblStylePr>
   </w:style>
-  <w:style w:type="table" w:styleId="111">
+  <w:style w:type="table" w:styleId="112">
     <w:name w:val="Dark List Accent 4"/>
     <w:basedOn w:val="12"/>
     <w:uiPriority w:val="70"/>
@@ -12693,7 +13835,7 @@
       </w:tcPr>
     </w:tblStylePr>
   </w:style>
-  <w:style w:type="table" w:styleId="112">
+  <w:style w:type="table" w:styleId="113">
     <w:name w:val="Dark List Accent 5"/>
     <w:basedOn w:val="12"/>
     <w:uiPriority w:val="70"/>
@@ -12815,7 +13957,7 @@
       </w:tcPr>
     </w:tblStylePr>
   </w:style>
-  <w:style w:type="table" w:styleId="113">
+  <w:style w:type="table" w:styleId="114">
     <w:name w:val="Dark List Accent 6"/>
     <w:basedOn w:val="12"/>
     <w:uiPriority w:val="70"/>
@@ -12937,7 +14079,7 @@
       </w:tcPr>
     </w:tblStylePr>
   </w:style>
-  <w:style w:type="table" w:styleId="114">
+  <w:style w:type="table" w:styleId="115">
     <w:name w:val="Colorful Shading"/>
     <w:basedOn w:val="12"/>
     <w:uiPriority w:val="71"/>
@@ -13068,7 +14210,7 @@
       </w:rPr>
     </w:tblStylePr>
   </w:style>
-  <w:style w:type="table" w:styleId="115">
+  <w:style w:type="table" w:styleId="116">
     <w:name w:val="Colorful Shading Accent 1"/>
     <w:basedOn w:val="12"/>
     <w:uiPriority w:val="71"/>
@@ -13199,7 +14341,7 @@
       </w:rPr>
     </w:tblStylePr>
   </w:style>
-  <w:style w:type="table" w:styleId="116">
+  <w:style w:type="table" w:styleId="117">
     <w:name w:val="Colorful Shading Accent 2"/>
     <w:basedOn w:val="12"/>
     <w:uiPriority w:val="71"/>
@@ -13330,7 +14472,7 @@
       </w:rPr>
     </w:tblStylePr>
   </w:style>
-  <w:style w:type="table" w:styleId="117">
+  <w:style w:type="table" w:styleId="118">
     <w:name w:val="Colorful Shading Accent 3"/>
     <w:basedOn w:val="12"/>
     <w:qFormat/>
@@ -13452,7 +14594,7 @@
       </w:tcPr>
     </w:tblStylePr>
   </w:style>
-  <w:style w:type="table" w:styleId="118">
+  <w:style w:type="table" w:styleId="119">
     <w:name w:val="Colorful Shading Accent 4"/>
     <w:basedOn w:val="12"/>
     <w:uiPriority w:val="71"/>
@@ -13583,7 +14725,7 @@
       </w:rPr>
     </w:tblStylePr>
   </w:style>
-  <w:style w:type="table" w:styleId="119">
+  <w:style w:type="table" w:styleId="120">
     <w:name w:val="Colorful Shading Accent 5"/>
     <w:basedOn w:val="12"/>
     <w:uiPriority w:val="71"/>
@@ -13714,7 +14856,7 @@
       </w:rPr>
     </w:tblStylePr>
   </w:style>
-  <w:style w:type="table" w:styleId="120">
+  <w:style w:type="table" w:styleId="121">
     <w:name w:val="Colorful Shading Accent 6"/>
     <w:basedOn w:val="12"/>
     <w:uiPriority w:val="71"/>
@@ -13845,7 +14987,7 @@
       </w:rPr>
     </w:tblStylePr>
   </w:style>
-  <w:style w:type="table" w:styleId="121">
+  <w:style w:type="table" w:styleId="122">
     <w:name w:val="Colorful List"/>
     <w:basedOn w:val="12"/>
     <w:uiPriority w:val="72"/>
@@ -13943,9 +15085,10 @@
       </w:tcPr>
     </w:tblStylePr>
   </w:style>
-  <w:style w:type="table" w:styleId="122">
+  <w:style w:type="table" w:styleId="123">
     <w:name w:val="Colorful List Accent 1"/>
     <w:basedOn w:val="12"/>
+    <w:qFormat/>
     <w:uiPriority w:val="72"/>
     <w:pPr>
       <w:spacing w:after="0" w:line="240" w:lineRule="auto"/>
@@ -14041,7 +15184,7 @@
       </w:tcPr>
     </w:tblStylePr>
   </w:style>
-  <w:style w:type="table" w:styleId="123">
+  <w:style w:type="table" w:styleId="124">
     <w:name w:val="Colorful List Accent 2"/>
     <w:basedOn w:val="12"/>
     <w:uiPriority w:val="72"/>
@@ -14139,7 +15282,7 @@
       </w:tcPr>
     </w:tblStylePr>
   </w:style>
-  <w:style w:type="table" w:styleId="124">
+  <w:style w:type="table" w:styleId="125">
     <w:name w:val="Colorful List Accent 3"/>
     <w:basedOn w:val="12"/>
     <w:uiPriority w:val="72"/>
@@ -14237,7 +15380,7 @@
       </w:tcPr>
     </w:tblStylePr>
   </w:style>
-  <w:style w:type="table" w:styleId="125">
+  <w:style w:type="table" w:styleId="126">
     <w:name w:val="Colorful List Accent 4"/>
     <w:basedOn w:val="12"/>
     <w:uiPriority w:val="72"/>
@@ -14335,7 +15478,7 @@
       </w:tcPr>
     </w:tblStylePr>
   </w:style>
-  <w:style w:type="table" w:styleId="126">
+  <w:style w:type="table" w:styleId="127">
     <w:name w:val="Colorful List Accent 5"/>
     <w:basedOn w:val="12"/>
     <w:qFormat/>
@@ -14434,7 +15577,7 @@
       </w:tcPr>
     </w:tblStylePr>
   </w:style>
-  <w:style w:type="table" w:styleId="127">
+  <w:style w:type="table" w:styleId="128">
     <w:name w:val="Colorful List Accent 6"/>
     <w:basedOn w:val="12"/>
     <w:qFormat/>
@@ -14533,7 +15676,7 @@
       </w:tcPr>
     </w:tblStylePr>
   </w:style>
-  <w:style w:type="table" w:styleId="128">
+  <w:style w:type="table" w:styleId="129">
     <w:name w:val="Colorful Grid"/>
     <w:basedOn w:val="12"/>
     <w:qFormat/>
@@ -14610,7 +15753,7 @@
       </w:tcPr>
     </w:tblStylePr>
   </w:style>
-  <w:style w:type="table" w:styleId="129">
+  <w:style w:type="table" w:styleId="130">
     <w:name w:val="Colorful Grid Accent 1"/>
     <w:basedOn w:val="12"/>
     <w:uiPriority w:val="73"/>
@@ -14686,7 +15829,7 @@
       </w:tcPr>
     </w:tblStylePr>
   </w:style>
-  <w:style w:type="table" w:styleId="130">
+  <w:style w:type="table" w:styleId="131">
     <w:name w:val="Colorful Grid Accent 2"/>
     <w:basedOn w:val="12"/>
     <w:qFormat/>
@@ -14763,7 +15906,7 @@
       </w:tcPr>
     </w:tblStylePr>
   </w:style>
-  <w:style w:type="table" w:styleId="131">
+  <w:style w:type="table" w:styleId="132">
     <w:name w:val="Colorful Grid Accent 3"/>
     <w:basedOn w:val="12"/>
     <w:qFormat/>
@@ -14840,9 +15983,10 @@
       </w:tcPr>
     </w:tblStylePr>
   </w:style>
-  <w:style w:type="table" w:styleId="132">
+  <w:style w:type="table" w:styleId="133">
     <w:name w:val="Colorful Grid Accent 4"/>
     <w:basedOn w:val="12"/>
+    <w:qFormat/>
     <w:uiPriority w:val="73"/>
     <w:pPr>
       <w:spacing w:after="0" w:line="240" w:lineRule="auto"/>
@@ -14916,9 +16060,10 @@
       </w:tcPr>
     </w:tblStylePr>
   </w:style>
-  <w:style w:type="table" w:styleId="133">
+  <w:style w:type="table" w:styleId="134">
     <w:name w:val="Colorful Grid Accent 5"/>
     <w:basedOn w:val="12"/>
+    <w:qFormat/>
     <w:uiPriority w:val="73"/>
     <w:pPr>
       <w:spacing w:after="0" w:line="240" w:lineRule="auto"/>
@@ -14992,9 +16137,10 @@
       </w:tcPr>
     </w:tblStylePr>
   </w:style>
-  <w:style w:type="table" w:styleId="134">
+  <w:style w:type="table" w:styleId="135">
     <w:name w:val="Colorful Grid Accent 6"/>
     <w:basedOn w:val="12"/>
+    <w:qFormat/>
     <w:uiPriority w:val="73"/>
     <w:pPr>
       <w:spacing w:after="0" w:line="240" w:lineRule="auto"/>
@@ -15068,7 +16214,7 @@
       </w:tcPr>
     </w:tblStylePr>
   </w:style>
-  <w:style w:type="character" w:customStyle="1" w:styleId="135">
+  <w:style w:type="character" w:customStyle="1" w:styleId="136">
     <w:name w:val="Heading 1 Char_27c517af-0d7b-4c74-ac54-11de573f3aff"/>
     <w:basedOn w:val="11"/>
     <w:link w:val="2"/>
@@ -15083,7 +16229,7 @@
       <w:szCs w:val="28"/>
     </w:rPr>
   </w:style>
-  <w:style w:type="character" w:customStyle="1" w:styleId="136">
+  <w:style w:type="character" w:customStyle="1" w:styleId="137">
     <w:name w:val="Heading 2 Char_fcb64a40-013f-4a3c-970b-7e2519092441"/>
     <w:basedOn w:val="11"/>
     <w:link w:val="3"/>
@@ -15098,7 +16244,7 @@
       <w:szCs w:val="26"/>
     </w:rPr>
   </w:style>
-  <w:style w:type="character" w:customStyle="1" w:styleId="137">
+  <w:style w:type="character" w:customStyle="1" w:styleId="138">
     <w:name w:val="Heading 3 Char_241e7807-7ee7-4dee-972e-5acf74e8e26f"/>
     <w:basedOn w:val="11"/>
     <w:link w:val="4"/>
@@ -15111,7 +16257,7 @@
       <w:color w:val="4F81BD"/>
     </w:rPr>
   </w:style>
-  <w:style w:type="character" w:customStyle="1" w:styleId="138">
+  <w:style w:type="character" w:customStyle="1" w:styleId="139">
     <w:name w:val="Heading 4 Char_31330160-c2c9-4c45-b6e1-c8c8af66e22b"/>
     <w:basedOn w:val="11"/>
     <w:link w:val="5"/>
@@ -15126,7 +16272,7 @@
       <w:color w:val="4F81BD"/>
     </w:rPr>
   </w:style>
-  <w:style w:type="character" w:customStyle="1" w:styleId="139">
+  <w:style w:type="character" w:customStyle="1" w:styleId="140">
     <w:name w:val="Heading 5 Char_5b864f3d-67d6-4051-8318-bf5b5944fa06"/>
     <w:basedOn w:val="11"/>
     <w:link w:val="6"/>
@@ -15137,7 +16283,7 @@
       <w:color w:val="243F60"/>
     </w:rPr>
   </w:style>
-  <w:style w:type="character" w:customStyle="1" w:styleId="140">
+  <w:style w:type="character" w:customStyle="1" w:styleId="141">
     <w:name w:val="Heading 6 Char_43ca52ef-899d-4be9-94cb-d35b3dfee49d"/>
     <w:basedOn w:val="11"/>
     <w:link w:val="7"/>
@@ -15150,7 +16296,7 @@
       <w:color w:val="243F60"/>
     </w:rPr>
   </w:style>
-  <w:style w:type="character" w:customStyle="1" w:styleId="141">
+  <w:style w:type="character" w:customStyle="1" w:styleId="142">
     <w:name w:val="Heading 7 Char_4367f9ce-55e6-461d-97c6-aac208e45bf5"/>
     <w:basedOn w:val="11"/>
     <w:link w:val="8"/>
@@ -15163,7 +16309,7 @@
       <w:color w:val="404040"/>
     </w:rPr>
   </w:style>
-  <w:style w:type="character" w:customStyle="1" w:styleId="142">
+  <w:style w:type="character" w:customStyle="1" w:styleId="143">
     <w:name w:val="Heading 8 Char_e4d4926b-4224-45f8-bb8f-9a5842df50bf"/>
     <w:basedOn w:val="11"/>
     <w:link w:val="9"/>
@@ -15176,7 +16322,7 @@
       <w:szCs w:val="20"/>
     </w:rPr>
   </w:style>
-  <w:style w:type="character" w:customStyle="1" w:styleId="143">
+  <w:style w:type="character" w:customStyle="1" w:styleId="144">
     <w:name w:val="Heading 9 Char_a39aad18-f1ef-45aa-8522-c9912549b56a"/>
     <w:basedOn w:val="11"/>
     <w:link w:val="10"/>
@@ -15191,21 +16337,21 @@
       <w:szCs w:val="20"/>
     </w:rPr>
   </w:style>
-  <w:style w:type="character" w:customStyle="1" w:styleId="144">
+  <w:style w:type="character" w:customStyle="1" w:styleId="145">
     <w:name w:val="Body Text Char"/>
     <w:basedOn w:val="11"/>
     <w:link w:val="13"/>
     <w:qFormat/>
     <w:uiPriority w:val="99"/>
   </w:style>
-  <w:style w:type="character" w:customStyle="1" w:styleId="145">
+  <w:style w:type="character" w:customStyle="1" w:styleId="146">
     <w:name w:val="Body Text 2 Char"/>
     <w:basedOn w:val="11"/>
     <w:link w:val="14"/>
     <w:qFormat/>
     <w:uiPriority w:val="99"/>
   </w:style>
-  <w:style w:type="character" w:customStyle="1" w:styleId="146">
+  <w:style w:type="character" w:customStyle="1" w:styleId="147">
     <w:name w:val="Body Text 3 Char"/>
     <w:basedOn w:val="11"/>
     <w:link w:val="15"/>
@@ -15216,21 +16362,21 @@
       <w:szCs w:val="16"/>
     </w:rPr>
   </w:style>
-  <w:style w:type="character" w:customStyle="1" w:styleId="147">
+  <w:style w:type="character" w:customStyle="1" w:styleId="148">
     <w:name w:val="Footer Char_f1ee2f9d-fe21-4007-98ce-f7155ad63983"/>
     <w:basedOn w:val="11"/>
     <w:link w:val="18"/>
     <w:qFormat/>
     <w:uiPriority w:val="99"/>
   </w:style>
-  <w:style w:type="character" w:customStyle="1" w:styleId="148">
+  <w:style w:type="character" w:customStyle="1" w:styleId="149">
     <w:name w:val="Header Char_74daa4a4-0927-416e-aa6f-ed151e17381f"/>
     <w:basedOn w:val="11"/>
     <w:link w:val="19"/>
     <w:qFormat/>
     <w:uiPriority w:val="99"/>
   </w:style>
-  <w:style w:type="character" w:customStyle="1" w:styleId="149">
+  <w:style w:type="character" w:customStyle="1" w:styleId="150">
     <w:name w:val="Macro Text Char"/>
     <w:basedOn w:val="11"/>
     <w:link w:val="32"/>
@@ -15242,10 +16388,10 @@
       <w:szCs w:val="20"/>
     </w:rPr>
   </w:style>
-  <w:style w:type="character" w:customStyle="1" w:styleId="150">
+  <w:style w:type="character" w:customStyle="1" w:styleId="151">
     <w:name w:val="Subtitle Char"/>
     <w:basedOn w:val="11"/>
-    <w:link w:val="34"/>
+    <w:link w:val="35"/>
     <w:qFormat/>
     <w:uiPriority w:val="11"/>
     <w:rPr>
@@ -15258,10 +16404,10 @@
       <w:szCs w:val="24"/>
     </w:rPr>
   </w:style>
-  <w:style w:type="character" w:customStyle="1" w:styleId="151">
+  <w:style w:type="character" w:customStyle="1" w:styleId="152">
     <w:name w:val="Title Char_40a54d3f-70ef-4743-a6a3-13a2377cd4a3"/>
     <w:basedOn w:val="11"/>
-    <w:link w:val="36"/>
+    <w:link w:val="37"/>
     <w:qFormat/>
     <w:uiPriority w:val="10"/>
     <w:rPr>
@@ -15273,7 +16419,7 @@
       <w:szCs w:val="52"/>
     </w:rPr>
   </w:style>
-  <w:style w:type="paragraph" w:styleId="152">
+  <w:style w:type="paragraph" w:styleId="153">
     <w:name w:val="No Spacing"/>
     <w:qFormat/>
     <w:uiPriority w:val="1"/>
@@ -15287,7 +16433,7 @@
       <w:lang w:val="en-US" w:eastAsia="en-US" w:bidi="ar-SA"/>
     </w:rPr>
   </w:style>
-  <w:style w:type="paragraph" w:styleId="153">
+  <w:style w:type="paragraph" w:styleId="154">
     <w:name w:val="List Paragraph"/>
     <w:basedOn w:val="1"/>
     <w:qFormat/>
@@ -15297,10 +16443,22 @@
       <w:contextualSpacing/>
     </w:pPr>
   </w:style>
-  <w:style w:type="paragraph" w:styleId="154">
+  <w:style w:type="paragraph" w:styleId="155">
     <w:name w:val="Quote"/>
     <w:basedOn w:val="1"/>
     <w:next w:val="1"/>
+    <w:link w:val="156"/>
+    <w:qFormat/>
+    <w:uiPriority w:val="29"/>
+    <w:rPr>
+      <w:i/>
+      <w:iCs/>
+      <w:color w:val="000000"/>
+    </w:rPr>
+  </w:style>
+  <w:style w:type="character" w:customStyle="1" w:styleId="156">
+    <w:name w:val="Quote Char_69b877f9-4e71-403d-be1e-4746c1ca131c"/>
+    <w:basedOn w:val="11"/>
     <w:link w:val="155"/>
     <w:qFormat/>
     <w:uiPriority w:val="29"/>
@@ -15310,23 +16468,11 @@
       <w:color w:val="000000"/>
     </w:rPr>
   </w:style>
-  <w:style w:type="character" w:customStyle="1" w:styleId="155">
-    <w:name w:val="Quote Char_69b877f9-4e71-403d-be1e-4746c1ca131c"/>
-    <w:basedOn w:val="11"/>
-    <w:link w:val="154"/>
-    <w:qFormat/>
-    <w:uiPriority w:val="29"/>
-    <w:rPr>
-      <w:i/>
-      <w:iCs/>
-      <w:color w:val="000000"/>
-    </w:rPr>
-  </w:style>
-  <w:style w:type="paragraph" w:styleId="156">
+  <w:style w:type="paragraph" w:styleId="157">
     <w:name w:val="Intense Quote"/>
     <w:basedOn w:val="1"/>
     <w:next w:val="1"/>
-    <w:link w:val="157"/>
+    <w:link w:val="158"/>
     <w:qFormat/>
     <w:uiPriority w:val="30"/>
     <w:pPr>
@@ -15344,10 +16490,10 @@
       <w:color w:val="4F81BD"/>
     </w:rPr>
   </w:style>
-  <w:style w:type="character" w:customStyle="1" w:styleId="157">
+  <w:style w:type="character" w:customStyle="1" w:styleId="158">
     <w:name w:val="Intense Quote Char_d07739d3-c3d3-4bb0-86aa-841912226a2f"/>
     <w:basedOn w:val="11"/>
-    <w:link w:val="156"/>
+    <w:link w:val="157"/>
     <w:qFormat/>
     <w:uiPriority w:val="30"/>
     <w:rPr>
@@ -15358,7 +16504,7 @@
       <w:color w:val="4F81BD"/>
     </w:rPr>
   </w:style>
-  <w:style w:type="character" w:customStyle="1" w:styleId="158">
+  <w:style w:type="character" w:customStyle="1" w:styleId="159">
     <w:name w:val="Subtle Emphasis"/>
     <w:basedOn w:val="11"/>
     <w:qFormat/>
@@ -15369,7 +16515,7 @@
       <w:color w:val="808080"/>
     </w:rPr>
   </w:style>
-  <w:style w:type="character" w:customStyle="1" w:styleId="159">
+  <w:style w:type="character" w:customStyle="1" w:styleId="160">
     <w:name w:val="Intense Emphasis"/>
     <w:basedOn w:val="11"/>
     <w:qFormat/>
@@ -15382,7 +16528,7 @@
       <w:color w:val="4F81BD"/>
     </w:rPr>
   </w:style>
-  <w:style w:type="character" w:customStyle="1" w:styleId="160">
+  <w:style w:type="character" w:customStyle="1" w:styleId="161">
     <w:name w:val="Subtle Reference"/>
     <w:basedOn w:val="11"/>
     <w:qFormat/>
@@ -15393,7 +16539,7 @@
       <w:u w:val="single"/>
     </w:rPr>
   </w:style>
-  <w:style w:type="character" w:customStyle="1" w:styleId="161">
+  <w:style w:type="character" w:customStyle="1" w:styleId="162">
     <w:name w:val="Intense Reference"/>
     <w:basedOn w:val="11"/>
     <w:qFormat/>
@@ -15407,7 +16553,7 @@
       <w:u w:val="single"/>
     </w:rPr>
   </w:style>
-  <w:style w:type="character" w:customStyle="1" w:styleId="162">
+  <w:style w:type="character" w:customStyle="1" w:styleId="163">
     <w:name w:val="Book Title"/>
     <w:basedOn w:val="11"/>
     <w:qFormat/>
@@ -15419,7 +16565,7 @@
       <w:spacing w:val="5"/>
     </w:rPr>
   </w:style>
-  <w:style w:type="paragraph" w:customStyle="1" w:styleId="163">
+  <w:style w:type="paragraph" w:customStyle="1" w:styleId="164">
     <w:name w:val="TOC Heading"/>
     <w:basedOn w:val="2"/>
     <w:next w:val="1"/>

</xml_diff>

<commit_message>
Documentation: completed semester project tracking log and end-of-semester reflection
</commit_message>
<xml_diff>
--- a/Logbook.docx
+++ b/Logbook.docx
@@ -1,6 +1,6 @@
 
 <file path=word/document.xml><?xml version="1.0" encoding="utf-8"?>
-<w:document xmlns:wpc="http://schemas.microsoft.com/office/word/2010/wordprocessingCanvas" xmlns:mc="http://schemas.openxmlformats.org/markup-compatibility/2006" xmlns:o="urn:schemas-microsoft-com:office:office" xmlns:r="http://schemas.openxmlformats.org/officeDocument/2006/relationships" xmlns:m="http://schemas.openxmlformats.org/officeDocument/2006/math" xmlns:v="urn:schemas-microsoft-com:vml" xmlns:wp14="http://schemas.microsoft.com/office/word/2010/wordprocessingDrawing" xmlns:wp="http://schemas.openxmlformats.org/drawingml/2006/wordprocessingDrawing" xmlns:w="http://schemas.openxmlformats.org/wordprocessingml/2006/main" xmlns:w14="http://schemas.microsoft.com/office/word/2010/wordml" xmlns:w10="urn:schemas-microsoft-com:office:word" xmlns:w15="http://schemas.microsoft.com/office/word/2012/wordml" xmlns:wpg="http://schemas.microsoft.com/office/word/2010/wordprocessingGroup" xmlns:wpi="http://schemas.microsoft.com/office/word/2010/wordprocessingInk" xmlns:wne="http://schemas.microsoft.com/office/word/2006/wordml" xmlns:wps="http://schemas.microsoft.com/office/word/2010/wordprocessingShape" xmlns:wpsCustomData="http://www.wps.cn/officeDocument/2013/wpsCustomData" mc:Ignorable="w14 w15 wp14">
+<w:document xmlns:wpc="http://schemas.microsoft.com/office/word/2010/wordprocessingCanvas" xmlns:cx="http://schemas.microsoft.com/office/drawing/2014/chartex" xmlns:cx1="http://schemas.microsoft.com/office/drawing/2015/9/8/chartex" xmlns:cx2="http://schemas.microsoft.com/office/drawing/2015/10/21/chartex" xmlns:cx3="http://schemas.microsoft.com/office/drawing/2016/5/9/chartex" xmlns:cx4="http://schemas.microsoft.com/office/drawing/2016/5/10/chartex" xmlns:cx5="http://schemas.microsoft.com/office/drawing/2016/5/11/chartex" xmlns:cx6="http://schemas.microsoft.com/office/drawing/2016/5/12/chartex" xmlns:cx7="http://schemas.microsoft.com/office/drawing/2016/5/13/chartex" xmlns:cx8="http://schemas.microsoft.com/office/drawing/2016/5/14/chartex" xmlns:mc="http://schemas.openxmlformats.org/markup-compatibility/2006" xmlns:o="urn:schemas-microsoft-com:office:office" xmlns:r="http://schemas.openxmlformats.org/officeDocument/2006/relationships" xmlns:m="http://schemas.openxmlformats.org/officeDocument/2006/math" xmlns:v="urn:schemas-microsoft-com:vml" xmlns:wp14="http://schemas.microsoft.com/office/word/2010/wordprocessingDrawing" xmlns:wp="http://schemas.openxmlformats.org/drawingml/2006/wordprocessingDrawing" xmlns:w="http://schemas.openxmlformats.org/wordprocessingml/2006/main" xmlns:w14="http://schemas.microsoft.com/office/word/2010/wordml" xmlns:w10="urn:schemas-microsoft-com:office:word" xmlns:w15="http://schemas.microsoft.com/office/word/2012/wordml" xmlns:wpg="http://schemas.microsoft.com/office/word/2010/wordprocessingGroup" xmlns:wpi="http://schemas.microsoft.com/office/word/2010/wordprocessingInk" xmlns:wne="http://schemas.microsoft.com/office/word/2006/wordml" xmlns:wps="http://schemas.microsoft.com/office/word/2010/wordprocessingShape" xmlns:wpsCustomData="http://www.wps.cn/officeDocument/2013/wpsCustomData" mc:Ignorable="w14 w15 wp14">
   <w:body>
     <w:p>
       <w:pPr>
@@ -767,7 +767,6 @@
           <w:lang w:val="en-US"/>
         </w:rPr>
       </w:pPr>
-      <w:bookmarkStart w:id="0" w:name="_GoBack"/>
     </w:p>
     <w:p>
       <w:pPr>
@@ -776,7 +775,6 @@
         </w:rPr>
       </w:pPr>
     </w:p>
-    <w:bookmarkEnd w:id="0"/>
     <w:p>
       <w:pPr>
         <w:pStyle w:val="2"/>
@@ -3093,6 +3091,86 @@
     </w:p>
     <w:p>
       <w:r>
+        <w:drawing>
+          <wp:inline distT="0" distB="0" distL="114300" distR="114300">
+            <wp:extent cx="5524500" cy="2948940"/>
+            <wp:effectExtent l="0" t="0" r="0" b="3810"/>
+            <wp:docPr id="19" name="Picture 19" descr="keyboard failures"/>
+            <wp:cNvGraphicFramePr>
+              <a:graphicFrameLocks xmlns:a="http://schemas.openxmlformats.org/drawingml/2006/main" noChangeAspect="1"/>
+            </wp:cNvGraphicFramePr>
+            <a:graphic xmlns:a="http://schemas.openxmlformats.org/drawingml/2006/main">
+              <a:graphicData uri="http://schemas.openxmlformats.org/drawingml/2006/picture">
+                <pic:pic xmlns:pic="http://schemas.openxmlformats.org/drawingml/2006/picture">
+                  <pic:nvPicPr>
+                    <pic:cNvPr id="19" name="Picture 19" descr="keyboard failures"/>
+                    <pic:cNvPicPr>
+                      <a:picLocks noChangeAspect="1"/>
+                    </pic:cNvPicPr>
+                  </pic:nvPicPr>
+                  <pic:blipFill>
+                    <a:blip r:embed="rId30"/>
+                    <a:stretch>
+                      <a:fillRect/>
+                    </a:stretch>
+                  </pic:blipFill>
+                  <pic:spPr>
+                    <a:xfrm>
+                      <a:off x="0" y="0"/>
+                      <a:ext cx="5524500" cy="2948940"/>
+                    </a:xfrm>
+                    <a:prstGeom prst="rect">
+                      <a:avLst/>
+                    </a:prstGeom>
+                  </pic:spPr>
+                </pic:pic>
+              </a:graphicData>
+            </a:graphic>
+          </wp:inline>
+        </w:drawing>
+      </w:r>
+    </w:p>
+    <w:p>
+      <w:r>
+        <w:drawing>
+          <wp:inline distT="0" distB="0" distL="114300" distR="114300">
+            <wp:extent cx="5486400" cy="2948940"/>
+            <wp:effectExtent l="0" t="0" r="0" b="3810"/>
+            <wp:docPr id="26" name="Picture 26" descr="keyboard test passed"/>
+            <wp:cNvGraphicFramePr>
+              <a:graphicFrameLocks xmlns:a="http://schemas.openxmlformats.org/drawingml/2006/main" noChangeAspect="1"/>
+            </wp:cNvGraphicFramePr>
+            <a:graphic xmlns:a="http://schemas.openxmlformats.org/drawingml/2006/main">
+              <a:graphicData uri="http://schemas.openxmlformats.org/drawingml/2006/picture">
+                <pic:pic xmlns:pic="http://schemas.openxmlformats.org/drawingml/2006/picture">
+                  <pic:nvPicPr>
+                    <pic:cNvPr id="26" name="Picture 26" descr="keyboard test passed"/>
+                    <pic:cNvPicPr>
+                      <a:picLocks noChangeAspect="1"/>
+                    </pic:cNvPicPr>
+                  </pic:nvPicPr>
+                  <pic:blipFill>
+                    <a:blip r:embed="rId31"/>
+                    <a:stretch>
+                      <a:fillRect/>
+                    </a:stretch>
+                  </pic:blipFill>
+                  <pic:spPr>
+                    <a:xfrm>
+                      <a:off x="0" y="0"/>
+                      <a:ext cx="5486400" cy="2948940"/>
+                    </a:xfrm>
+                    <a:prstGeom prst="rect">
+                      <a:avLst/>
+                    </a:prstGeom>
+                  </pic:spPr>
+                </pic:pic>
+              </a:graphicData>
+            </a:graphic>
+          </wp:inline>
+        </w:drawing>
+      </w:r>
+      <w:r>
         <w:br w:type="textWrapping"/>
       </w:r>
       <w:r>
@@ -3121,6 +3199,86 @@
     </w:p>
     <w:p>
       <w:r>
+        <w:drawing>
+          <wp:inline distT="0" distB="0" distL="114300" distR="114300">
+            <wp:extent cx="5486400" cy="2948940"/>
+            <wp:effectExtent l="0" t="0" r="0" b="3810"/>
+            <wp:docPr id="27" name="Picture 27" descr="register page"/>
+            <wp:cNvGraphicFramePr>
+              <a:graphicFrameLocks xmlns:a="http://schemas.openxmlformats.org/drawingml/2006/main" noChangeAspect="1"/>
+            </wp:cNvGraphicFramePr>
+            <a:graphic xmlns:a="http://schemas.openxmlformats.org/drawingml/2006/main">
+              <a:graphicData uri="http://schemas.openxmlformats.org/drawingml/2006/picture">
+                <pic:pic xmlns:pic="http://schemas.openxmlformats.org/drawingml/2006/picture">
+                  <pic:nvPicPr>
+                    <pic:cNvPr id="27" name="Picture 27" descr="register page"/>
+                    <pic:cNvPicPr>
+                      <a:picLocks noChangeAspect="1"/>
+                    </pic:cNvPicPr>
+                  </pic:nvPicPr>
+                  <pic:blipFill>
+                    <a:blip r:embed="rId32"/>
+                    <a:stretch>
+                      <a:fillRect/>
+                    </a:stretch>
+                  </pic:blipFill>
+                  <pic:spPr>
+                    <a:xfrm>
+                      <a:off x="0" y="0"/>
+                      <a:ext cx="5486400" cy="2948940"/>
+                    </a:xfrm>
+                    <a:prstGeom prst="rect">
+                      <a:avLst/>
+                    </a:prstGeom>
+                  </pic:spPr>
+                </pic:pic>
+              </a:graphicData>
+            </a:graphic>
+          </wp:inline>
+        </w:drawing>
+      </w:r>
+    </w:p>
+    <w:p>
+      <w:r>
+        <w:drawing>
+          <wp:inline distT="0" distB="0" distL="114300" distR="114300">
+            <wp:extent cx="5486400" cy="2948940"/>
+            <wp:effectExtent l="0" t="0" r="0" b="3810"/>
+            <wp:docPr id="28" name="Picture 28" descr="register page 2"/>
+            <wp:cNvGraphicFramePr>
+              <a:graphicFrameLocks xmlns:a="http://schemas.openxmlformats.org/drawingml/2006/main" noChangeAspect="1"/>
+            </wp:cNvGraphicFramePr>
+            <a:graphic xmlns:a="http://schemas.openxmlformats.org/drawingml/2006/main">
+              <a:graphicData uri="http://schemas.openxmlformats.org/drawingml/2006/picture">
+                <pic:pic xmlns:pic="http://schemas.openxmlformats.org/drawingml/2006/picture">
+                  <pic:nvPicPr>
+                    <pic:cNvPr id="28" name="Picture 28" descr="register page 2"/>
+                    <pic:cNvPicPr>
+                      <a:picLocks noChangeAspect="1"/>
+                    </pic:cNvPicPr>
+                  </pic:nvPicPr>
+                  <pic:blipFill>
+                    <a:blip r:embed="rId33"/>
+                    <a:stretch>
+                      <a:fillRect/>
+                    </a:stretch>
+                  </pic:blipFill>
+                  <pic:spPr>
+                    <a:xfrm>
+                      <a:off x="0" y="0"/>
+                      <a:ext cx="5486400" cy="2948940"/>
+                    </a:xfrm>
+                    <a:prstGeom prst="rect">
+                      <a:avLst/>
+                    </a:prstGeom>
+                  </pic:spPr>
+                </pic:pic>
+              </a:graphicData>
+            </a:graphic>
+          </wp:inline>
+        </w:drawing>
+      </w:r>
+      <w:r>
         <w:br w:type="textWrapping"/>
       </w:r>
       <w:r>
@@ -3148,6 +3306,156 @@
       </w:r>
     </w:p>
     <w:p>
+      <w:pPr>
+        <w:rPr>
+          <w:rFonts w:hint="default"/>
+          <w:lang w:val="en-US"/>
+        </w:rPr>
+      </w:pPr>
+      <w:r>
+        <w:rPr>
+          <w:rFonts w:hint="default"/>
+          <w:lang w:val="en-US"/>
+        </w:rPr>
+        <w:drawing>
+          <wp:inline distT="0" distB="0" distL="114300" distR="114300">
+            <wp:extent cx="5486400" cy="2948940"/>
+            <wp:effectExtent l="0" t="0" r="0" b="3810"/>
+            <wp:docPr id="31" name="Picture 31" descr="eerors 2"/>
+            <wp:cNvGraphicFramePr>
+              <a:graphicFrameLocks xmlns:a="http://schemas.openxmlformats.org/drawingml/2006/main" noChangeAspect="1"/>
+            </wp:cNvGraphicFramePr>
+            <a:graphic xmlns:a="http://schemas.openxmlformats.org/drawingml/2006/main">
+              <a:graphicData uri="http://schemas.openxmlformats.org/drawingml/2006/picture">
+                <pic:pic xmlns:pic="http://schemas.openxmlformats.org/drawingml/2006/picture">
+                  <pic:nvPicPr>
+                    <pic:cNvPr id="31" name="Picture 31" descr="eerors 2"/>
+                    <pic:cNvPicPr>
+                      <a:picLocks noChangeAspect="1"/>
+                    </pic:cNvPicPr>
+                  </pic:nvPicPr>
+                  <pic:blipFill>
+                    <a:blip r:embed="rId34"/>
+                    <a:stretch>
+                      <a:fillRect/>
+                    </a:stretch>
+                  </pic:blipFill>
+                  <pic:spPr>
+                    <a:xfrm>
+                      <a:off x="0" y="0"/>
+                      <a:ext cx="5486400" cy="2948940"/>
+                    </a:xfrm>
+                    <a:prstGeom prst="rect">
+                      <a:avLst/>
+                    </a:prstGeom>
+                  </pic:spPr>
+                </pic:pic>
+              </a:graphicData>
+            </a:graphic>
+          </wp:inline>
+        </w:drawing>
+      </w:r>
+    </w:p>
+    <w:p>
+      <w:pPr>
+        <w:rPr>
+          <w:rFonts w:hint="default"/>
+          <w:lang w:val="en-US"/>
+        </w:rPr>
+      </w:pPr>
+      <w:r>
+        <w:rPr>
+          <w:rFonts w:hint="default"/>
+          <w:lang w:val="en-US"/>
+        </w:rPr>
+        <w:drawing>
+          <wp:inline distT="0" distB="0" distL="114300" distR="114300">
+            <wp:extent cx="5486400" cy="2948940"/>
+            <wp:effectExtent l="0" t="0" r="0" b="3810"/>
+            <wp:docPr id="32" name="Picture 32" descr="● dashboard_screen.dart - student_portal_clean - Visual Studio Code 7_16_2026 12_45_29 AM"/>
+            <wp:cNvGraphicFramePr>
+              <a:graphicFrameLocks xmlns:a="http://schemas.openxmlformats.org/drawingml/2006/main" noChangeAspect="1"/>
+            </wp:cNvGraphicFramePr>
+            <a:graphic xmlns:a="http://schemas.openxmlformats.org/drawingml/2006/main">
+              <a:graphicData uri="http://schemas.openxmlformats.org/drawingml/2006/picture">
+                <pic:pic xmlns:pic="http://schemas.openxmlformats.org/drawingml/2006/picture">
+                  <pic:nvPicPr>
+                    <pic:cNvPr id="32" name="Picture 32" descr="● dashboard_screen.dart - student_portal_clean - Visual Studio Code 7_16_2026 12_45_29 AM"/>
+                    <pic:cNvPicPr>
+                      <a:picLocks noChangeAspect="1"/>
+                    </pic:cNvPicPr>
+                  </pic:nvPicPr>
+                  <pic:blipFill>
+                    <a:blip r:embed="rId35"/>
+                    <a:stretch>
+                      <a:fillRect/>
+                    </a:stretch>
+                  </pic:blipFill>
+                  <pic:spPr>
+                    <a:xfrm>
+                      <a:off x="0" y="0"/>
+                      <a:ext cx="5486400" cy="2948940"/>
+                    </a:xfrm>
+                    <a:prstGeom prst="rect">
+                      <a:avLst/>
+                    </a:prstGeom>
+                  </pic:spPr>
+                </pic:pic>
+              </a:graphicData>
+            </a:graphic>
+          </wp:inline>
+        </w:drawing>
+      </w:r>
+    </w:p>
+    <w:p/>
+    <w:p/>
+    <w:p/>
+    <w:p/>
+    <w:p/>
+    <w:p/>
+    <w:p/>
+    <w:p/>
+    <w:p/>
+    <w:p>
+      <w:r>
+        <w:drawing>
+          <wp:inline distT="0" distB="0" distL="114300" distR="114300">
+            <wp:extent cx="5486400" cy="2948940"/>
+            <wp:effectExtent l="0" t="0" r="0" b="3810"/>
+            <wp:docPr id="29" name="Picture 29" descr="● dashboard_screen.dart - student_portal_clean - Visual Studio Code 7_16_2026 12_45_29 AM"/>
+            <wp:cNvGraphicFramePr>
+              <a:graphicFrameLocks xmlns:a="http://schemas.openxmlformats.org/drawingml/2006/main" noChangeAspect="1"/>
+            </wp:cNvGraphicFramePr>
+            <a:graphic xmlns:a="http://schemas.openxmlformats.org/drawingml/2006/main">
+              <a:graphicData uri="http://schemas.openxmlformats.org/drawingml/2006/picture">
+                <pic:pic xmlns:pic="http://schemas.openxmlformats.org/drawingml/2006/picture">
+                  <pic:nvPicPr>
+                    <pic:cNvPr id="29" name="Picture 29" descr="● dashboard_screen.dart - student_portal_clean - Visual Studio Code 7_16_2026 12_45_29 AM"/>
+                    <pic:cNvPicPr>
+                      <a:picLocks noChangeAspect="1"/>
+                    </pic:cNvPicPr>
+                  </pic:nvPicPr>
+                  <pic:blipFill>
+                    <a:blip r:embed="rId35"/>
+                    <a:stretch>
+                      <a:fillRect/>
+                    </a:stretch>
+                  </pic:blipFill>
+                  <pic:spPr>
+                    <a:xfrm>
+                      <a:off x="0" y="0"/>
+                      <a:ext cx="5486400" cy="2948940"/>
+                    </a:xfrm>
+                    <a:prstGeom prst="rect">
+                      <a:avLst/>
+                    </a:prstGeom>
+                  </pic:spPr>
+                </pic:pic>
+              </a:graphicData>
+            </a:graphic>
+          </wp:inline>
+        </w:drawing>
+      </w:r>
       <w:r>
         <w:br w:type="textWrapping"/>
       </w:r>
@@ -3158,69 +3466,1291 @@
         <w:br w:type="textWrapping"/>
       </w:r>
     </w:p>
-    <w:p/>
     <w:p>
       <w:pPr>
         <w:pStyle w:val="2"/>
       </w:pPr>
-      <w:r>
+    </w:p>
+    <w:p>
+      <w:pPr>
+        <w:pStyle w:val="2"/>
+      </w:pPr>
+    </w:p>
+    <w:p>
+      <w:pPr>
+        <w:pStyle w:val="2"/>
+      </w:pPr>
+    </w:p>
+    <w:p>
+      <w:pPr>
+        <w:pStyle w:val="2"/>
+      </w:pPr>
+    </w:p>
+    <w:p>
+      <w:pPr>
+        <w:bidi w:val="0"/>
+      </w:pPr>
+    </w:p>
+    <w:p>
+      <w:pPr>
+        <w:bidi w:val="0"/>
+      </w:pPr>
+    </w:p>
+    <w:p>
+      <w:pPr>
+        <w:bidi w:val="0"/>
+      </w:pPr>
+    </w:p>
+    <w:p>
+      <w:pPr>
+        <w:bidi w:val="0"/>
+        <w:rPr>
+          <w:rFonts w:hint="default" w:ascii="Times New Roman" w:hAnsi="Times New Roman" w:cs="Times New Roman"/>
+          <w:b/>
+          <w:bCs/>
+          <w:color w:val="558ED5" w:themeColor="text2" w:themeTint="99"/>
+          <w:sz w:val="32"/>
+          <w:szCs w:val="32"/>
+          <w14:textFill>
+            <w14:solidFill>
+              <w14:schemeClr w14:val="tx2">
+                <w14:lumMod w14:val="60000"/>
+                <w14:lumOff w14:val="40000"/>
+              </w14:schemeClr>
+            </w14:solidFill>
+          </w14:textFill>
+        </w:rPr>
+      </w:pPr>
+      <w:r>
+        <w:rPr>
+          <w:rFonts w:hint="default" w:ascii="Times New Roman" w:hAnsi="Times New Roman" w:cs="Times New Roman"/>
+          <w:b/>
+          <w:bCs/>
+          <w:color w:val="558ED5" w:themeColor="text2" w:themeTint="99"/>
+          <w:sz w:val="32"/>
+          <w:szCs w:val="32"/>
+          <w14:textFill>
+            <w14:solidFill>
+              <w14:schemeClr w14:val="tx2">
+                <w14:lumMod w14:val="60000"/>
+                <w14:lumOff w14:val="40000"/>
+              </w14:schemeClr>
+            </w14:solidFill>
+          </w14:textFill>
+        </w:rPr>
         <w:t>Semester Project Tracking</w:t>
       </w:r>
     </w:p>
     <w:p>
       <w:pPr>
         <w:pStyle w:val="3"/>
-      </w:pPr>
-      <w:r>
-        <w:t>Project Title</w:t>
-      </w:r>
-    </w:p>
-    <w:p>
-      <w:r>
+        <w:rPr>
+          <w:rFonts w:hint="default" w:ascii="Times New Roman" w:hAnsi="Times New Roman" w:cs="Times New Roman"/>
+          <w:lang w:val="en-US"/>
+        </w:rPr>
+      </w:pPr>
+      <w:r>
+        <w:rPr>
+          <w:rFonts w:hint="default" w:ascii="Times New Roman" w:hAnsi="Times New Roman" w:cs="Times New Roman"/>
+        </w:rPr>
+        <w:t>Project T</w:t>
+      </w:r>
+      <w:r>
+        <w:rPr>
+          <w:rFonts w:hint="default" w:ascii="Times New Roman" w:hAnsi="Times New Roman" w:cs="Times New Roman"/>
+          <w:lang w:val="en-US"/>
+        </w:rPr>
+        <w:t>ittle</w:t>
+      </w:r>
+    </w:p>
+    <w:p>
+      <w:pPr>
+        <w:pStyle w:val="165"/>
+        <w:spacing w:after="200"/>
+        <w:rPr>
+          <w:rFonts w:hint="default" w:ascii="Times New Roman" w:hAnsi="Times New Roman" w:cs="Times New Roman"/>
+        </w:rPr>
+      </w:pPr>
+      <w:r>
+        <w:rPr>
+          <w:rFonts w:hint="default" w:ascii="Times New Roman" w:hAnsi="Times New Roman" w:cs="Times New Roman"/>
+        </w:rPr>
+        <w:t>Student Portal — A Cross-Platform School Management App (Flutter)</w:t>
+      </w:r>
+    </w:p>
+    <w:p>
+      <w:pPr>
+        <w:pStyle w:val="3"/>
+        <w:rPr>
+          <w:rFonts w:hint="default" w:ascii="Times New Roman" w:hAnsi="Times New Roman" w:cs="Times New Roman"/>
+        </w:rPr>
+      </w:pPr>
+      <w:r>
+        <w:rPr>
+          <w:rFonts w:hint="default" w:ascii="Times New Roman" w:hAnsi="Times New Roman" w:cs="Times New Roman"/>
+        </w:rPr>
+        <w:t>Project Objectives</w:t>
+      </w:r>
+    </w:p>
+    <w:p>
+      <w:pPr>
+        <w:pStyle w:val="154"/>
+        <w:numPr>
+          <w:ilvl w:val="0"/>
+          <w:numId w:val="8"/>
+        </w:numPr>
+        <w:spacing w:after="80"/>
+        <w:ind w:left="425" w:leftChars="0" w:hanging="425" w:firstLineChars="0"/>
+        <w:rPr>
+          <w:rFonts w:hint="default" w:ascii="Times New Roman" w:hAnsi="Times New Roman" w:cs="Times New Roman"/>
+        </w:rPr>
+      </w:pPr>
+      <w:r>
+        <w:rPr>
+          <w:rFonts w:hint="default" w:ascii="Times New Roman" w:hAnsi="Times New Roman" w:cs="Times New Roman"/>
+        </w:rPr>
+        <w:t>Build a single mobile app covering the core functions of a school portal: authentication, academics, attendance, fees, and communication.</w:t>
+      </w:r>
+    </w:p>
+    <w:p>
+      <w:pPr>
+        <w:pStyle w:val="154"/>
+        <w:numPr>
+          <w:ilvl w:val="0"/>
+          <w:numId w:val="8"/>
+        </w:numPr>
+        <w:spacing w:after="80"/>
+        <w:ind w:left="425" w:leftChars="0" w:hanging="425" w:firstLineChars="0"/>
+        <w:rPr>
+          <w:rFonts w:hint="default" w:ascii="Times New Roman" w:hAnsi="Times New Roman" w:cs="Times New Roman"/>
+        </w:rPr>
+      </w:pPr>
+      <w:r>
+        <w:rPr>
+          <w:rFonts w:hint="default" w:ascii="Times New Roman" w:hAnsi="Times New Roman" w:cs="Times New Roman"/>
+        </w:rPr>
+        <w:t>Demonstrate device-feature integration (camera, GPS, gestures) as part of real user workflows rather than as isolated demo screens.</w:t>
+      </w:r>
+    </w:p>
+    <w:p>
+      <w:pPr>
+        <w:pStyle w:val="154"/>
+        <w:numPr>
+          <w:ilvl w:val="0"/>
+          <w:numId w:val="8"/>
+        </w:numPr>
+        <w:spacing w:after="80"/>
+        <w:ind w:left="425" w:leftChars="0" w:hanging="425" w:firstLineChars="0"/>
+        <w:rPr>
+          <w:rFonts w:hint="default" w:ascii="Times New Roman" w:hAnsi="Times New Roman" w:cs="Times New Roman"/>
+        </w:rPr>
+      </w:pPr>
+      <w:r>
+        <w:rPr>
+          <w:rFonts w:hint="default" w:ascii="Times New Roman" w:hAnsi="Times New Roman" w:cs="Times New Roman"/>
+        </w:rPr>
+        <w:t>Apply sound software engineering practice throughout: local database CRUD, REST API integration, input validation, automated testing, and performance optimization.</w:t>
+      </w:r>
+    </w:p>
+    <w:p>
+      <w:pPr>
+        <w:pStyle w:val="154"/>
+        <w:numPr>
+          <w:ilvl w:val="0"/>
+          <w:numId w:val="8"/>
+        </w:numPr>
+        <w:spacing w:after="80"/>
+        <w:ind w:left="425" w:leftChars="0" w:hanging="425" w:firstLineChars="0"/>
+        <w:rPr>
+          <w:rFonts w:hint="default" w:ascii="Times New Roman" w:hAnsi="Times New Roman" w:cs="Times New Roman"/>
+        </w:rPr>
+      </w:pPr>
+      <w:r>
+        <w:rPr>
+          <w:rFonts w:hint="default" w:ascii="Times New Roman" w:hAnsi="Times New Roman" w:cs="Times New Roman"/>
+        </w:rPr>
+        <w:t>Maintain a clear, incremental development history using version control, with work organized and committed by weekly milestone.</w:t>
+      </w:r>
+    </w:p>
+    <w:p>
+      <w:pPr>
+        <w:rPr>
+          <w:rFonts w:hint="default" w:ascii="Times New Roman" w:hAnsi="Times New Roman" w:cs="Times New Roman"/>
+        </w:rPr>
+      </w:pPr>
+      <w:r>
+        <w:rPr>
+          <w:rFonts w:hint="default" w:ascii="Times New Roman" w:hAnsi="Times New Roman" w:cs="Times New Roman"/>
+        </w:rPr>
         <w:br w:type="textWrapping"/>
       </w:r>
       <w:r>
+        <w:rPr>
+          <w:rFonts w:hint="default" w:ascii="Times New Roman" w:hAnsi="Times New Roman" w:cs="Times New Roman"/>
+        </w:rPr>
         <w:br w:type="textWrapping"/>
       </w:r>
     </w:p>
     <w:p>
       <w:pPr>
         <w:pStyle w:val="3"/>
-      </w:pPr>
-      <w:r>
-        <w:t>Project Objectives</w:t>
-      </w:r>
-    </w:p>
-    <w:p>
-      <w:r>
+        <w:rPr>
+          <w:rFonts w:hint="default" w:ascii="Times New Roman" w:hAnsi="Times New Roman" w:cs="Times New Roman"/>
+        </w:rPr>
+      </w:pPr>
+      <w:r>
+        <w:rPr>
+          <w:rFonts w:hint="default" w:ascii="Times New Roman" w:hAnsi="Times New Roman" w:cs="Times New Roman"/>
+        </w:rPr>
+        <w:t>Project Requirements</w:t>
+      </w:r>
+    </w:p>
+    <w:p>
+      <w:pPr>
+        <w:pStyle w:val="154"/>
+        <w:numPr>
+          <w:ilvl w:val="0"/>
+          <w:numId w:val="9"/>
+        </w:numPr>
+        <w:tabs>
+          <w:tab w:val="clear" w:pos="425"/>
+        </w:tabs>
+        <w:spacing w:after="80"/>
+        <w:ind w:left="425" w:leftChars="0" w:hanging="425" w:firstLineChars="0"/>
+        <w:rPr>
+          <w:rFonts w:hint="default" w:ascii="Times New Roman" w:hAnsi="Times New Roman" w:cs="Times New Roman"/>
+        </w:rPr>
+      </w:pPr>
+      <w:r>
+        <w:rPr>
+          <w:rFonts w:hint="default" w:ascii="Times New Roman" w:hAnsi="Times New Roman" w:cs="Times New Roman"/>
+        </w:rPr>
+        <w:t>User Authentication — registration, login, and logout</w:t>
+      </w:r>
+    </w:p>
+    <w:p>
+      <w:pPr>
+        <w:pStyle w:val="154"/>
+        <w:numPr>
+          <w:ilvl w:val="0"/>
+          <w:numId w:val="9"/>
+        </w:numPr>
+        <w:tabs>
+          <w:tab w:val="clear" w:pos="425"/>
+        </w:tabs>
+        <w:spacing w:after="80"/>
+        <w:ind w:left="425" w:leftChars="0" w:hanging="425" w:firstLineChars="0"/>
+        <w:rPr>
+          <w:rFonts w:hint="default" w:ascii="Times New Roman" w:hAnsi="Times New Roman" w:cs="Times New Roman"/>
+        </w:rPr>
+      </w:pPr>
+      <w:r>
+        <w:rPr>
+          <w:rFonts w:hint="default" w:ascii="Times New Roman" w:hAnsi="Times New Roman" w:cs="Times New Roman"/>
+        </w:rPr>
+        <w:t>UI Design and Navigation</w:t>
+      </w:r>
+    </w:p>
+    <w:p>
+      <w:pPr>
+        <w:pStyle w:val="154"/>
+        <w:numPr>
+          <w:ilvl w:val="0"/>
+          <w:numId w:val="9"/>
+        </w:numPr>
+        <w:tabs>
+          <w:tab w:val="clear" w:pos="425"/>
+        </w:tabs>
+        <w:spacing w:after="80"/>
+        <w:ind w:left="425" w:leftChars="0" w:hanging="425" w:firstLineChars="0"/>
+        <w:rPr>
+          <w:rFonts w:hint="default" w:ascii="Times New Roman" w:hAnsi="Times New Roman" w:cs="Times New Roman"/>
+        </w:rPr>
+      </w:pPr>
+      <w:r>
+        <w:rPr>
+          <w:rFonts w:hint="default" w:ascii="Times New Roman" w:hAnsi="Times New Roman" w:cs="Times New Roman"/>
+        </w:rPr>
+        <w:t>Local Database (full CRUD by id)</w:t>
+      </w:r>
+    </w:p>
+    <w:p>
+      <w:pPr>
+        <w:pStyle w:val="154"/>
+        <w:numPr>
+          <w:ilvl w:val="0"/>
+          <w:numId w:val="9"/>
+        </w:numPr>
+        <w:tabs>
+          <w:tab w:val="clear" w:pos="425"/>
+        </w:tabs>
+        <w:spacing w:after="80"/>
+        <w:ind w:left="425" w:leftChars="0" w:hanging="425" w:firstLineChars="0"/>
+        <w:rPr>
+          <w:rFonts w:hint="default" w:ascii="Times New Roman" w:hAnsi="Times New Roman" w:cs="Times New Roman"/>
+        </w:rPr>
+      </w:pPr>
+      <w:r>
+        <w:rPr>
+          <w:rFonts w:hint="default" w:ascii="Times New Roman" w:hAnsi="Times New Roman" w:cs="Times New Roman"/>
+        </w:rPr>
+        <w:t>API Integration</w:t>
+      </w:r>
+    </w:p>
+    <w:p>
+      <w:pPr>
+        <w:pStyle w:val="154"/>
+        <w:numPr>
+          <w:ilvl w:val="0"/>
+          <w:numId w:val="9"/>
+        </w:numPr>
+        <w:tabs>
+          <w:tab w:val="clear" w:pos="425"/>
+        </w:tabs>
+        <w:spacing w:after="80"/>
+        <w:ind w:left="425" w:leftChars="0" w:hanging="425" w:firstLineChars="0"/>
+        <w:rPr>
+          <w:rFonts w:hint="default" w:ascii="Times New Roman" w:hAnsi="Times New Roman" w:cs="Times New Roman"/>
+        </w:rPr>
+      </w:pPr>
+      <w:r>
+        <w:rPr>
+          <w:rFonts w:hint="default" w:ascii="Times New Roman" w:hAnsi="Times New Roman" w:cs="Times New Roman"/>
+        </w:rPr>
+        <w:t>Two or more Device Features, integrated into real workflows</w:t>
+      </w:r>
+    </w:p>
+    <w:p>
+      <w:pPr>
+        <w:pStyle w:val="154"/>
+        <w:numPr>
+          <w:ilvl w:val="0"/>
+          <w:numId w:val="9"/>
+        </w:numPr>
+        <w:tabs>
+          <w:tab w:val="clear" w:pos="425"/>
+        </w:tabs>
+        <w:spacing w:after="80"/>
+        <w:ind w:left="425" w:leftChars="0" w:hanging="425" w:firstLineChars="0"/>
+        <w:rPr>
+          <w:rFonts w:hint="default" w:ascii="Times New Roman" w:hAnsi="Times New Roman" w:cs="Times New Roman"/>
+        </w:rPr>
+      </w:pPr>
+      <w:r>
+        <w:rPr>
+          <w:rFonts w:hint="default" w:ascii="Times New Roman" w:hAnsi="Times New Roman" w:cs="Times New Roman"/>
+        </w:rPr>
+        <w:t>Input Validation and Error Handling</w:t>
+      </w:r>
+    </w:p>
+    <w:p>
+      <w:pPr>
+        <w:pStyle w:val="154"/>
+        <w:numPr>
+          <w:ilvl w:val="0"/>
+          <w:numId w:val="9"/>
+        </w:numPr>
+        <w:tabs>
+          <w:tab w:val="clear" w:pos="425"/>
+        </w:tabs>
+        <w:spacing w:after="80"/>
+        <w:ind w:left="425" w:leftChars="0" w:hanging="425" w:firstLineChars="0"/>
+        <w:rPr>
+          <w:rFonts w:hint="default" w:ascii="Times New Roman" w:hAnsi="Times New Roman" w:cs="Times New Roman"/>
+        </w:rPr>
+      </w:pPr>
+      <w:r>
+        <w:rPr>
+          <w:rFonts w:hint="default" w:ascii="Times New Roman" w:hAnsi="Times New Roman" w:cs="Times New Roman"/>
+        </w:rPr>
+        <w:t>Testing and Debugging</w:t>
+      </w:r>
+    </w:p>
+    <w:p>
+      <w:pPr>
+        <w:pStyle w:val="154"/>
+        <w:numPr>
+          <w:ilvl w:val="0"/>
+          <w:numId w:val="9"/>
+        </w:numPr>
+        <w:tabs>
+          <w:tab w:val="clear" w:pos="425"/>
+        </w:tabs>
+        <w:spacing w:after="80"/>
+        <w:ind w:left="425" w:leftChars="0" w:hanging="425" w:firstLineChars="0"/>
+        <w:rPr>
+          <w:rFonts w:hint="default" w:ascii="Times New Roman" w:hAnsi="Times New Roman" w:cs="Times New Roman"/>
+        </w:rPr>
+      </w:pPr>
+      <w:r>
+        <w:rPr>
+          <w:rFonts w:hint="default" w:ascii="Times New Roman" w:hAnsi="Times New Roman" w:cs="Times New Roman"/>
+        </w:rPr>
+        <w:t>Performance Optimization</w:t>
+      </w:r>
+    </w:p>
+    <w:p>
+      <w:pPr>
+        <w:pStyle w:val="154"/>
+        <w:numPr>
+          <w:ilvl w:val="0"/>
+          <w:numId w:val="9"/>
+        </w:numPr>
+        <w:tabs>
+          <w:tab w:val="clear" w:pos="425"/>
+        </w:tabs>
+        <w:spacing w:after="80"/>
+        <w:ind w:left="425" w:leftChars="0" w:hanging="425" w:firstLineChars="0"/>
+        <w:rPr>
+          <w:rFonts w:hint="default" w:ascii="Times New Roman" w:hAnsi="Times New Roman" w:cs="Times New Roman"/>
+        </w:rPr>
+      </w:pPr>
+      <w:r>
+        <w:rPr>
+          <w:rFonts w:hint="default" w:ascii="Times New Roman" w:hAnsi="Times New Roman" w:cs="Times New Roman"/>
+        </w:rPr>
+        <w:t>Deployment Preparation</w:t>
+      </w:r>
+    </w:p>
+    <w:p>
+      <w:pPr>
+        <w:pStyle w:val="154"/>
+        <w:numPr>
+          <w:ilvl w:val="0"/>
+          <w:numId w:val="9"/>
+        </w:numPr>
+        <w:tabs>
+          <w:tab w:val="clear" w:pos="425"/>
+        </w:tabs>
+        <w:spacing w:after="80"/>
+        <w:ind w:left="425" w:leftChars="0" w:hanging="425" w:firstLineChars="0"/>
+        <w:rPr>
+          <w:rFonts w:hint="default" w:ascii="Times New Roman" w:hAnsi="Times New Roman" w:cs="Times New Roman"/>
+        </w:rPr>
+      </w:pPr>
+      <w:r>
+        <w:rPr>
+          <w:rFonts w:hint="default" w:ascii="Times New Roman" w:hAnsi="Times New Roman" w:cs="Times New Roman"/>
+        </w:rPr>
+        <w:t>Documentation and Presentation</w:t>
+      </w:r>
+    </w:p>
+    <w:p>
+      <w:pPr>
+        <w:rPr>
+          <w:rFonts w:hint="default" w:ascii="Times New Roman" w:hAnsi="Times New Roman" w:cs="Times New Roman"/>
+        </w:rPr>
+      </w:pPr>
+      <w:bookmarkStart w:id="0" w:name="_GoBack"/>
+      <w:bookmarkEnd w:id="0"/>
+      <w:r>
+        <w:rPr>
+          <w:rFonts w:hint="default" w:ascii="Times New Roman" w:hAnsi="Times New Roman" w:cs="Times New Roman"/>
+        </w:rPr>
         <w:br w:type="textWrapping"/>
       </w:r>
-      <w:r>
+    </w:p>
+    <w:p>
+      <w:pPr>
+        <w:pStyle w:val="3"/>
+        <w:rPr>
+          <w:rFonts w:hint="default" w:ascii="Times New Roman" w:hAnsi="Times New Roman" w:cs="Times New Roman"/>
+        </w:rPr>
+      </w:pPr>
+      <w:r>
+        <w:rPr>
+          <w:rFonts w:hint="default" w:ascii="Times New Roman" w:hAnsi="Times New Roman" w:cs="Times New Roman"/>
+        </w:rPr>
+        <w:t>Development Milestones</w:t>
+      </w:r>
+    </w:p>
+    <w:p>
+      <w:pPr>
+        <w:rPr>
+          <w:rFonts w:hint="default" w:ascii="Times New Roman" w:hAnsi="Times New Roman" w:cs="Times New Roman"/>
+        </w:rPr>
+      </w:pPr>
+      <w:r>
+        <w:rPr>
+          <w:rFonts w:hint="default" w:ascii="Times New Roman" w:hAnsi="Times New Roman" w:cs="Times New Roman"/>
+        </w:rPr>
         <w:br w:type="textWrapping"/>
       </w:r>
     </w:p>
+    <w:tbl>
+      <w:tblPr>
+        <w:tblStyle w:val="12"/>
+        <w:tblW w:w="10000" w:type="dxa"/>
+        <w:tblInd w:w="0" w:type="dxa"/>
+        <w:tblBorders>
+          <w:top w:val="single" w:color="auto" w:sz="4" w:space="0"/>
+          <w:left w:val="single" w:color="auto" w:sz="4" w:space="0"/>
+          <w:bottom w:val="single" w:color="auto" w:sz="4" w:space="0"/>
+          <w:right w:val="single" w:color="auto" w:sz="4" w:space="0"/>
+          <w:insideH w:val="single" w:color="auto" w:sz="4" w:space="0"/>
+          <w:insideV w:val="single" w:color="auto" w:sz="4" w:space="0"/>
+        </w:tblBorders>
+        <w:tblLayout w:type="autofit"/>
+        <w:tblCellMar>
+          <w:top w:w="0" w:type="dxa"/>
+          <w:left w:w="10" w:type="dxa"/>
+          <w:bottom w:w="0" w:type="dxa"/>
+          <w:right w:w="10" w:type="dxa"/>
+        </w:tblCellMar>
+      </w:tblPr>
+      <w:tblGrid>
+        <w:gridCol w:w="1600"/>
+        <w:gridCol w:w="4200"/>
+        <w:gridCol w:w="4200"/>
+      </w:tblGrid>
+      <w:tr>
+        <w:tblPrEx>
+          <w:tblBorders>
+            <w:top w:val="single" w:color="auto" w:sz="4" w:space="0"/>
+            <w:left w:val="single" w:color="auto" w:sz="4" w:space="0"/>
+            <w:bottom w:val="single" w:color="auto" w:sz="4" w:space="0"/>
+            <w:right w:val="single" w:color="auto" w:sz="4" w:space="0"/>
+            <w:insideH w:val="single" w:color="auto" w:sz="4" w:space="0"/>
+            <w:insideV w:val="single" w:color="auto" w:sz="4" w:space="0"/>
+          </w:tblBorders>
+          <w:tblCellMar>
+            <w:top w:w="0" w:type="dxa"/>
+            <w:left w:w="10" w:type="dxa"/>
+            <w:bottom w:w="0" w:type="dxa"/>
+            <w:right w:w="10" w:type="dxa"/>
+          </w:tblCellMar>
+        </w:tblPrEx>
+        <w:tc>
+          <w:tcPr>
+            <w:tcW w:w="1600" w:type="dxa"/>
+            <w:shd w:val="clear" w:color="auto" w:fill="000000" w:themeFill="text1"/>
+          </w:tcPr>
+          <w:p>
+            <w:pPr>
+              <w:rPr>
+                <w:rFonts w:hint="default" w:ascii="Times New Roman" w:hAnsi="Times New Roman" w:cs="Times New Roman"/>
+              </w:rPr>
+            </w:pPr>
+            <w:r>
+              <w:rPr>
+                <w:rFonts w:hint="default" w:ascii="Times New Roman" w:hAnsi="Times New Roman" w:cs="Times New Roman"/>
+                <w:b/>
+                <w:bCs/>
+                <w:color w:val="FFFFFF"/>
+              </w:rPr>
+              <w:t>Week</w:t>
+            </w:r>
+          </w:p>
+        </w:tc>
+        <w:tc>
+          <w:tcPr>
+            <w:tcW w:w="4200" w:type="dxa"/>
+            <w:shd w:val="clear" w:color="auto" w:fill="000000" w:themeFill="text1"/>
+          </w:tcPr>
+          <w:p>
+            <w:pPr>
+              <w:rPr>
+                <w:rFonts w:hint="default" w:ascii="Times New Roman" w:hAnsi="Times New Roman" w:cs="Times New Roman"/>
+              </w:rPr>
+            </w:pPr>
+            <w:r>
+              <w:rPr>
+                <w:rFonts w:hint="default" w:ascii="Times New Roman" w:hAnsi="Times New Roman" w:cs="Times New Roman"/>
+                <w:b/>
+                <w:bCs/>
+                <w:color w:val="FFFFFF"/>
+              </w:rPr>
+              <w:t>Focus</w:t>
+            </w:r>
+          </w:p>
+        </w:tc>
+        <w:tc>
+          <w:tcPr>
+            <w:tcW w:w="4200" w:type="dxa"/>
+            <w:shd w:val="clear" w:color="auto" w:fill="000000" w:themeFill="text1"/>
+          </w:tcPr>
+          <w:p>
+            <w:pPr>
+              <w:rPr>
+                <w:rFonts w:hint="default" w:ascii="Times New Roman" w:hAnsi="Times New Roman" w:cs="Times New Roman"/>
+              </w:rPr>
+            </w:pPr>
+            <w:r>
+              <w:rPr>
+                <w:rFonts w:hint="default" w:ascii="Times New Roman" w:hAnsi="Times New Roman" w:cs="Times New Roman"/>
+                <w:b/>
+                <w:bCs/>
+                <w:color w:val="FFFFFF"/>
+              </w:rPr>
+              <w:t>Outcome</w:t>
+            </w:r>
+          </w:p>
+        </w:tc>
+      </w:tr>
+      <w:tr>
+        <w:tblPrEx>
+          <w:tblBorders>
+            <w:top w:val="single" w:color="auto" w:sz="4" w:space="0"/>
+            <w:left w:val="single" w:color="auto" w:sz="4" w:space="0"/>
+            <w:bottom w:val="single" w:color="auto" w:sz="4" w:space="0"/>
+            <w:right w:val="single" w:color="auto" w:sz="4" w:space="0"/>
+            <w:insideH w:val="single" w:color="auto" w:sz="4" w:space="0"/>
+            <w:insideV w:val="single" w:color="auto" w:sz="4" w:space="0"/>
+          </w:tblBorders>
+          <w:tblCellMar>
+            <w:top w:w="0" w:type="dxa"/>
+            <w:left w:w="10" w:type="dxa"/>
+            <w:bottom w:w="0" w:type="dxa"/>
+            <w:right w:w="10" w:type="dxa"/>
+          </w:tblCellMar>
+        </w:tblPrEx>
+        <w:tc>
+          <w:tcPr>
+            <w:tcW w:w="1600" w:type="dxa"/>
+          </w:tcPr>
+          <w:p>
+            <w:pPr>
+              <w:rPr>
+                <w:rFonts w:hint="default" w:ascii="Times New Roman" w:hAnsi="Times New Roman" w:cs="Times New Roman"/>
+              </w:rPr>
+            </w:pPr>
+            <w:r>
+              <w:rPr>
+                <w:rFonts w:hint="default" w:ascii="Times New Roman" w:hAnsi="Times New Roman" w:cs="Times New Roman"/>
+              </w:rPr>
+              <w:t>Week 9</w:t>
+            </w:r>
+          </w:p>
+        </w:tc>
+        <w:tc>
+          <w:tcPr>
+            <w:tcW w:w="4200" w:type="dxa"/>
+          </w:tcPr>
+          <w:p>
+            <w:pPr>
+              <w:rPr>
+                <w:rFonts w:hint="default" w:ascii="Times New Roman" w:hAnsi="Times New Roman" w:cs="Times New Roman"/>
+              </w:rPr>
+            </w:pPr>
+            <w:r>
+              <w:rPr>
+                <w:rFonts w:hint="default" w:ascii="Times New Roman" w:hAnsi="Times New Roman" w:cs="Times New Roman"/>
+              </w:rPr>
+              <w:t>GPS device feature</w:t>
+            </w:r>
+          </w:p>
+        </w:tc>
+        <w:tc>
+          <w:tcPr>
+            <w:tcW w:w="4200" w:type="dxa"/>
+          </w:tcPr>
+          <w:p>
+            <w:pPr>
+              <w:rPr>
+                <w:rFonts w:hint="default" w:ascii="Times New Roman" w:hAnsi="Times New Roman" w:cs="Times New Roman"/>
+              </w:rPr>
+            </w:pPr>
+            <w:r>
+              <w:rPr>
+                <w:rFonts w:hint="default" w:ascii="Times New Roman" w:hAnsi="Times New Roman" w:cs="Times New Roman"/>
+              </w:rPr>
+              <w:t>Added initial GPS location screen displaying coordinates, accuracy, and altitude using the geolocator package.</w:t>
+            </w:r>
+          </w:p>
+        </w:tc>
+      </w:tr>
+      <w:tr>
+        <w:tblPrEx>
+          <w:tblBorders>
+            <w:top w:val="single" w:color="auto" w:sz="4" w:space="0"/>
+            <w:left w:val="single" w:color="auto" w:sz="4" w:space="0"/>
+            <w:bottom w:val="single" w:color="auto" w:sz="4" w:space="0"/>
+            <w:right w:val="single" w:color="auto" w:sz="4" w:space="0"/>
+            <w:insideH w:val="single" w:color="auto" w:sz="4" w:space="0"/>
+            <w:insideV w:val="single" w:color="auto" w:sz="4" w:space="0"/>
+          </w:tblBorders>
+          <w:tblCellMar>
+            <w:top w:w="0" w:type="dxa"/>
+            <w:left w:w="10" w:type="dxa"/>
+            <w:bottom w:w="0" w:type="dxa"/>
+            <w:right w:w="10" w:type="dxa"/>
+          </w:tblCellMar>
+        </w:tblPrEx>
+        <w:tc>
+          <w:tcPr>
+            <w:tcW w:w="1600" w:type="dxa"/>
+          </w:tcPr>
+          <w:p>
+            <w:pPr>
+              <w:rPr>
+                <w:rFonts w:hint="default" w:ascii="Times New Roman" w:hAnsi="Times New Roman" w:cs="Times New Roman"/>
+              </w:rPr>
+            </w:pPr>
+            <w:r>
+              <w:rPr>
+                <w:rFonts w:hint="default" w:ascii="Times New Roman" w:hAnsi="Times New Roman" w:cs="Times New Roman"/>
+              </w:rPr>
+              <w:t>Week 10</w:t>
+            </w:r>
+          </w:p>
+        </w:tc>
+        <w:tc>
+          <w:tcPr>
+            <w:tcW w:w="4200" w:type="dxa"/>
+          </w:tcPr>
+          <w:p>
+            <w:pPr>
+              <w:rPr>
+                <w:rFonts w:hint="default" w:ascii="Times New Roman" w:hAnsi="Times New Roman" w:cs="Times New Roman"/>
+              </w:rPr>
+            </w:pPr>
+            <w:r>
+              <w:rPr>
+                <w:rFonts w:hint="default" w:ascii="Times New Roman" w:hAnsi="Times New Roman" w:cs="Times New Roman"/>
+              </w:rPr>
+              <w:t>UX polish</w:t>
+            </w:r>
+          </w:p>
+        </w:tc>
+        <w:tc>
+          <w:tcPr>
+            <w:tcW w:w="4200" w:type="dxa"/>
+          </w:tcPr>
+          <w:p>
+            <w:pPr>
+              <w:rPr>
+                <w:rFonts w:hint="default" w:ascii="Times New Roman" w:hAnsi="Times New Roman" w:cs="Times New Roman"/>
+              </w:rPr>
+            </w:pPr>
+            <w:r>
+              <w:rPr>
+                <w:rFonts w:hint="default" w:ascii="Times New Roman" w:hAnsi="Times New Roman" w:cs="Times New Roman"/>
+              </w:rPr>
+              <w:t>Added animated splash screen and dashboard UX improvements: loading skeleton, pull-to-refresh, retry states, custom app icon.</w:t>
+            </w:r>
+          </w:p>
+        </w:tc>
+      </w:tr>
+      <w:tr>
+        <w:tblPrEx>
+          <w:tblBorders>
+            <w:top w:val="single" w:color="auto" w:sz="4" w:space="0"/>
+            <w:left w:val="single" w:color="auto" w:sz="4" w:space="0"/>
+            <w:bottom w:val="single" w:color="auto" w:sz="4" w:space="0"/>
+            <w:right w:val="single" w:color="auto" w:sz="4" w:space="0"/>
+            <w:insideH w:val="single" w:color="auto" w:sz="4" w:space="0"/>
+            <w:insideV w:val="single" w:color="auto" w:sz="4" w:space="0"/>
+          </w:tblBorders>
+          <w:tblCellMar>
+            <w:top w:w="0" w:type="dxa"/>
+            <w:left w:w="10" w:type="dxa"/>
+            <w:bottom w:w="0" w:type="dxa"/>
+            <w:right w:w="10" w:type="dxa"/>
+          </w:tblCellMar>
+        </w:tblPrEx>
+        <w:tc>
+          <w:tcPr>
+            <w:tcW w:w="1600" w:type="dxa"/>
+          </w:tcPr>
+          <w:p>
+            <w:pPr>
+              <w:rPr>
+                <w:rFonts w:hint="default" w:ascii="Times New Roman" w:hAnsi="Times New Roman" w:cs="Times New Roman"/>
+              </w:rPr>
+            </w:pPr>
+            <w:r>
+              <w:rPr>
+                <w:rFonts w:hint="default" w:ascii="Times New Roman" w:hAnsi="Times New Roman" w:cs="Times New Roman"/>
+              </w:rPr>
+              <w:t>Week 11</w:t>
+            </w:r>
+          </w:p>
+        </w:tc>
+        <w:tc>
+          <w:tcPr>
+            <w:tcW w:w="4200" w:type="dxa"/>
+          </w:tcPr>
+          <w:p>
+            <w:pPr>
+              <w:rPr>
+                <w:rFonts w:hint="default" w:ascii="Times New Roman" w:hAnsi="Times New Roman" w:cs="Times New Roman"/>
+              </w:rPr>
+            </w:pPr>
+            <w:r>
+              <w:rPr>
+                <w:rFonts w:hint="default" w:ascii="Times New Roman" w:hAnsi="Times New Roman" w:cs="Times New Roman"/>
+              </w:rPr>
+              <w:t>Core functionality completion</w:t>
+            </w:r>
+          </w:p>
+        </w:tc>
+        <w:tc>
+          <w:tcPr>
+            <w:tcW w:w="4200" w:type="dxa"/>
+          </w:tcPr>
+          <w:p>
+            <w:pPr>
+              <w:rPr>
+                <w:rFonts w:hint="default" w:ascii="Times New Roman" w:hAnsi="Times New Roman" w:cs="Times New Roman"/>
+              </w:rPr>
+            </w:pPr>
+            <w:r>
+              <w:rPr>
+                <w:rFonts w:hint="default" w:ascii="Times New Roman" w:hAnsi="Times New Roman" w:cs="Times New Roman"/>
+              </w:rPr>
+              <w:t>Completed the registration flow, full CRUD (Create/Read/Update/Delete by id), and proper logout — closing the last gaps in Authentication and Database components.</w:t>
+            </w:r>
+          </w:p>
+        </w:tc>
+      </w:tr>
+      <w:tr>
+        <w:tblPrEx>
+          <w:tblBorders>
+            <w:top w:val="single" w:color="auto" w:sz="4" w:space="0"/>
+            <w:left w:val="single" w:color="auto" w:sz="4" w:space="0"/>
+            <w:bottom w:val="single" w:color="auto" w:sz="4" w:space="0"/>
+            <w:right w:val="single" w:color="auto" w:sz="4" w:space="0"/>
+            <w:insideH w:val="single" w:color="auto" w:sz="4" w:space="0"/>
+            <w:insideV w:val="single" w:color="auto" w:sz="4" w:space="0"/>
+          </w:tblBorders>
+          <w:tblCellMar>
+            <w:top w:w="0" w:type="dxa"/>
+            <w:left w:w="10" w:type="dxa"/>
+            <w:bottom w:w="0" w:type="dxa"/>
+            <w:right w:w="10" w:type="dxa"/>
+          </w:tblCellMar>
+        </w:tblPrEx>
+        <w:tc>
+          <w:tcPr>
+            <w:tcW w:w="1600" w:type="dxa"/>
+          </w:tcPr>
+          <w:p>
+            <w:pPr>
+              <w:rPr>
+                <w:rFonts w:hint="default" w:ascii="Times New Roman" w:hAnsi="Times New Roman" w:cs="Times New Roman"/>
+              </w:rPr>
+            </w:pPr>
+            <w:r>
+              <w:rPr>
+                <w:rFonts w:hint="default" w:ascii="Times New Roman" w:hAnsi="Times New Roman" w:cs="Times New Roman"/>
+              </w:rPr>
+              <w:t>Week 12</w:t>
+            </w:r>
+          </w:p>
+        </w:tc>
+        <w:tc>
+          <w:tcPr>
+            <w:tcW w:w="4200" w:type="dxa"/>
+          </w:tcPr>
+          <w:p>
+            <w:pPr>
+              <w:rPr>
+                <w:rFonts w:hint="default" w:ascii="Times New Roman" w:hAnsi="Times New Roman" w:cs="Times New Roman"/>
+              </w:rPr>
+            </w:pPr>
+            <w:r>
+              <w:rPr>
+                <w:rFonts w:hint="default" w:ascii="Times New Roman" w:hAnsi="Times New Roman" w:cs="Times New Roman"/>
+              </w:rPr>
+              <w:t>Device features redesigned into real workflows</w:t>
+            </w:r>
+          </w:p>
+        </w:tc>
+        <w:tc>
+          <w:tcPr>
+            <w:tcW w:w="4200" w:type="dxa"/>
+          </w:tcPr>
+          <w:p>
+            <w:pPr>
+              <w:rPr>
+                <w:rFonts w:hint="default" w:ascii="Times New Roman" w:hAnsi="Times New Roman" w:cs="Times New Roman"/>
+              </w:rPr>
+            </w:pPr>
+            <w:r>
+              <w:rPr>
+                <w:rFonts w:hint="default" w:ascii="Times New Roman" w:hAnsi="Times New Roman" w:cs="Times New Roman"/>
+              </w:rPr>
+              <w:t>Reworked Camera and GPS from standalone demo tabs into functional parts of the app: Camera now fires as a check-in photo step before joining an online class; GPS now captures location silently in the background at login and displays it on the Profile screen. Also added a swipe-to-dismiss gesture on Announcements.</w:t>
+            </w:r>
+          </w:p>
+        </w:tc>
+      </w:tr>
+      <w:tr>
+        <w:tblPrEx>
+          <w:tblBorders>
+            <w:top w:val="single" w:color="auto" w:sz="4" w:space="0"/>
+            <w:left w:val="single" w:color="auto" w:sz="4" w:space="0"/>
+            <w:bottom w:val="single" w:color="auto" w:sz="4" w:space="0"/>
+            <w:right w:val="single" w:color="auto" w:sz="4" w:space="0"/>
+            <w:insideH w:val="single" w:color="auto" w:sz="4" w:space="0"/>
+            <w:insideV w:val="single" w:color="auto" w:sz="4" w:space="0"/>
+          </w:tblBorders>
+          <w:tblCellMar>
+            <w:top w:w="0" w:type="dxa"/>
+            <w:left w:w="10" w:type="dxa"/>
+            <w:bottom w:w="0" w:type="dxa"/>
+            <w:right w:w="10" w:type="dxa"/>
+          </w:tblCellMar>
+        </w:tblPrEx>
+        <w:tc>
+          <w:tcPr>
+            <w:tcW w:w="1600" w:type="dxa"/>
+          </w:tcPr>
+          <w:p>
+            <w:pPr>
+              <w:rPr>
+                <w:rFonts w:hint="default" w:ascii="Times New Roman" w:hAnsi="Times New Roman" w:cs="Times New Roman"/>
+              </w:rPr>
+            </w:pPr>
+            <w:r>
+              <w:rPr>
+                <w:rFonts w:hint="default" w:ascii="Times New Roman" w:hAnsi="Times New Roman" w:cs="Times New Roman"/>
+              </w:rPr>
+              <w:t>Week 13</w:t>
+            </w:r>
+          </w:p>
+        </w:tc>
+        <w:tc>
+          <w:tcPr>
+            <w:tcW w:w="4200" w:type="dxa"/>
+          </w:tcPr>
+          <w:p>
+            <w:pPr>
+              <w:rPr>
+                <w:rFonts w:hint="default" w:ascii="Times New Roman" w:hAnsi="Times New Roman" w:cs="Times New Roman"/>
+              </w:rPr>
+            </w:pPr>
+            <w:r>
+              <w:rPr>
+                <w:rFonts w:hint="default" w:ascii="Times New Roman" w:hAnsi="Times New Roman" w:cs="Times New Roman"/>
+              </w:rPr>
+              <w:t>Bug fix &amp; cleanup</w:t>
+            </w:r>
+          </w:p>
+        </w:tc>
+        <w:tc>
+          <w:tcPr>
+            <w:tcW w:w="4200" w:type="dxa"/>
+          </w:tcPr>
+          <w:p>
+            <w:pPr>
+              <w:rPr>
+                <w:rFonts w:hint="default" w:ascii="Times New Roman" w:hAnsi="Times New Roman" w:cs="Times New Roman"/>
+              </w:rPr>
+            </w:pPr>
+            <w:r>
+              <w:rPr>
+                <w:rFonts w:hint="default" w:ascii="Times New Roman" w:hAnsi="Times New Roman" w:cs="Times New Roman"/>
+              </w:rPr>
+              <w:t>Diagnosed and fixed a failing widget test caused by an uncancelled Timer in the splash screen; removed an unused field in Course Registration.</w:t>
+            </w:r>
+          </w:p>
+        </w:tc>
+      </w:tr>
+      <w:tr>
+        <w:tblPrEx>
+          <w:tblBorders>
+            <w:top w:val="single" w:color="auto" w:sz="4" w:space="0"/>
+            <w:left w:val="single" w:color="auto" w:sz="4" w:space="0"/>
+            <w:bottom w:val="single" w:color="auto" w:sz="4" w:space="0"/>
+            <w:right w:val="single" w:color="auto" w:sz="4" w:space="0"/>
+            <w:insideH w:val="single" w:color="auto" w:sz="4" w:space="0"/>
+            <w:insideV w:val="single" w:color="auto" w:sz="4" w:space="0"/>
+          </w:tblBorders>
+          <w:tblCellMar>
+            <w:top w:w="0" w:type="dxa"/>
+            <w:left w:w="10" w:type="dxa"/>
+            <w:bottom w:w="0" w:type="dxa"/>
+            <w:right w:w="10" w:type="dxa"/>
+          </w:tblCellMar>
+        </w:tblPrEx>
+        <w:tc>
+          <w:tcPr>
+            <w:tcW w:w="1600" w:type="dxa"/>
+          </w:tcPr>
+          <w:p>
+            <w:pPr>
+              <w:rPr>
+                <w:rFonts w:hint="default" w:ascii="Times New Roman" w:hAnsi="Times New Roman" w:cs="Times New Roman"/>
+              </w:rPr>
+            </w:pPr>
+            <w:r>
+              <w:rPr>
+                <w:rFonts w:hint="default" w:ascii="Times New Roman" w:hAnsi="Times New Roman" w:cs="Times New Roman"/>
+              </w:rPr>
+              <w:t>Week 14</w:t>
+            </w:r>
+          </w:p>
+        </w:tc>
+        <w:tc>
+          <w:tcPr>
+            <w:tcW w:w="4200" w:type="dxa"/>
+          </w:tcPr>
+          <w:p>
+            <w:pPr>
+              <w:rPr>
+                <w:rFonts w:hint="default" w:ascii="Times New Roman" w:hAnsi="Times New Roman" w:cs="Times New Roman"/>
+              </w:rPr>
+            </w:pPr>
+            <w:r>
+              <w:rPr>
+                <w:rFonts w:hint="default" w:ascii="Times New Roman" w:hAnsi="Times New Roman" w:cs="Times New Roman"/>
+              </w:rPr>
+              <w:t>Performance optimization &amp; deployment prep</w:t>
+            </w:r>
+          </w:p>
+        </w:tc>
+        <w:tc>
+          <w:tcPr>
+            <w:tcW w:w="4200" w:type="dxa"/>
+          </w:tcPr>
+          <w:p>
+            <w:pPr>
+              <w:rPr>
+                <w:rFonts w:hint="default" w:ascii="Times New Roman" w:hAnsi="Times New Roman" w:cs="Times New Roman"/>
+              </w:rPr>
+            </w:pPr>
+            <w:r>
+              <w:rPr>
+                <w:rFonts w:hint="default" w:ascii="Times New Roman" w:hAnsi="Times New Roman" w:cs="Times New Roman"/>
+              </w:rPr>
+              <w:t xml:space="preserve">Applied dart fix across the </w:t>
+            </w:r>
+            <w:r>
+              <w:rPr>
+                <w:rFonts w:hint="default" w:ascii="Times New Roman" w:hAnsi="Times New Roman" w:cs="Times New Roman"/>
+                <w:lang w:val="en-US"/>
+              </w:rPr>
+              <w:t>code base</w:t>
+            </w:r>
+            <w:r>
+              <w:rPr>
+                <w:rFonts w:hint="default" w:ascii="Times New Roman" w:hAnsi="Times New Roman" w:cs="Times New Roman"/>
+              </w:rPr>
+              <w:t xml:space="preserve"> (deprecated API replacements, const constructors), added a mounted-check guard around an async context use, and added cacheWidth/cacheHeight to the two profile-photo images to reduce decoded image memory. Result: flutter analyze went from 56 issues to 0, with all 10 tests passing. Work pushed to GitHub as four weekly batches.</w:t>
+            </w:r>
+          </w:p>
+        </w:tc>
+      </w:tr>
+    </w:tbl>
+    <w:p>
+      <w:pPr>
+        <w:rPr>
+          <w:rFonts w:hint="default" w:ascii="Times New Roman" w:hAnsi="Times New Roman" w:cs="Times New Roman"/>
+        </w:rPr>
+      </w:pPr>
+      <w:r>
+        <w:rPr>
+          <w:rFonts w:hint="default" w:ascii="Times New Roman" w:hAnsi="Times New Roman" w:cs="Times New Roman"/>
+        </w:rPr>
+        <w:br w:type="textWrapping"/>
+      </w:r>
+    </w:p>
     <w:p>
       <w:pPr>
         <w:pStyle w:val="3"/>
-      </w:pPr>
-      <w:r>
-        <w:t>Project Requirements</w:t>
-      </w:r>
-    </w:p>
-    <w:p>
-      <w:r>
+        <w:rPr>
+          <w:rFonts w:hint="default" w:ascii="Times New Roman" w:hAnsi="Times New Roman" w:cs="Times New Roman"/>
+        </w:rPr>
+      </w:pPr>
+      <w:r>
+        <w:rPr>
+          <w:rFonts w:hint="default" w:ascii="Times New Roman" w:hAnsi="Times New Roman" w:cs="Times New Roman"/>
+        </w:rPr>
+        <w:t>Testing Results</w:t>
+      </w:r>
+    </w:p>
+    <w:p>
+      <w:pPr>
+        <w:pStyle w:val="165"/>
+        <w:spacing w:after="200"/>
+        <w:rPr>
+          <w:rFonts w:hint="default" w:ascii="Times New Roman" w:hAnsi="Times New Roman" w:cs="Times New Roman"/>
+        </w:rPr>
+      </w:pPr>
+      <w:r>
+        <w:rPr>
+          <w:rFonts w:hint="default" w:ascii="Times New Roman" w:hAnsi="Times New Roman" w:cs="Times New Roman"/>
+        </w:rPr>
+        <w:t>Automated testing and static analysis were run repeatedly throughout development, with a clear before/after improvement captured in the final weeks:</w:t>
+      </w:r>
+    </w:p>
+    <w:p>
+      <w:pPr>
+        <w:pStyle w:val="154"/>
+        <w:numPr>
+          <w:ilvl w:val="0"/>
+          <w:numId w:val="10"/>
+        </w:numPr>
+        <w:tabs>
+          <w:tab w:val="clear" w:pos="425"/>
+        </w:tabs>
+        <w:spacing w:after="80"/>
+        <w:ind w:left="425" w:leftChars="0" w:hanging="425" w:firstLineChars="0"/>
+        <w:rPr>
+          <w:rFonts w:hint="default" w:ascii="Times New Roman" w:hAnsi="Times New Roman" w:cs="Times New Roman"/>
+        </w:rPr>
+      </w:pPr>
+      <w:r>
+        <w:rPr>
+          <w:rFonts w:hint="default" w:ascii="Times New Roman" w:hAnsi="Times New Roman" w:cs="Times New Roman"/>
+        </w:rPr>
+        <w:t>flutter test: all 10 tests passing, including the widget test that previously failed due to a pending Timer in the splash screen.</w:t>
+      </w:r>
+    </w:p>
+    <w:p>
+      <w:pPr>
+        <w:pStyle w:val="154"/>
+        <w:numPr>
+          <w:ilvl w:val="0"/>
+          <w:numId w:val="10"/>
+        </w:numPr>
+        <w:tabs>
+          <w:tab w:val="clear" w:pos="425"/>
+        </w:tabs>
+        <w:spacing w:after="80"/>
+        <w:ind w:left="425" w:leftChars="0" w:hanging="425" w:firstLineChars="0"/>
+        <w:rPr>
+          <w:rFonts w:hint="default" w:ascii="Times New Roman" w:hAnsi="Times New Roman" w:cs="Times New Roman"/>
+        </w:rPr>
+      </w:pPr>
+      <w:r>
+        <w:rPr>
+          <w:rFonts w:hint="default" w:ascii="Times New Roman" w:hAnsi="Times New Roman" w:cs="Times New Roman"/>
+        </w:rPr>
+        <w:t>flutter analyze: reduced from 56 issues (mostly deprecated API usage and missing const constructors) to 0 issues, using a combination of dart fix --apply and manual fixes for the two issues that required a code-level decision (an unused field, and a missing mounted check after an async gap).</w:t>
+      </w:r>
+    </w:p>
+    <w:p>
+      <w:pPr>
+        <w:pStyle w:val="154"/>
+        <w:numPr>
+          <w:ilvl w:val="0"/>
+          <w:numId w:val="10"/>
+        </w:numPr>
+        <w:tabs>
+          <w:tab w:val="clear" w:pos="425"/>
+        </w:tabs>
+        <w:spacing w:after="80"/>
+        <w:ind w:left="425" w:leftChars="0" w:hanging="425" w:firstLineChars="0"/>
+        <w:rPr>
+          <w:rFonts w:hint="default" w:ascii="Times New Roman" w:hAnsi="Times New Roman" w:cs="Times New Roman"/>
+        </w:rPr>
+      </w:pPr>
+      <w:r>
+        <w:rPr>
+          <w:rFonts w:hint="default" w:ascii="Times New Roman" w:hAnsi="Times New Roman" w:cs="Times New Roman"/>
+        </w:rPr>
+        <w:t>Manual functional verification: registration and login flows, full CRUD operations on student records, the camera check-in step before joining an online class, and the silent GPS capture displayed on the Profile screen were all tested by hand on top of the automated suite.</w:t>
+      </w:r>
+    </w:p>
+    <w:p>
+      <w:pPr>
+        <w:rPr>
+          <w:rFonts w:hint="default" w:ascii="Times New Roman" w:hAnsi="Times New Roman" w:cs="Times New Roman"/>
+        </w:rPr>
+      </w:pPr>
+      <w:r>
+        <w:rPr>
+          <w:rFonts w:hint="default" w:ascii="Times New Roman" w:hAnsi="Times New Roman" w:cs="Times New Roman"/>
+        </w:rPr>
         <w:br w:type="textWrapping"/>
       </w:r>
       <w:r>
+        <w:rPr>
+          <w:rFonts w:hint="default" w:ascii="Times New Roman" w:hAnsi="Times New Roman" w:cs="Times New Roman"/>
+        </w:rPr>
         <w:br w:type="textWrapping"/>
       </w:r>
     </w:p>
     <w:p>
       <w:pPr>
         <w:pStyle w:val="3"/>
-      </w:pPr>
-      <w:r>
-        <w:t>Development Milestones</w:t>
+        <w:rPr>
+          <w:rFonts w:hint="default" w:ascii="Times New Roman" w:hAnsi="Times New Roman" w:cs="Times New Roman"/>
+        </w:rPr>
+      </w:pPr>
+      <w:r>
+        <w:rPr>
+          <w:rFonts w:hint="default" w:ascii="Times New Roman" w:hAnsi="Times New Roman" w:cs="Times New Roman"/>
+        </w:rPr>
+        <w:t>Lessons Learned</w:t>
+      </w:r>
+    </w:p>
+    <w:p>
+      <w:pPr>
+        <w:pStyle w:val="154"/>
+        <w:numPr>
+          <w:ilvl w:val="0"/>
+          <w:numId w:val="11"/>
+        </w:numPr>
+        <w:spacing w:after="80"/>
+        <w:ind w:left="425" w:leftChars="0" w:hanging="425" w:firstLineChars="0"/>
+        <w:rPr>
+          <w:rFonts w:hint="default" w:ascii="Times New Roman" w:hAnsi="Times New Roman" w:cs="Times New Roman"/>
+        </w:rPr>
+      </w:pPr>
+      <w:r>
+        <w:rPr>
+          <w:rFonts w:hint="default" w:ascii="Times New Roman" w:hAnsi="Times New Roman" w:cs="Times New Roman"/>
+        </w:rPr>
+        <w:t>Device capabilities like camera and GPS read better, and function better, as part of a real workflow (e.g. attendance check-in) than as standalone demo tabs — this changed how the app's navigation and dashboard were structured.</w:t>
+      </w:r>
+    </w:p>
+    <w:p>
+      <w:pPr>
+        <w:pStyle w:val="154"/>
+        <w:numPr>
+          <w:ilvl w:val="0"/>
+          <w:numId w:val="11"/>
+        </w:numPr>
+        <w:spacing w:after="80"/>
+        <w:ind w:left="425" w:leftChars="0" w:hanging="425" w:firstLineChars="0"/>
+      </w:pPr>
+      <w:r>
+        <w:t>A single mounted check right after an await is not always sufficient — every additional await after it reopens the same async-gap risk, so context use needs to be guarded right before it happens, not just once at the top of a function.</w:t>
+      </w:r>
+    </w:p>
+    <w:p>
+      <w:pPr>
+        <w:pStyle w:val="154"/>
+        <w:numPr>
+          <w:ilvl w:val="0"/>
+          <w:numId w:val="11"/>
+        </w:numPr>
+        <w:spacing w:after="80"/>
+        <w:ind w:left="425" w:leftChars="0" w:hanging="425" w:firstLineChars="0"/>
+      </w:pPr>
+      <w:r>
+        <w:t>Automated lint tooling (dart fix) can resolve the large majority of static analysis issues safely and quickly, leaving only a small number of issues that genuinely need a human decision.</w:t>
+      </w:r>
+    </w:p>
+    <w:p>
+      <w:pPr>
+        <w:pStyle w:val="154"/>
+        <w:numPr>
+          <w:ilvl w:val="0"/>
+          <w:numId w:val="11"/>
+        </w:numPr>
+        <w:spacing w:after="80"/>
+        <w:ind w:left="425" w:leftChars="0" w:hanging="425" w:firstLineChars="0"/>
+      </w:pPr>
+      <w:r>
+        <w:t>Decoding images at their actual on-screen size (cacheWidth/cacheHeight) rather than their source resolution is a simple, measurable way to reduce an app's memory footprint.</w:t>
+      </w:r>
+    </w:p>
+    <w:p>
+      <w:pPr>
+        <w:pStyle w:val="154"/>
+        <w:numPr>
+          <w:ilvl w:val="0"/>
+          <w:numId w:val="11"/>
+        </w:numPr>
+        <w:spacing w:after="80"/>
+        <w:ind w:left="425" w:leftChars="0" w:hanging="425" w:firstLineChars="0"/>
+      </w:pPr>
+      <w:r>
+        <w:t>Committing work in clear, incrementally scoped batches makes it much easier to reconstruct and document a semester's progress after the fact.</w:t>
       </w:r>
     </w:p>
     <w:p>
@@ -3236,26 +4766,409 @@
         <w:pStyle w:val="3"/>
       </w:pPr>
       <w:r>
-        <w:t>Testing Results</w:t>
+        <w:t>Future Improvements</w:t>
+      </w:r>
+    </w:p>
+    <w:p>
+      <w:pPr>
+        <w:pStyle w:val="154"/>
+        <w:numPr>
+          <w:ilvl w:val="0"/>
+          <w:numId w:val="12"/>
+        </w:numPr>
+        <w:spacing w:after="80"/>
+        <w:ind w:left="425" w:leftChars="0" w:hanging="425" w:firstLineChars="0"/>
+      </w:pPr>
+      <w:r>
+        <w:t>Persist the attendance check-in photo (or a checked-in timestamp/flag) to the backend via the attendance API, rather than only capturing it client-side.</w:t>
+      </w:r>
+    </w:p>
+    <w:p>
+      <w:pPr>
+        <w:pStyle w:val="154"/>
+        <w:numPr>
+          <w:ilvl w:val="0"/>
+          <w:numId w:val="12"/>
+        </w:numPr>
+        <w:spacing w:after="80"/>
+        <w:ind w:left="425" w:leftChars="0" w:hanging="425" w:firstLineChars="0"/>
+      </w:pPr>
+      <w:r>
+        <w:t>Add automated integration/widget tests for the check-in and login flows specifically, beyond the existing unit and widget test coverage.</w:t>
+      </w:r>
+    </w:p>
+    <w:p>
+      <w:pPr>
+        <w:pStyle w:val="154"/>
+        <w:numPr>
+          <w:ilvl w:val="0"/>
+          <w:numId w:val="12"/>
+        </w:numPr>
+        <w:spacing w:after="80"/>
+        <w:ind w:left="425" w:leftChars="0" w:hanging="425" w:firstLineChars="0"/>
+      </w:pPr>
+      <w:r>
+        <w:t>Investigate a stronger anti-spoofing approach for attendance check-in, such as a live camera preview, rather than relying on image_picker's native camera launch.</w:t>
+      </w:r>
+    </w:p>
+    <w:p>
+      <w:pPr>
+        <w:pStyle w:val="154"/>
+        <w:numPr>
+          <w:ilvl w:val="0"/>
+          <w:numId w:val="12"/>
+        </w:numPr>
+        <w:spacing w:after="80"/>
+        <w:ind w:left="425" w:leftChars="0" w:hanging="425" w:firstLineChars="0"/>
+      </w:pPr>
+      <w:r>
+        <w:t>Continue replacing any remaining deprecated API usage proactively in new code, rather than only cleaning it up in periodic passes.</w:t>
+      </w:r>
+    </w:p>
+    <w:p>
+      <w:r>
+        <w:br w:type="page"/>
       </w:r>
     </w:p>
     <w:p>
       <w:r>
         <w:br w:type="textWrapping"/>
       </w:r>
+    </w:p>
+    <w:p>
+      <w:r>
+        <w:br w:type="page"/>
+      </w:r>
+    </w:p>
+    <w:p>
+      <w:pPr>
+        <w:pStyle w:val="2"/>
+      </w:pPr>
+      <w:r>
+        <w:t>End of Semester Reflection</w:t>
+      </w:r>
+    </w:p>
+    <w:p>
+      <w:pPr>
+        <w:pStyle w:val="3"/>
+      </w:pPr>
+      <w:r>
+        <w:t>Summary of Skills Acquired</w:t>
+      </w:r>
+    </w:p>
+    <w:p>
+      <w:pPr>
+        <w:pStyle w:val="165"/>
+        <w:spacing w:after="200"/>
+        <w:rPr>
+          <w:rFonts w:hint="default" w:ascii="Times New Roman" w:hAnsi="Times New Roman" w:cs="Times New Roman"/>
+        </w:rPr>
+      </w:pPr>
+      <w:r>
+        <w:rPr>
+          <w:rFonts w:hint="default" w:ascii="Times New Roman" w:hAnsi="Times New Roman" w:cs="Times New Roman"/>
+        </w:rPr>
+        <w:t>Over the course of this project I built practical experience across the full stack of a mobile application: Flutter/Dart UI development and state management, integrating native device capabilities (camera and GPS) through platform packages, consuming and integrating REST APIs, working with local persistence, and using automated testing and static analysis as part of a normal development loop rather than an afterthought. I also strengthened my git workflow — organizing and committing work in clear, reviewable batches tied to weekly milestones.</w:t>
+      </w:r>
+    </w:p>
+    <w:p>
+      <w:pPr>
+        <w:rPr>
+          <w:b/>
+          <w:bCs/>
+          <w:color w:val="558ED5" w:themeColor="text2" w:themeTint="99"/>
+          <w14:textFill>
+            <w14:solidFill>
+              <w14:schemeClr w14:val="tx2">
+                <w14:lumMod w14:val="60000"/>
+                <w14:lumOff w14:val="40000"/>
+              </w14:schemeClr>
+            </w14:solidFill>
+          </w14:textFill>
+        </w:rPr>
+      </w:pPr>
+      <w:r>
+        <w:rPr>
+          <w:b/>
+          <w:bCs/>
+          <w:color w:val="558ED5" w:themeColor="text2" w:themeTint="99"/>
+          <w14:textFill>
+            <w14:solidFill>
+              <w14:schemeClr w14:val="tx2">
+                <w14:lumMod w14:val="60000"/>
+                <w14:lumOff w14:val="40000"/>
+              </w14:schemeClr>
+            </w14:solidFill>
+          </w14:textFill>
+        </w:rPr>
+        <w:t>Most Interesting Topic</w:t>
+      </w:r>
+    </w:p>
+    <w:p>
+      <w:pPr>
+        <w:rPr>
+          <w:rFonts w:hint="default" w:ascii="Times New Roman" w:hAnsi="Times New Roman" w:cs="Times New Roman"/>
+        </w:rPr>
+      </w:pPr>
+      <w:r>
+        <w:rPr>
+          <w:rFonts w:hint="default" w:ascii="Times New Roman" w:hAnsi="Times New Roman" w:cs="Times New Roman"/>
+        </w:rPr>
+        <w:t>The most interesting part of the project was rethinking how the camera and GPS features should actually work. My first instinct was to build them as their own screens, the way the weekly briefs described them individually — but once I stepped back and thought about how a real school portal behaves, it was clear those are capabilities that should support a workflow (like checking in to a class) rather than being destinations of their own. Making that change affected the navigation, the dashboard layout, and how I thought about the whole app's structure — much more so than I expected an easy feature request to.</w:t>
+      </w:r>
+    </w:p>
+    <w:p>
+      <w:pPr>
+        <w:rPr>
+          <w:rFonts w:hint="default" w:ascii="Times New Roman" w:hAnsi="Times New Roman" w:cs="Times New Roman"/>
+          <w:b/>
+          <w:bCs/>
+          <w:color w:val="558ED5" w:themeColor="text2" w:themeTint="99"/>
+          <w14:textFill>
+            <w14:solidFill>
+              <w14:schemeClr w14:val="tx2">
+                <w14:lumMod w14:val="60000"/>
+                <w14:lumOff w14:val="40000"/>
+              </w14:schemeClr>
+            </w14:solidFill>
+          </w14:textFill>
+        </w:rPr>
+      </w:pPr>
+      <w:r>
+        <w:rPr>
+          <w:rFonts w:hint="default" w:ascii="Times New Roman" w:hAnsi="Times New Roman" w:cs="Times New Roman"/>
+          <w:b/>
+          <w:bCs/>
+          <w:color w:val="558ED5" w:themeColor="text2" w:themeTint="99"/>
+          <w14:textFill>
+            <w14:solidFill>
+              <w14:schemeClr w14:val="tx2">
+                <w14:lumMod w14:val="60000"/>
+                <w14:lumOff w14:val="40000"/>
+              </w14:schemeClr>
+            </w14:solidFill>
+          </w14:textFill>
+        </w:rPr>
+        <w:t>Major Challenges Faced</w:t>
+      </w:r>
+    </w:p>
+    <w:p>
+      <w:pPr>
+        <w:pStyle w:val="154"/>
+        <w:numPr>
+          <w:ilvl w:val="0"/>
+          <w:numId w:val="13"/>
+        </w:numPr>
+        <w:spacing w:after="80"/>
+        <w:ind w:left="425" w:leftChars="0" w:hanging="425" w:firstLineChars="0"/>
+        <w:rPr>
+          <w:rFonts w:hint="default" w:ascii="Times New Roman" w:hAnsi="Times New Roman" w:cs="Times New Roman"/>
+        </w:rPr>
+      </w:pPr>
+      <w:r>
+        <w:rPr>
+          <w:rFonts w:hint="default" w:ascii="Times New Roman" w:hAnsi="Times New Roman" w:cs="Times New Roman"/>
+        </w:rPr>
+        <w:t>A widget test that failed intermittently due to a pending Timer left running after the widget tree was disposed — the root cause wasn't obvious from the test failure alone.</w:t>
+      </w:r>
+    </w:p>
+    <w:p>
+      <w:pPr>
+        <w:pStyle w:val="154"/>
+        <w:numPr>
+          <w:ilvl w:val="0"/>
+          <w:numId w:val="13"/>
+        </w:numPr>
+        <w:spacing w:after="80"/>
+        <w:ind w:left="425" w:leftChars="0" w:hanging="425" w:firstLineChars="0"/>
+        <w:rPr>
+          <w:rFonts w:hint="default" w:ascii="Times New Roman" w:hAnsi="Times New Roman" w:cs="Times New Roman"/>
+        </w:rPr>
+      </w:pPr>
+      <w:r>
+        <w:rPr>
+          <w:rFonts w:hint="default" w:ascii="Times New Roman" w:hAnsi="Times New Roman" w:cs="Times New Roman"/>
+        </w:rPr>
+        <w:t>Reworking navigation so the camera and GPS features moved out of standalone tabs and into the Join-class and login flows, without breaking the screens that already depended on them.</w:t>
+      </w:r>
+    </w:p>
+    <w:p>
+      <w:pPr>
+        <w:pStyle w:val="154"/>
+        <w:numPr>
+          <w:ilvl w:val="0"/>
+          <w:numId w:val="13"/>
+        </w:numPr>
+        <w:spacing w:after="80"/>
+        <w:ind w:left="425" w:leftChars="0" w:hanging="425" w:firstLineChars="0"/>
+        <w:rPr>
+          <w:rFonts w:hint="default" w:ascii="Times New Roman" w:hAnsi="Times New Roman" w:cs="Times New Roman"/>
+        </w:rPr>
+      </w:pPr>
+      <w:r>
+        <w:rPr>
+          <w:rFonts w:hint="default" w:ascii="Times New Roman" w:hAnsi="Times New Roman" w:cs="Times New Roman"/>
+        </w:rPr>
+        <w:t>Getting static analysis down to zero issues across a codebase that had accumulated deprecation warnings and lint suggestions over many weeks of incremental work.</w:t>
+      </w:r>
+    </w:p>
+    <w:p>
+      <w:pPr>
+        <w:rPr>
+          <w:b/>
+          <w:bCs/>
+          <w:color w:val="558ED5" w:themeColor="text2" w:themeTint="99"/>
+          <w:sz w:val="24"/>
+          <w:szCs w:val="24"/>
+          <w14:textFill>
+            <w14:solidFill>
+              <w14:schemeClr w14:val="tx2">
+                <w14:lumMod w14:val="60000"/>
+                <w14:lumOff w14:val="40000"/>
+              </w14:schemeClr>
+            </w14:solidFill>
+          </w14:textFill>
+        </w:rPr>
+      </w:pPr>
+      <w:r>
+        <w:rPr>
+          <w:b/>
+          <w:bCs/>
+          <w:color w:val="558ED5" w:themeColor="text2" w:themeTint="99"/>
+          <w:sz w:val="24"/>
+          <w:szCs w:val="24"/>
+          <w14:textFill>
+            <w14:solidFill>
+              <w14:schemeClr w14:val="tx2">
+                <w14:lumMod w14:val="60000"/>
+                <w14:lumOff w14:val="40000"/>
+              </w14:schemeClr>
+            </w14:solidFill>
+          </w14:textFill>
+        </w:rPr>
+        <w:t>How Challenges Were Overcome</w:t>
+      </w:r>
+    </w:p>
+    <w:p>
+      <w:pPr>
+        <w:pStyle w:val="165"/>
+        <w:spacing w:after="200"/>
+        <w:rPr>
+          <w:rFonts w:hint="default" w:ascii="Times New Roman" w:hAnsi="Times New Roman" w:cs="Times New Roman"/>
+        </w:rPr>
+      </w:pPr>
+      <w:r>
+        <w:rPr>
+          <w:rFonts w:hint="default" w:ascii="Times New Roman" w:hAnsi="Times New Roman" w:cs="Times New Roman"/>
+        </w:rPr>
+        <w:t>For the timer bug, I traced the failure to its actual source (an uncancelled Timer in the splash screen) rather than treating it as a flaky test, and fixed it at the root by making the timer cancellable in dispose(). For the navigation rework, I worked through the change file by file — check-in screen first, then the screen that triggers it, then the dashboard — and re-ran the test suite after each step to catch regressions early rather than all at once at the end. For the lint cleanup, I used dart fix --apply for the safe, mechanical fixes first, which let me focus my own attention on the small number of issues that actually needed a decision.</w:t>
+      </w:r>
+    </w:p>
+    <w:p>
+      <w:pPr>
+        <w:rPr>
+          <w:rFonts w:hint="default" w:ascii="Times New Roman" w:hAnsi="Times New Roman" w:cs="Times New Roman"/>
+          <w:b/>
+          <w:bCs/>
+          <w:color w:val="558ED5" w:themeColor="text2" w:themeTint="99"/>
+          <w:sz w:val="24"/>
+          <w:szCs w:val="24"/>
+          <w14:textFill>
+            <w14:solidFill>
+              <w14:schemeClr w14:val="tx2">
+                <w14:lumMod w14:val="60000"/>
+                <w14:lumOff w14:val="40000"/>
+              </w14:schemeClr>
+            </w14:solidFill>
+          </w14:textFill>
+        </w:rPr>
+      </w:pPr>
+      <w:r>
+        <w:rPr>
+          <w:rFonts w:hint="default" w:ascii="Times New Roman" w:hAnsi="Times New Roman" w:cs="Times New Roman"/>
+          <w:b/>
+          <w:bCs/>
+          <w:color w:val="558ED5" w:themeColor="text2" w:themeTint="99"/>
+          <w:sz w:val="24"/>
+          <w:szCs w:val="24"/>
+          <w14:textFill>
+            <w14:solidFill>
+              <w14:schemeClr w14:val="tx2">
+                <w14:lumMod w14:val="60000"/>
+                <w14:lumOff w14:val="40000"/>
+              </w14:schemeClr>
+            </w14:solidFill>
+          </w14:textFill>
+        </w:rPr>
+        <w:t>Professional Growth Achieved</w:t>
+      </w:r>
+    </w:p>
+    <w:p>
+      <w:pPr>
+        <w:pStyle w:val="165"/>
+        <w:spacing w:after="200"/>
+        <w:rPr>
+          <w:rFonts w:hint="default" w:ascii="Times New Roman" w:hAnsi="Times New Roman" w:cs="Times New Roman"/>
+        </w:rPr>
+      </w:pPr>
+      <w:r>
+        <w:rPr>
+          <w:rFonts w:hint="default" w:ascii="Times New Roman" w:hAnsi="Times New Roman" w:cs="Times New Roman"/>
+        </w:rPr>
+        <w:t>I came out of this project much more comfortable treating testing and static analysis as running checkpoints rather than a final step — verifying after every meaningful change, not just before submission. I also grew more deliberate about commit hygiene, organizing changes into clear, scoped batches that tell an honest story of how the project actually progressed, which made writing this documentation far easier than it would have been from memory alone.</w:t>
+      </w:r>
+    </w:p>
+    <w:p>
       <w:r>
         <w:br w:type="textWrapping"/>
       </w:r>
     </w:p>
     <w:p>
       <w:pPr>
-        <w:pStyle w:val="3"/>
-      </w:pPr>
-      <w:r>
-        <w:t>Lessons Learned</w:t>
-      </w:r>
-    </w:p>
-    <w:p>
+        <w:rPr>
+          <w:rFonts w:hint="default" w:ascii="Times New Roman" w:hAnsi="Times New Roman" w:cs="Times New Roman"/>
+          <w:b/>
+          <w:bCs/>
+          <w:color w:val="558ED5" w:themeColor="text2" w:themeTint="99"/>
+          <w:sz w:val="24"/>
+          <w:szCs w:val="24"/>
+          <w14:textFill>
+            <w14:solidFill>
+              <w14:schemeClr w14:val="tx2">
+                <w14:lumMod w14:val="60000"/>
+                <w14:lumOff w14:val="40000"/>
+              </w14:schemeClr>
+            </w14:solidFill>
+          </w14:textFill>
+        </w:rPr>
+      </w:pPr>
+      <w:r>
+        <w:rPr>
+          <w:rFonts w:hint="default" w:ascii="Times New Roman" w:hAnsi="Times New Roman" w:cs="Times New Roman"/>
+          <w:b/>
+          <w:bCs/>
+          <w:color w:val="558ED5" w:themeColor="text2" w:themeTint="99"/>
+          <w:sz w:val="24"/>
+          <w:szCs w:val="24"/>
+          <w14:textFill>
+            <w14:solidFill>
+              <w14:schemeClr w14:val="tx2">
+                <w14:lumMod w14:val="60000"/>
+                <w14:lumOff w14:val="40000"/>
+              </w14:schemeClr>
+            </w14:solidFill>
+          </w14:textFill>
+        </w:rPr>
+        <w:t>Overall Course Experience</w:t>
+      </w:r>
+    </w:p>
+    <w:p>
+      <w:r>
+        <w:rPr>
+          <w:rFonts w:hint="default" w:ascii="Times New Roman" w:hAnsi="Times New Roman" w:cs="Times New Roman"/>
+        </w:rPr>
+        <w:t xml:space="preserve">Overall, this project gave me a realistic sense of what building and finishing a non-trivial mobile app actually involves — not just writing features, but testing them, cleaning them up, and being able to explain the decisions behind them. </w:t>
+      </w:r>
       <w:r>
         <w:br w:type="textWrapping"/>
       </w:r>
@@ -3265,140 +5178,447 @@
     </w:p>
     <w:p>
       <w:pPr>
-        <w:pStyle w:val="3"/>
-      </w:pPr>
-      <w:r>
-        <w:t>Future Improvements</w:t>
-      </w:r>
-    </w:p>
-    <w:p>
-      <w:r>
-        <w:br w:type="textWrapping"/>
-      </w:r>
-      <w:r>
-        <w:br w:type="textWrapping"/>
-      </w:r>
-    </w:p>
-    <w:p>
-      <w:r>
-        <w:br w:type="page"/>
-      </w:r>
-    </w:p>
-    <w:p>
-      <w:pPr>
         <w:pStyle w:val="2"/>
       </w:pPr>
       <w:r>
-        <w:t>End of Semester Reflection</w:t>
-      </w:r>
-    </w:p>
-    <w:p>
-      <w:pPr>
-        <w:pStyle w:val="3"/>
-      </w:pPr>
-      <w:r>
-        <w:t>Summary of Skills Acquired</w:t>
-      </w:r>
-    </w:p>
-    <w:p>
-      <w:r>
-        <w:br w:type="textWrapping"/>
-      </w:r>
-      <w:r>
-        <w:br w:type="textWrapping"/>
-      </w:r>
-    </w:p>
-    <w:p>
-      <w:pPr>
-        <w:pStyle w:val="3"/>
-      </w:pPr>
-      <w:r>
-        <w:t>Most Interesting Topic</w:t>
-      </w:r>
-    </w:p>
-    <w:p>
-      <w:r>
-        <w:br w:type="textWrapping"/>
-      </w:r>
-      <w:r>
-        <w:br w:type="textWrapping"/>
-      </w:r>
-    </w:p>
-    <w:p>
-      <w:pPr>
-        <w:pStyle w:val="3"/>
-      </w:pPr>
-      <w:r>
-        <w:t>Major Challenges Faced</w:t>
-      </w:r>
-    </w:p>
-    <w:p>
-      <w:r>
-        <w:br w:type="textWrapping"/>
-      </w:r>
-      <w:r>
-        <w:br w:type="textWrapping"/>
-      </w:r>
-    </w:p>
-    <w:p>
-      <w:pPr>
-        <w:pStyle w:val="3"/>
-      </w:pPr>
-      <w:r>
-        <w:t>How Challenges Were Overcome</w:t>
-      </w:r>
-    </w:p>
-    <w:p>
-      <w:r>
-        <w:br w:type="textWrapping"/>
-      </w:r>
-      <w:r>
-        <w:br w:type="textWrapping"/>
-      </w:r>
-    </w:p>
-    <w:p>
-      <w:pPr>
-        <w:pStyle w:val="3"/>
-      </w:pPr>
-      <w:r>
-        <w:t>Professional Growth Achieved</w:t>
-      </w:r>
-    </w:p>
-    <w:p>
-      <w:r>
-        <w:br w:type="textWrapping"/>
-      </w:r>
-      <w:r>
-        <w:br w:type="textWrapping"/>
-      </w:r>
-    </w:p>
-    <w:p>
-      <w:pPr>
-        <w:pStyle w:val="3"/>
-      </w:pPr>
-      <w:r>
-        <w:t>Overall Course Experience</w:t>
-      </w:r>
-    </w:p>
-    <w:p>
-      <w:r>
-        <w:br w:type="textWrapping"/>
-      </w:r>
-      <w:r>
-        <w:br w:type="textWrapping"/>
-      </w:r>
-    </w:p>
-    <w:p>
-      <w:pPr>
-        <w:pStyle w:val="2"/>
-      </w:pPr>
-      <w:r>
         <w:t>Final Approval</w:t>
       </w:r>
     </w:p>
     <w:p>
       <w:r>
-        <w:t>Student Name: __________________________</w:t>
+        <w:rPr>
+          <w:sz w:val="22"/>
+        </w:rPr>
+        <mc:AlternateContent>
+          <mc:Choice Requires="wps">
+            <w:drawing>
+              <wp:anchor distT="0" distB="0" distL="114300" distR="114300" simplePos="0" relativeHeight="251659264" behindDoc="0" locked="0" layoutInCell="1" allowOverlap="1">
+                <wp:simplePos x="0" y="0"/>
+                <wp:positionH relativeFrom="column">
+                  <wp:posOffset>1214755</wp:posOffset>
+                </wp:positionH>
+                <wp:positionV relativeFrom="paragraph">
+                  <wp:posOffset>183515</wp:posOffset>
+                </wp:positionV>
+                <wp:extent cx="600075" cy="280670"/>
+                <wp:effectExtent l="12700" t="12700" r="15875" b="30480"/>
+                <wp:wrapNone/>
+                <wp:docPr id="33" name="Freeform 33"/>
+                <wp:cNvGraphicFramePr/>
+                <a:graphic xmlns:a="http://schemas.openxmlformats.org/drawingml/2006/main">
+                  <a:graphicData uri="http://schemas.microsoft.com/office/word/2010/wordprocessingShape">
+                    <wps:wsp>
+                      <wps:cNvSpPr/>
+                      <wps:spPr>
+                        <a:xfrm>
+                          <a:off x="2357755" y="7444740"/>
+                          <a:ext cx="600075" cy="280670"/>
+                        </a:xfrm>
+                        <a:custGeom>
+                          <a:avLst/>
+                          <a:gdLst>
+                            <a:gd name="connisteX0" fmla="*/ 85957 w 600307"/>
+                            <a:gd name="connsiteY0" fmla="*/ 136034 h 280775"/>
+                            <a:gd name="connisteX1" fmla="*/ 95482 w 600307"/>
+                            <a:gd name="connsiteY1" fmla="*/ 202709 h 280775"/>
+                            <a:gd name="connisteX2" fmla="*/ 162157 w 600307"/>
+                            <a:gd name="connsiteY2" fmla="*/ 259859 h 280775"/>
+                            <a:gd name="connisteX3" fmla="*/ 200257 w 600307"/>
+                            <a:gd name="connsiteY3" fmla="*/ 174134 h 280775"/>
+                            <a:gd name="connisteX4" fmla="*/ 257407 w 600307"/>
+                            <a:gd name="connsiteY4" fmla="*/ 88409 h 280775"/>
+                            <a:gd name="connisteX5" fmla="*/ 266932 w 600307"/>
+                            <a:gd name="connsiteY5" fmla="*/ 155084 h 280775"/>
+                            <a:gd name="connisteX6" fmla="*/ 285982 w 600307"/>
+                            <a:gd name="connsiteY6" fmla="*/ 221759 h 280775"/>
+                            <a:gd name="connisteX7" fmla="*/ 352657 w 600307"/>
+                            <a:gd name="connsiteY7" fmla="*/ 278909 h 280775"/>
+                            <a:gd name="connisteX8" fmla="*/ 371707 w 600307"/>
+                            <a:gd name="connsiteY8" fmla="*/ 164609 h 280775"/>
+                            <a:gd name="connisteX9" fmla="*/ 381232 w 600307"/>
+                            <a:gd name="connsiteY9" fmla="*/ 78884 h 280775"/>
+                            <a:gd name="connisteX10" fmla="*/ 381232 w 600307"/>
+                            <a:gd name="connsiteY10" fmla="*/ 12209 h 280775"/>
+                            <a:gd name="connisteX11" fmla="*/ 314557 w 600307"/>
+                            <a:gd name="connsiteY11" fmla="*/ 2684 h 280775"/>
+                            <a:gd name="connisteX12" fmla="*/ 228832 w 600307"/>
+                            <a:gd name="connsiteY12" fmla="*/ 31259 h 280775"/>
+                            <a:gd name="connisteX13" fmla="*/ 152632 w 600307"/>
+                            <a:gd name="connsiteY13" fmla="*/ 50309 h 280775"/>
+                            <a:gd name="connisteX14" fmla="*/ 85957 w 600307"/>
+                            <a:gd name="connsiteY14" fmla="*/ 78884 h 280775"/>
+                            <a:gd name="connisteX15" fmla="*/ 209782 w 600307"/>
+                            <a:gd name="connsiteY15" fmla="*/ 126509 h 280775"/>
+                            <a:gd name="connisteX16" fmla="*/ 285982 w 600307"/>
+                            <a:gd name="connsiteY16" fmla="*/ 116984 h 280775"/>
+                            <a:gd name="connisteX17" fmla="*/ 362182 w 600307"/>
+                            <a:gd name="connsiteY17" fmla="*/ 116984 h 280775"/>
+                            <a:gd name="connisteX18" fmla="*/ 428857 w 600307"/>
+                            <a:gd name="connsiteY18" fmla="*/ 116984 h 280775"/>
+                            <a:gd name="connisteX19" fmla="*/ 381232 w 600307"/>
+                            <a:gd name="connsiteY19" fmla="*/ 193184 h 280775"/>
+                            <a:gd name="connisteX20" fmla="*/ 276457 w 600307"/>
+                            <a:gd name="connsiteY20" fmla="*/ 212234 h 280775"/>
+                            <a:gd name="connisteX21" fmla="*/ 209782 w 600307"/>
+                            <a:gd name="connsiteY21" fmla="*/ 231284 h 280775"/>
+                            <a:gd name="connisteX22" fmla="*/ 133582 w 600307"/>
+                            <a:gd name="connsiteY22" fmla="*/ 240809 h 280775"/>
+                            <a:gd name="connisteX23" fmla="*/ 66907 w 600307"/>
+                            <a:gd name="connsiteY23" fmla="*/ 231284 h 280775"/>
+                            <a:gd name="connisteX24" fmla="*/ 232 w 600307"/>
+                            <a:gd name="connsiteY24" fmla="*/ 212234 h 280775"/>
+                            <a:gd name="connisteX25" fmla="*/ 85957 w 600307"/>
+                            <a:gd name="connsiteY25" fmla="*/ 155084 h 280775"/>
+                            <a:gd name="connisteX26" fmla="*/ 171682 w 600307"/>
+                            <a:gd name="connsiteY26" fmla="*/ 164609 h 280775"/>
+                            <a:gd name="connisteX27" fmla="*/ 238357 w 600307"/>
+                            <a:gd name="connsiteY27" fmla="*/ 174134 h 280775"/>
+                            <a:gd name="connisteX28" fmla="*/ 314557 w 600307"/>
+                            <a:gd name="connsiteY28" fmla="*/ 174134 h 280775"/>
+                            <a:gd name="connisteX29" fmla="*/ 390757 w 600307"/>
+                            <a:gd name="connsiteY29" fmla="*/ 174134 h 280775"/>
+                            <a:gd name="connisteX30" fmla="*/ 466957 w 600307"/>
+                            <a:gd name="connsiteY30" fmla="*/ 155084 h 280775"/>
+                            <a:gd name="connisteX31" fmla="*/ 533632 w 600307"/>
+                            <a:gd name="connsiteY31" fmla="*/ 155084 h 280775"/>
+                            <a:gd name="connisteX32" fmla="*/ 600307 w 600307"/>
+                            <a:gd name="connsiteY32" fmla="*/ 155084 h 280775"/>
+                          </a:gdLst>
+                          <a:ahLst/>
+                          <a:cxnLst>
+                            <a:cxn ang="0">
+                              <a:pos x="connisteX0" y="connsiteY0"/>
+                            </a:cxn>
+                            <a:cxn ang="0">
+                              <a:pos x="connisteX1" y="connsiteY1"/>
+                            </a:cxn>
+                            <a:cxn ang="0">
+                              <a:pos x="connisteX2" y="connsiteY2"/>
+                            </a:cxn>
+                            <a:cxn ang="0">
+                              <a:pos x="connisteX3" y="connsiteY3"/>
+                            </a:cxn>
+                            <a:cxn ang="0">
+                              <a:pos x="connisteX4" y="connsiteY4"/>
+                            </a:cxn>
+                            <a:cxn ang="0">
+                              <a:pos x="connisteX5" y="connsiteY5"/>
+                            </a:cxn>
+                            <a:cxn ang="0">
+                              <a:pos x="connisteX6" y="connsiteY6"/>
+                            </a:cxn>
+                            <a:cxn ang="0">
+                              <a:pos x="connisteX7" y="connsiteY7"/>
+                            </a:cxn>
+                            <a:cxn ang="0">
+                              <a:pos x="connisteX8" y="connsiteY8"/>
+                            </a:cxn>
+                            <a:cxn ang="0">
+                              <a:pos x="connisteX9" y="connsiteY9"/>
+                            </a:cxn>
+                            <a:cxn ang="0">
+                              <a:pos x="connisteX10" y="connsiteY10"/>
+                            </a:cxn>
+                            <a:cxn ang="0">
+                              <a:pos x="connisteX11" y="connsiteY11"/>
+                            </a:cxn>
+                            <a:cxn ang="0">
+                              <a:pos x="connisteX12" y="connsiteY12"/>
+                            </a:cxn>
+                            <a:cxn ang="0">
+                              <a:pos x="connisteX13" y="connsiteY13"/>
+                            </a:cxn>
+                            <a:cxn ang="0">
+                              <a:pos x="connisteX14" y="connsiteY14"/>
+                            </a:cxn>
+                            <a:cxn ang="0">
+                              <a:pos x="connisteX15" y="connsiteY15"/>
+                            </a:cxn>
+                            <a:cxn ang="0">
+                              <a:pos x="connisteX16" y="connsiteY16"/>
+                            </a:cxn>
+                            <a:cxn ang="0">
+                              <a:pos x="connisteX17" y="connsiteY17"/>
+                            </a:cxn>
+                            <a:cxn ang="0">
+                              <a:pos x="connisteX18" y="connsiteY18"/>
+                            </a:cxn>
+                            <a:cxn ang="0">
+                              <a:pos x="connisteX19" y="connsiteY19"/>
+                            </a:cxn>
+                            <a:cxn ang="0">
+                              <a:pos x="connisteX20" y="connsiteY20"/>
+                            </a:cxn>
+                            <a:cxn ang="0">
+                              <a:pos x="connisteX21" y="connsiteY21"/>
+                            </a:cxn>
+                            <a:cxn ang="0">
+                              <a:pos x="connisteX22" y="connsiteY22"/>
+                            </a:cxn>
+                            <a:cxn ang="0">
+                              <a:pos x="connisteX23" y="connsiteY23"/>
+                            </a:cxn>
+                            <a:cxn ang="0">
+                              <a:pos x="connisteX24" y="connsiteY24"/>
+                            </a:cxn>
+                            <a:cxn ang="0">
+                              <a:pos x="connisteX25" y="connsiteY25"/>
+                            </a:cxn>
+                            <a:cxn ang="0">
+                              <a:pos x="connisteX26" y="connsiteY26"/>
+                            </a:cxn>
+                            <a:cxn ang="0">
+                              <a:pos x="connisteX27" y="connsiteY27"/>
+                            </a:cxn>
+                            <a:cxn ang="0">
+                              <a:pos x="connisteX28" y="connsiteY28"/>
+                            </a:cxn>
+                            <a:cxn ang="0">
+                              <a:pos x="connisteX29" y="connsiteY29"/>
+                            </a:cxn>
+                            <a:cxn ang="0">
+                              <a:pos x="connisteX30" y="connsiteY30"/>
+                            </a:cxn>
+                            <a:cxn ang="0">
+                              <a:pos x="connisteX31" y="connsiteY31"/>
+                            </a:cxn>
+                            <a:cxn ang="0">
+                              <a:pos x="connisteX32" y="connsiteY32"/>
+                            </a:cxn>
+                          </a:cxnLst>
+                          <a:rect l="l" t="t" r="r" b="b"/>
+                          <a:pathLst>
+                            <a:path w="600308" h="280775">
+                              <a:moveTo>
+                                <a:pt x="85958" y="136034"/>
+                              </a:moveTo>
+                              <a:cubicBezTo>
+                                <a:pt x="86593" y="148099"/>
+                                <a:pt x="80243" y="177944"/>
+                                <a:pt x="95483" y="202709"/>
+                              </a:cubicBezTo>
+                              <a:cubicBezTo>
+                                <a:pt x="110723" y="227474"/>
+                                <a:pt x="141203" y="265574"/>
+                                <a:pt x="162158" y="259859"/>
+                              </a:cubicBezTo>
+                              <a:cubicBezTo>
+                                <a:pt x="183113" y="254144"/>
+                                <a:pt x="181208" y="208424"/>
+                                <a:pt x="200258" y="174134"/>
+                              </a:cubicBezTo>
+                              <a:cubicBezTo>
+                                <a:pt x="219308" y="139844"/>
+                                <a:pt x="244073" y="92219"/>
+                                <a:pt x="257408" y="88409"/>
+                              </a:cubicBezTo>
+                              <a:cubicBezTo>
+                                <a:pt x="270743" y="84599"/>
+                                <a:pt x="261218" y="128414"/>
+                                <a:pt x="266933" y="155084"/>
+                              </a:cubicBezTo>
+                              <a:cubicBezTo>
+                                <a:pt x="272648" y="181754"/>
+                                <a:pt x="268838" y="196994"/>
+                                <a:pt x="285983" y="221759"/>
+                              </a:cubicBezTo>
+                              <a:cubicBezTo>
+                                <a:pt x="303128" y="246524"/>
+                                <a:pt x="335513" y="290339"/>
+                                <a:pt x="352658" y="278909"/>
+                              </a:cubicBezTo>
+                              <a:cubicBezTo>
+                                <a:pt x="369803" y="267479"/>
+                                <a:pt x="365993" y="204614"/>
+                                <a:pt x="371708" y="164609"/>
+                              </a:cubicBezTo>
+                              <a:cubicBezTo>
+                                <a:pt x="377423" y="124604"/>
+                                <a:pt x="379328" y="109364"/>
+                                <a:pt x="381233" y="78884"/>
+                              </a:cubicBezTo>
+                              <a:cubicBezTo>
+                                <a:pt x="383138" y="48404"/>
+                                <a:pt x="394568" y="27449"/>
+                                <a:pt x="381233" y="12209"/>
+                              </a:cubicBezTo>
+                              <a:cubicBezTo>
+                                <a:pt x="367898" y="-3031"/>
+                                <a:pt x="345038" y="-1126"/>
+                                <a:pt x="314558" y="2684"/>
+                              </a:cubicBezTo>
+                              <a:cubicBezTo>
+                                <a:pt x="284078" y="6494"/>
+                                <a:pt x="261218" y="21734"/>
+                                <a:pt x="228833" y="31259"/>
+                              </a:cubicBezTo>
+                              <a:cubicBezTo>
+                                <a:pt x="196448" y="40784"/>
+                                <a:pt x="181208" y="40784"/>
+                                <a:pt x="152633" y="50309"/>
+                              </a:cubicBezTo>
+                              <a:cubicBezTo>
+                                <a:pt x="124058" y="59834"/>
+                                <a:pt x="74528" y="63644"/>
+                                <a:pt x="85958" y="78884"/>
+                              </a:cubicBezTo>
+                              <a:cubicBezTo>
+                                <a:pt x="97388" y="94124"/>
+                                <a:pt x="169778" y="118889"/>
+                                <a:pt x="209783" y="126509"/>
+                              </a:cubicBezTo>
+                              <a:cubicBezTo>
+                                <a:pt x="249788" y="134129"/>
+                                <a:pt x="255503" y="118889"/>
+                                <a:pt x="285983" y="116984"/>
+                              </a:cubicBezTo>
+                              <a:cubicBezTo>
+                                <a:pt x="316463" y="115079"/>
+                                <a:pt x="333608" y="116984"/>
+                                <a:pt x="362183" y="116984"/>
+                              </a:cubicBezTo>
+                              <a:cubicBezTo>
+                                <a:pt x="390758" y="116984"/>
+                                <a:pt x="425048" y="101744"/>
+                                <a:pt x="428858" y="116984"/>
+                              </a:cubicBezTo>
+                              <a:cubicBezTo>
+                                <a:pt x="432668" y="132224"/>
+                                <a:pt x="411713" y="174134"/>
+                                <a:pt x="381233" y="193184"/>
+                              </a:cubicBezTo>
+                              <a:cubicBezTo>
+                                <a:pt x="350753" y="212234"/>
+                                <a:pt x="310748" y="204614"/>
+                                <a:pt x="276458" y="212234"/>
+                              </a:cubicBezTo>
+                              <a:cubicBezTo>
+                                <a:pt x="242168" y="219854"/>
+                                <a:pt x="238358" y="225569"/>
+                                <a:pt x="209783" y="231284"/>
+                              </a:cubicBezTo>
+                              <a:cubicBezTo>
+                                <a:pt x="181208" y="236999"/>
+                                <a:pt x="162158" y="240809"/>
+                                <a:pt x="133583" y="240809"/>
+                              </a:cubicBezTo>
+                              <a:cubicBezTo>
+                                <a:pt x="105008" y="240809"/>
+                                <a:pt x="93578" y="236999"/>
+                                <a:pt x="66908" y="231284"/>
+                              </a:cubicBezTo>
+                              <a:cubicBezTo>
+                                <a:pt x="40238" y="225569"/>
+                                <a:pt x="-3577" y="227474"/>
+                                <a:pt x="233" y="212234"/>
+                              </a:cubicBezTo>
+                              <a:cubicBezTo>
+                                <a:pt x="4043" y="196994"/>
+                                <a:pt x="51668" y="164609"/>
+                                <a:pt x="85958" y="155084"/>
+                              </a:cubicBezTo>
+                              <a:cubicBezTo>
+                                <a:pt x="120248" y="145559"/>
+                                <a:pt x="141203" y="160799"/>
+                                <a:pt x="171683" y="164609"/>
+                              </a:cubicBezTo>
+                              <a:cubicBezTo>
+                                <a:pt x="202163" y="168419"/>
+                                <a:pt x="209783" y="172229"/>
+                                <a:pt x="238358" y="174134"/>
+                              </a:cubicBezTo>
+                              <a:cubicBezTo>
+                                <a:pt x="266933" y="176039"/>
+                                <a:pt x="284078" y="174134"/>
+                                <a:pt x="314558" y="174134"/>
+                              </a:cubicBezTo>
+                              <a:cubicBezTo>
+                                <a:pt x="345038" y="174134"/>
+                                <a:pt x="360278" y="177944"/>
+                                <a:pt x="390758" y="174134"/>
+                              </a:cubicBezTo>
+                              <a:cubicBezTo>
+                                <a:pt x="421238" y="170324"/>
+                                <a:pt x="438383" y="158894"/>
+                                <a:pt x="466958" y="155084"/>
+                              </a:cubicBezTo>
+                              <a:cubicBezTo>
+                                <a:pt x="495533" y="151274"/>
+                                <a:pt x="506963" y="155084"/>
+                                <a:pt x="533633" y="155084"/>
+                              </a:cubicBezTo>
+                              <a:cubicBezTo>
+                                <a:pt x="560303" y="155084"/>
+                                <a:pt x="588243" y="155084"/>
+                                <a:pt x="600308" y="155084"/>
+                              </a:cubicBezTo>
+                            </a:path>
+                          </a:pathLst>
+                        </a:custGeom>
+                        <a:noFill/>
+                        <a:ln>
+                          <a:solidFill>
+                            <a:schemeClr val="tx1"/>
+                          </a:solidFill>
+                        </a:ln>
+                        <a:extLst>
+                          <a:ext uri="{909E8E84-426E-40DD-AFC4-6F175D3DCCD1}">
+                            <a14:hiddenFill xmlns:a14="http://schemas.microsoft.com/office/drawing/2010/main">
+                              <a:solidFill>
+                                <a:schemeClr val="tx1"/>
+                              </a:solidFill>
+                            </a14:hiddenFill>
+                          </a:ext>
+                        </a:extLst>
+                      </wps:spPr>
+                      <wps:style>
+                        <a:lnRef idx="2">
+                          <a:schemeClr val="accent1">
+                            <a:lumMod val="75000"/>
+                          </a:schemeClr>
+                        </a:lnRef>
+                        <a:fillRef idx="1">
+                          <a:schemeClr val="accent1"/>
+                        </a:fillRef>
+                        <a:effectRef idx="0">
+                          <a:srgbClr val="FFFFFF"/>
+                        </a:effectRef>
+                        <a:fontRef idx="minor">
+                          <a:schemeClr val="lt1"/>
+                        </a:fontRef>
+                      </wps:style>
+                      <wps:bodyPr/>
+                    </wps:wsp>
+                  </a:graphicData>
+                </a:graphic>
+              </wp:anchor>
+            </w:drawing>
+          </mc:Choice>
+          <mc:Fallback>
+            <w:pict>
+              <v:shape id="_x0000_s1026" o:spid="_x0000_s1026" o:spt="100" style="position:absolute;left:0pt;margin-left:95.65pt;margin-top:14.45pt;height:22.1pt;width:47.25pt;z-index:251659264;mso-width-relative:page;mso-height-relative:page;" filled="f" stroked="t" coordsize="600307,280775" o:gfxdata="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" path="m85957,136034c86592,148099,80242,177944,95482,202709c110722,227474,141202,265574,162157,259859c183112,254144,181207,208424,200257,174134c219307,139844,244072,92219,257407,88409c270742,84599,261217,128414,266932,155084c272647,181754,268837,196994,285982,221759c303127,246524,335512,290339,352657,278909c369802,267479,365992,204614,371707,164609c377422,124604,379327,109364,381232,78884c383137,48404,394567,27449,381232,12209c367897,-3030,345037,-1125,314557,2684c284077,6494,261217,21734,228832,31259c196447,40784,181207,40784,152632,50309c124057,59834,74527,63644,85957,78884c97387,94124,169777,118889,209782,126509c249787,134129,255502,118889,285982,116984c316462,115079,333607,116984,362182,116984c390757,116984,425047,101744,428857,116984c432667,132224,411712,174134,381232,193184c350752,212234,310747,204614,276457,212234c242167,219854,238357,225569,209782,231284c181207,236999,162157,240809,133582,240809c105007,240809,93577,236999,66907,231284c40237,225569,-3577,227474,232,212234c4042,196994,51667,164609,85957,155084c120247,145559,141202,160799,171682,164609c202162,168419,209782,172229,238357,174134c266932,176039,284077,174134,314557,174134c345037,174134,360277,177944,390757,174134c421237,170324,438382,158894,466957,155084c495532,151274,506962,155084,533632,155084c560302,155084,588242,155084,600307,155084e">
+                <v:path o:connectlocs="85924,135983;95445,202633;162095,259761;200180,174069;257308,88376;266829,155026;285871,221676;352521,278804;371563,164547;381085,78854;381085,12204;314435,2683;228744,31247;152573,50290;85924,78854;209701,126461;285871,116940;362042,116940;428691,116940;381085,193111;276350,212154;209701,231197;133531,240719;66881,231197;232,212154;85924,155026;171616,164547;238265,174069;314435,174069;390606,174069;466776,155026;533425,155026;600075,155026" o:connectangles="0,0,0,0,0,0,0,0,0,0,0,0,0,0,0,0,0,0,0,0,0,0,0,0,0,0,0,0,0,0,0,0,0"/>
+                <v:fill on="f" focussize="0,0"/>
+                <v:stroke weight="2pt" color="#000000 [3213]" joinstyle="round"/>
+                <v:imagedata o:title=""/>
+                <o:lock v:ext="edit" aspectratio="f"/>
+              </v:shape>
+            </w:pict>
+          </mc:Fallback>
+        </mc:AlternateContent>
+      </w:r>
+      <w:r>
+        <w:t>Student Name: ___</w:t>
+      </w:r>
+      <w:r>
+        <w:rPr>
+          <w:rFonts w:hint="default"/>
+          <w:lang w:val="en-US"/>
+        </w:rPr>
+        <w:t>Wilkester Ngatia</w:t>
+      </w:r>
+      <w:r>
+        <w:t>_______________________</w:t>
       </w:r>
     </w:p>
     <w:p>
@@ -3408,12 +5628,22 @@
     </w:p>
     <w:p>
       <w:r>
-        <w:t>Date: _________________________________</w:t>
-      </w:r>
-    </w:p>
-    <w:p>
-      <w:r>
-        <w:t>Lecturer Name: _________________________</w:t>
+        <w:t>Date: _________</w:t>
+      </w:r>
+      <w:r>
+        <w:rPr>
+          <w:rFonts w:hint="default"/>
+          <w:lang w:val="en-US"/>
+        </w:rPr>
+        <w:t>17/7/2026</w:t>
+      </w:r>
+      <w:r>
+        <w:t>________________________</w:t>
+      </w:r>
+    </w:p>
+    <w:p>
+      <w:r>
+        <w:t>Lecturer Name: ________________________</w:t>
       </w:r>
     </w:p>
     <w:p>
@@ -3518,6 +5748,26 @@
     </w:lvl>
   </w:abstractNum>
   <w:abstractNum w:abstractNumId="1">
+    <w:nsid w:val="B1ACA02B"/>
+    <w:multiLevelType w:val="singleLevel"/>
+    <w:tmpl w:val="B1ACA02B"/>
+    <w:lvl w:ilvl="0" w:tentative="0">
+      <w:start w:val="1"/>
+      <w:numFmt w:val="decimal"/>
+      <w:lvlText w:val="%1."/>
+      <w:lvlJc w:val="left"/>
+      <w:pPr>
+        <w:tabs>
+          <w:tab w:val="left" w:pos="425"/>
+        </w:tabs>
+        <w:ind w:left="425" w:leftChars="0" w:hanging="425" w:firstLineChars="0"/>
+      </w:pPr>
+      <w:rPr>
+        <w:rFonts w:hint="default"/>
+      </w:rPr>
+    </w:lvl>
+  </w:abstractNum>
+  <w:abstractNum w:abstractNumId="2">
     <w:nsid w:val="00000002"/>
     <w:multiLevelType w:val="singleLevel"/>
     <w:tmpl w:val="00000002"/>
@@ -3535,7 +5785,7 @@
       </w:pPr>
     </w:lvl>
   </w:abstractNum>
-  <w:abstractNum w:abstractNumId="2">
+  <w:abstractNum w:abstractNumId="3">
     <w:nsid w:val="00000003"/>
     <w:multiLevelType w:val="singleLevel"/>
     <w:tmpl w:val="00000003"/>
@@ -3553,7 +5803,7 @@
       </w:pPr>
     </w:lvl>
   </w:abstractNum>
-  <w:abstractNum w:abstractNumId="3">
+  <w:abstractNum w:abstractNumId="4">
     <w:nsid w:val="00000005"/>
     <w:multiLevelType w:val="singleLevel"/>
     <w:tmpl w:val="00000005"/>
@@ -3574,7 +5824,7 @@
       </w:rPr>
     </w:lvl>
   </w:abstractNum>
-  <w:abstractNum w:abstractNumId="4">
+  <w:abstractNum w:abstractNumId="5">
     <w:nsid w:val="00000006"/>
     <w:multiLevelType w:val="singleLevel"/>
     <w:tmpl w:val="00000006"/>
@@ -3595,7 +5845,7 @@
       </w:rPr>
     </w:lvl>
   </w:abstractNum>
-  <w:abstractNum w:abstractNumId="5">
+  <w:abstractNum w:abstractNumId="6">
     <w:nsid w:val="00000007"/>
     <w:multiLevelType w:val="singleLevel"/>
     <w:tmpl w:val="00000007"/>
@@ -3613,7 +5863,7 @@
       </w:pPr>
     </w:lvl>
   </w:abstractNum>
-  <w:abstractNum w:abstractNumId="6">
+  <w:abstractNum w:abstractNumId="7">
     <w:nsid w:val="00000008"/>
     <w:multiLevelType w:val="singleLevel"/>
     <w:tmpl w:val="00000008"/>
@@ -3634,26 +5884,144 @@
       </w:rPr>
     </w:lvl>
   </w:abstractNum>
+  <w:abstractNum w:abstractNumId="8">
+    <w:nsid w:val="2EE66F3B"/>
+    <w:multiLevelType w:val="singleLevel"/>
+    <w:tmpl w:val="2EE66F3B"/>
+    <w:lvl w:ilvl="0" w:tentative="0">
+      <w:start w:val="1"/>
+      <w:numFmt w:val="lowerRoman"/>
+      <w:lvlText w:val="%1."/>
+      <w:lvlJc w:val="left"/>
+      <w:pPr>
+        <w:tabs>
+          <w:tab w:val="left" w:pos="425"/>
+        </w:tabs>
+        <w:ind w:left="425" w:leftChars="0" w:hanging="425" w:firstLineChars="0"/>
+      </w:pPr>
+      <w:rPr>
+        <w:rFonts w:hint="default"/>
+      </w:rPr>
+    </w:lvl>
+  </w:abstractNum>
+  <w:abstractNum w:abstractNumId="9">
+    <w:nsid w:val="382A7D3B"/>
+    <w:multiLevelType w:val="singleLevel"/>
+    <w:tmpl w:val="382A7D3B"/>
+    <w:lvl w:ilvl="0" w:tentative="0">
+      <w:start w:val="1"/>
+      <w:numFmt w:val="lowerRoman"/>
+      <w:lvlText w:val="%1."/>
+      <w:lvlJc w:val="left"/>
+      <w:pPr>
+        <w:tabs>
+          <w:tab w:val="left" w:pos="425"/>
+        </w:tabs>
+        <w:ind w:left="425" w:leftChars="0" w:hanging="425" w:firstLineChars="0"/>
+      </w:pPr>
+      <w:rPr>
+        <w:rFonts w:hint="default"/>
+      </w:rPr>
+    </w:lvl>
+  </w:abstractNum>
+  <w:abstractNum w:abstractNumId="10">
+    <w:nsid w:val="3A8734FB"/>
+    <w:multiLevelType w:val="singleLevel"/>
+    <w:tmpl w:val="3A8734FB"/>
+    <w:lvl w:ilvl="0" w:tentative="0">
+      <w:start w:val="1"/>
+      <w:numFmt w:val="lowerRoman"/>
+      <w:lvlText w:val="%1."/>
+      <w:lvlJc w:val="left"/>
+      <w:pPr>
+        <w:tabs>
+          <w:tab w:val="left" w:pos="425"/>
+        </w:tabs>
+        <w:ind w:left="425" w:leftChars="0" w:hanging="425" w:firstLineChars="0"/>
+      </w:pPr>
+      <w:rPr>
+        <w:rFonts w:hint="default"/>
+      </w:rPr>
+    </w:lvl>
+  </w:abstractNum>
+  <w:abstractNum w:abstractNumId="11">
+    <w:nsid w:val="5586F04C"/>
+    <w:multiLevelType w:val="singleLevel"/>
+    <w:tmpl w:val="5586F04C"/>
+    <w:lvl w:ilvl="0" w:tentative="0">
+      <w:start w:val="1"/>
+      <w:numFmt w:val="decimal"/>
+      <w:lvlText w:val="%1."/>
+      <w:lvlJc w:val="left"/>
+      <w:pPr>
+        <w:tabs>
+          <w:tab w:val="left" w:pos="425"/>
+        </w:tabs>
+        <w:ind w:left="425" w:leftChars="0" w:hanging="425" w:firstLineChars="0"/>
+      </w:pPr>
+      <w:rPr>
+        <w:rFonts w:hint="default"/>
+      </w:rPr>
+    </w:lvl>
+  </w:abstractNum>
+  <w:abstractNum w:abstractNumId="12">
+    <w:nsid w:val="7DDA3348"/>
+    <w:multiLevelType w:val="singleLevel"/>
+    <w:tmpl w:val="7DDA3348"/>
+    <w:lvl w:ilvl="0" w:tentative="0">
+      <w:start w:val="1"/>
+      <w:numFmt w:val="lowerRoman"/>
+      <w:lvlText w:val="%1."/>
+      <w:lvlJc w:val="left"/>
+      <w:pPr>
+        <w:tabs>
+          <w:tab w:val="left" w:pos="425"/>
+        </w:tabs>
+        <w:ind w:left="425" w:leftChars="0" w:hanging="425" w:firstLineChars="0"/>
+      </w:pPr>
+      <w:rPr>
+        <w:rFonts w:hint="default"/>
+      </w:rPr>
+    </w:lvl>
+  </w:abstractNum>
   <w:num w:numId="1">
+    <w:abstractNumId w:val="7"/>
+  </w:num>
+  <w:num w:numId="2">
+    <w:abstractNumId w:val="5"/>
+  </w:num>
+  <w:num w:numId="3">
+    <w:abstractNumId w:val="4"/>
+  </w:num>
+  <w:num w:numId="4">
     <w:abstractNumId w:val="6"/>
   </w:num>
-  <w:num w:numId="2">
-    <w:abstractNumId w:val="4"/>
-  </w:num>
-  <w:num w:numId="3">
+  <w:num w:numId="5">
     <w:abstractNumId w:val="3"/>
   </w:num>
-  <w:num w:numId="4">
-    <w:abstractNumId w:val="5"/>
-  </w:num>
-  <w:num w:numId="5">
+  <w:num w:numId="6">
     <w:abstractNumId w:val="2"/>
-  </w:num>
-  <w:num w:numId="6">
-    <w:abstractNumId w:val="1"/>
   </w:num>
   <w:num w:numId="7">
     <w:abstractNumId w:val="0"/>
+  </w:num>
+  <w:num w:numId="8">
+    <w:abstractNumId w:val="1"/>
+  </w:num>
+  <w:num w:numId="9">
+    <w:abstractNumId w:val="11"/>
+  </w:num>
+  <w:num w:numId="10">
+    <w:abstractNumId w:val="12"/>
+  </w:num>
+  <w:num w:numId="11">
+    <w:abstractNumId w:val="9"/>
+  </w:num>
+  <w:num w:numId="12">
+    <w:abstractNumId w:val="8"/>
+  </w:num>
+  <w:num w:numId="13">
+    <w:abstractNumId w:val="10"/>
   </w:num>
 </w:numbering>
 </file>
@@ -3761,7 +6129,7 @@
     <w:lsdException w:unhideWhenUsed="0" w:uiPriority="0" w:semiHidden="0" w:name="Document Map"/>
     <w:lsdException w:unhideWhenUsed="0" w:uiPriority="0" w:semiHidden="0" w:name="Plain Text"/>
     <w:lsdException w:unhideWhenUsed="0" w:uiPriority="0" w:semiHidden="0" w:name="E-mail Signature"/>
-    <w:lsdException w:unhideWhenUsed="0" w:uiPriority="0" w:semiHidden="0" w:name="Normal (Web)"/>
+    <w:lsdException w:qFormat="1" w:unhideWhenUsed="0" w:uiPriority="0" w:semiHidden="0" w:name="Normal (Web)"/>
     <w:lsdException w:unhideWhenUsed="0" w:uiPriority="0" w:semiHidden="0" w:name="HTML Acronym"/>
     <w:lsdException w:unhideWhenUsed="0" w:uiPriority="0" w:semiHidden="0" w:name="HTML Address"/>
     <w:lsdException w:unhideWhenUsed="0" w:uiPriority="0" w:semiHidden="0" w:name="HTML Cite"/>
@@ -3850,7 +6218,7 @@
     <w:lsdException w:qFormat="1" w:unhideWhenUsed="0" w:uiPriority="70" w:semiHidden="0" w:name="Dark List Accent 1"/>
     <w:lsdException w:unhideWhenUsed="0" w:uiPriority="71" w:semiHidden="0" w:name="Colorful Shading Accent 1"/>
     <w:lsdException w:qFormat="1" w:unhideWhenUsed="0" w:uiPriority="72" w:semiHidden="0" w:name="Colorful List Accent 1"/>
-    <w:lsdException w:unhideWhenUsed="0" w:uiPriority="73" w:semiHidden="0" w:name="Colorful Grid Accent 1"/>
+    <w:lsdException w:qFormat="1" w:unhideWhenUsed="0" w:uiPriority="73" w:semiHidden="0" w:name="Colorful Grid Accent 1"/>
     <w:lsdException w:qFormat="1" w:unhideWhenUsed="0" w:uiPriority="60" w:semiHidden="0" w:name="Light Shading Accent 2"/>
     <w:lsdException w:qFormat="1" w:unhideWhenUsed="0" w:uiPriority="61" w:semiHidden="0" w:name="Light List Accent 2"/>
     <w:lsdException w:qFormat="1" w:unhideWhenUsed="0" w:uiPriority="62" w:semiHidden="0" w:name="Light Grid Accent 2"/>
@@ -3874,7 +6242,7 @@
     <w:lsdException w:qFormat="1" w:unhideWhenUsed="0" w:uiPriority="66" w:semiHidden="0" w:name="Medium List 2 Accent 3"/>
     <w:lsdException w:qFormat="1" w:unhideWhenUsed="0" w:uiPriority="67" w:semiHidden="0" w:name="Medium Grid 1 Accent 3"/>
     <w:lsdException w:unhideWhenUsed="0" w:uiPriority="68" w:semiHidden="0" w:name="Medium Grid 2 Accent 3"/>
-    <w:lsdException w:unhideWhenUsed="0" w:uiPriority="69" w:semiHidden="0" w:name="Medium Grid 3 Accent 3"/>
+    <w:lsdException w:qFormat="1" w:unhideWhenUsed="0" w:uiPriority="69" w:semiHidden="0" w:name="Medium Grid 3 Accent 3"/>
     <w:lsdException w:unhideWhenUsed="0" w:uiPriority="70" w:semiHidden="0" w:name="Dark List Accent 3"/>
     <w:lsdException w:qFormat="1" w:unhideWhenUsed="0" w:uiPriority="71" w:semiHidden="0" w:name="Colorful Shading Accent 3"/>
     <w:lsdException w:unhideWhenUsed="0" w:uiPriority="72" w:semiHidden="0" w:name="Colorful List Accent 3"/>
@@ -4397,6 +6765,7 @@
   <w:style w:type="paragraph" w:styleId="33">
     <w:name w:val="Normal (Web)"/>
     <w:basedOn w:val="1"/>
+    <w:qFormat/>
     <w:uiPriority w:val="0"/>
     <w:rPr>
       <w:sz w:val="24"/>
@@ -12623,6 +14992,7 @@
   <w:style w:type="table" w:styleId="104">
     <w:name w:val="Medium Grid 3 Accent 3"/>
     <w:basedOn w:val="12"/>
+    <w:qFormat/>
     <w:uiPriority w:val="69"/>
     <w:pPr>
       <w:spacing w:after="0" w:line="240" w:lineRule="auto"/>
@@ -15756,6 +18126,7 @@
   <w:style w:type="table" w:styleId="130">
     <w:name w:val="Colorful Grid Accent 1"/>
     <w:basedOn w:val="12"/>
+    <w:qFormat/>
     <w:uiPriority w:val="73"/>
     <w:pPr>
       <w:spacing w:after="0" w:line="240" w:lineRule="auto"/>
@@ -16575,6 +18946,16 @@
       <w:outlineLvl w:val="9"/>
     </w:pPr>
   </w:style>
+  <w:style w:type="paragraph" w:customStyle="1" w:styleId="165">
+    <w:name w:val="Body Style"/>
+    <w:qFormat/>
+    <w:uiPriority w:val="0"/>
+    <w:rPr>
+      <w:rFonts w:asciiTheme="minorHAnsi" w:hAnsiTheme="minorHAnsi" w:eastAsiaTheme="minorEastAsia" w:cstheme="minorBidi"/>
+      <w:sz w:val="22"/>
+      <w:szCs w:val="22"/>
+    </w:rPr>
+  </w:style>
 </w:styles>
 </file>
 
@@ -16860,4 +19241,21 @@
   </a:themeElements>
   <a:objectDefaults/>
 </a:theme>
+</file>
+
+<file path=customXml/item1.xml><?xml version="1.0" encoding="utf-8"?>
+<s:customData xmlns="http://www.wps.cn/officeDocument/2013/wpsCustomData" xmlns:s="http://www.wps.cn/officeDocument/2013/wpsCustomData">
+  <customSectProps/>
+  <customShpExts>
+    <customShpInfo spid="_x0000_s1026" textRotate="1"/>
+  </customShpExts>
+</s:customData>
+</file>
+
+<file path=customXml/itemProps1.xml><?xml version="1.0" encoding="utf-8"?>
+<ds:datastoreItem xmlns:ds="http://schemas.openxmlformats.org/officeDocument/2006/customXml" ds:itemID="{B1977F7D-205B-4081-913C-38D41E755F92}">
+  <ds:schemaRefs>
+    <ds:schemaRef ds:uri="http://www.wps.cn/officeDocument/2013/wpsCustomData"/>
+  </ds:schemaRefs>
+</ds:datastoreItem>
 </file>
</xml_diff>